<commit_message>
Fig. 4: update panels d-f label to saturation F/Fmax and revise body text
Co-Authored-By: Claude Sonnet 5.5 <noreply@anthropic.com>
Claude-Session: https://claude.ai/code/session_01Y1g9vByMLTE8eGJ9K81zt6
</commit_message>
<xml_diff>
--- a/Manuscript_AS.docx
+++ b/Manuscript_AS.docx
@@ -13023,7 +13023,7 @@
         </m:r>
       </m:oMath>
       <w:r>
-        <w:t xml:space="preserve">. Each parameter was varied across representative values while the remaining parameters were held constant. The resulting changes in mass loss, corrosion-product coverage</w:t>
+        <w:t xml:space="preserve">. Each parameter was varied across representative values while the remaining parameters were held constant. The resulting changes in mass loss, corrosion-product saturation (F/Fₘₐₓ)</w:t>
       </w:r>
       <w:proofErr w:type="spellStart"/>
       <w:r>
@@ -16009,7 +16009,7 @@
         <w:pStyle w:val="BodyText"/>
       </w:pPr>
       <w:r>
-        <w:t xml:space="preserve">The associated corrosion-product coverage responses in</w:t>
+        <w:t xml:space="preserve">The associated corrosion-product saturation responses in</w:t>
       </w:r>
       <w:r>
         <w:t xml:space="preserve"> </w:t>
@@ -16126,7 +16126,7 @@
         <w:t>2+</w:t>
       </w:r>
       <w:r>
-        <w:t xml:space="preserve"> into corrosion products through the corrosion-product growth term, resulting in faster corrosion-product accumulation and greater surface coverage</w:t>
+        <w:t xml:space="preserve"> into corrosion products through the corrosion-product growth term, resulting in faster corrosion-product accumulation and greater corrosion-product saturation</w:t>
       </w:r>
       <w:r>
         <w:t xml:space="preserve"> </w:t>
@@ -16241,7 +16241,7 @@
         <w:t xml:space="preserve"> </w:t>
       </w:r>
       <w:r>
-        <w:t xml:space="preserve">enhanced the corrosion-product dissolution term, reducing corrosion-product retention and leading to lower surface coverage </w:t>
+        <w:t xml:space="preserve">enhanced the corrosion-product dissolution term, reducing corrosion-product retention and leading to lower corrosion-product saturation </w:t>
       </w:r>
       <w:r>
         <w:rPr>
@@ -16360,7 +16360,7 @@
         <w:t xml:space="preserve">, </w:t>
       </w:r>
       <w:r>
-        <w:t xml:space="preserve">however, caused only modest changes in corrosion-product coverage (</w:t>
+        <w:t xml:space="preserve">however, caused only modest changes in corrosion-product saturation (</w:t>
       </w:r>
       <w:r>
         <w:rPr>
@@ -16523,7 +16523,7 @@
         </m:sSub>
       </m:oMath>
       <w:r>
-        <w:t xml:space="preserve">​ act directly on the competing processes of corrosion-product formation and dissolution, making corrosion-product coverage substantially more sensitive to these parameters than to </w:t>
+        <w:t xml:space="preserve">​ act directly on the competing processes of corrosion-product formation and dissolution, making corrosion-product saturation substantially more sensitive to these parameters than to </w:t>
       </w:r>
       <m:oMath>
         <m:sSub>
@@ -16659,7 +16659,7 @@
         <w:rPr>
           <w:rFonts w:cs="Times New Roman"/>
         </w:rPr>
-        <w:t xml:space="preserve">Conditions that promoted greater corrosion-product coverage, specifically high</w:t>
+        <w:t xml:space="preserve">Conditions that promoted greater corrosion-product saturation, specifically high</w:t>
       </w:r>
       <w:r>
         <w:rPr>
@@ -16854,7 +16854,7 @@
         <w:rPr>
           <w:rFonts w:cs="Times New Roman"/>
         </w:rPr>
-        <w:t xml:space="preserve">where accelerated cathodic oxygen consumption reduced interfacial oxygen concentrations despite only modest changes in corrosion-product coverage.</w:t>
+        <w:t xml:space="preserve">where accelerated cathodic oxygen consumption reduced interfacial oxygen concentrations despite only modest changes in corrosion-product saturation.</w:t>
       </w:r>
       <w:r>
         <w:rPr>
@@ -17113,15 +17113,15 @@
         <w:t>.</w:t>
       </w:r>
       <w:r>
-        <w:t xml:space="preserve"> Local parameter sweeps of kinetic parameters. Panels (a–c) show cumulative mass loss (%), panels (d–f) show corrosion-product coverage (%), and panels (g-</w:t>
+        <w:t xml:space="preserve"> Local parameter sweeps of kinetic parameters. Panels (a–c) show cumulative mass loss (%), panels (d–f) show the normalized corrosion-product saturation, F/Fₘₐₓ (%), and panels (g–i)</w:t>
       </w:r>
       <w:proofErr w:type="spellStart"/>
       <w:r>
-        <w:t>i</w:t>
+        <w:t xml:space="preserve"/>
       </w:r>
       <w:proofErr w:type="spellEnd"/>
       <w:r>
-        <w:t>) show interfacial dissolved oxygen concentration (</w:t>
+        <w:t xml:space="preserve"> show interfacial dissolved oxygen concentration (</w:t>
       </w:r>
       <w:r>
         <w:rPr>

</xml_diff>

<commit_message>
Methods: simplify secondary-phase sentence (details in limitations)
Co-Authored-By: Claude Sonnet 5.5 <noreply@anthropic.com>
Claude-Session: https://claude.ai/code/session_01Y1g9vByMLTE8eGJ9K81zt6
</commit_message>
<xml_diff>
--- a/Manuscript_AS.docx
+++ b/Manuscript_AS.docx
@@ -3026,69 +3026,13 @@
         </w:rPr>
         <w:t xml:space="preserve">, </w:t>
       </w:r>
-      <w:r>
-        <w:rPr>
-          <w:rFonts w:cs="Times New Roman"/>
-          <w:i/>
-        </w:rPr>
-        <w:t>in vivo</w:t>
-      </w:r>
-      <w:r>
-        <w:rPr>
-          <w:rFonts w:cs="Times New Roman"/>
-        </w:rPr>
-        <w:t xml:space="preserve"> observations indicate that early degradation is dominated by a thin </w:t>
-      </w:r>
       <w:proofErr w:type="spellStart"/>
-      <w:r>
-        <w:rPr>
-          <w:rFonts w:cs="Times New Roman"/>
-        </w:rPr>
-        <w:t>ZnO</w:t>
-      </w:r>
       <w:proofErr w:type="spellEnd"/>
       <w:r>
         <w:rPr>
           <w:rFonts w:cs="Times New Roman"/>
         </w:rPr>
-        <w:t xml:space="preserve"> layer, with more complex phases appearing only after approximately 4.5 months </w:t>
-      </w:r>
-      <w:r>
-        <w:rPr>
-          <w:rFonts w:cs="Times New Roman"/>
-        </w:rPr>
-        <w:fldChar w:fldCharType="begin"/>
-      </w:r>
-      <w:r>
-        <w:rPr>
-          <w:rFonts w:cs="Times New Roman"/>
-        </w:rPr>
-        <w:instrText xml:space="preserve"> ADDIN ZOTERO_ITEM CSL_CITATION {"citationID":"LmMK5e9z","properties":{"unsorted":false,"formattedCitation":"\\super [29]\\nosupersub{}","plainCitation":"[29]","noteIndex":0},"citationItems":[{"id":3871,"uris":["http://zotero.org/users/16939557/items/VR5DEBC2"],"itemData":{"id":3871,"type":"article-journal","citation-key":"bowenZincExhibitsIdeal2013","container-title":"Advanced Materials","DOI":"10.1002/adma.201300226","ISSN":"0935-9648, 1521-4095","issue":"18","journalAbbreviation":"Advanced Materials","language":"en","license":"http://onlinelibrary.wiley.com/termsAndConditions#vor","page":"2577-2582","source":"DOI.org (Crossref)","title":"Zinc Exhibits Ideal Physiological Corrosion Behavior for Bioabsorbable Stents","volume":"25","author":[{"family":"Bowen","given":"Patrick K."},{"family":"Drelich","given":"Jaroslaw"},{"family":"Goldman","given":"Jeremy"}],"issued":{"date-parts":[["2013",5,14]]}}}],"schema":"https://github.com/citation-style-language/schema/raw/master/csl-citation.json"} </w:instrText>
-      </w:r>
-      <w:r>
-        <w:rPr>
-          <w:rFonts w:cs="Times New Roman"/>
-        </w:rPr>
-        <w:fldChar w:fldCharType="separate"/>
-      </w:r>
-      <w:r>
-        <w:rPr>
-          <w:rFonts w:cs="Times New Roman"/>
-          <w:vertAlign w:val="superscript"/>
-        </w:rPr>
-        <w:t>[29]</w:t>
-      </w:r>
-      <w:r>
-        <w:rPr>
-          <w:rFonts w:cs="Times New Roman"/>
-        </w:rPr>
-        <w:fldChar w:fldCharType="end"/>
-      </w:r>
-      <w:r>
-        <w:rPr>
-          <w:rFonts w:cs="Times New Roman"/>
-        </w:rPr>
-        <w:t xml:space="preserve">. Therefore, for the one-month simulation period considered here, the corrosion products are modeled as a single ZnO phase</w:t>
+        <w:t xml:space="preserve">the corrosion products are modeled as a single ZnO phase</w:t>
       </w:r>
       <w:proofErr w:type="spellStart"/>
       <w:r>

</xml_diff>

<commit_message>
Results: replace Pearson r with errors at 336 h for Zn2+ and pH
Co-Authored-By: Claude Sonnet 5.5 <noreply@anthropic.com>
Claude-Session: https://claude.ai/code/session_01Y1g9vByMLTE8eGJ9K81zt6
</commit_message>
<xml_diff>
--- a/Manuscript_AS.docx
+++ b/Manuscript_AS.docx
@@ -18977,19 +18977,19 @@
         <w:rPr>
           <w:rFonts w:cs="Times New Roman"/>
         </w:rPr>
-        <w:t xml:space="preserve">In addition to mass-loss validation, the model was evaluated against </w:t>
-      </w:r>
-      <w:r>
-        <w:rPr>
-          <w:rFonts w:cs="Times New Roman"/>
-        </w:rPr>
-        <w:t xml:space="preserve">Literature </w:t>
-      </w:r>
-      <w:r>
-        <w:rPr>
-          <w:rFonts w:cs="Times New Roman"/>
-        </w:rPr>
-        <w:t xml:space="preserve">measurements of </w:t>
+        <w:t xml:space="preserve">In addition to mass-loss validation, the model was evaluated against literature measurements</w:t>
+      </w:r>
+      <w:r>
+        <w:rPr>
+          <w:rFonts w:cs="Times New Roman"/>
+        </w:rPr>
+        <w:t xml:space="preserve"/>
+      </w:r>
+      <w:r>
+        <w:rPr>
+          <w:rFonts w:cs="Times New Roman"/>
+        </w:rPr>
+        <w:t xml:space="preserve"> of </w:t>
       </w:r>
       <m:oMath>
         <m:r>
@@ -19175,19 +19175,19 @@
         <w:rPr>
           <w:rFonts w:cs="Times New Roman"/>
         </w:rPr>
-        <w:t>, the model reproduced the overall evolution of both quantities, capturing the rapid initial increase followed by a gradual plateau</w:t>
-      </w:r>
-      <w:r>
-        <w:rPr>
-          <w:rFonts w:cs="Times New Roman"/>
-        </w:rPr>
-        <w:t xml:space="preserve"> </w:t>
-      </w:r>
-      <w:r>
-        <w:rPr>
-          <w:rFonts w:cs="Times New Roman"/>
-        </w:rPr>
-        <w:t>(Pearson r = 0.96 for Zn²⁺ and 0.95 for pH)</w:t>
+        <w:t xml:space="preserve">, the model reproduced the overall evolution of both quantities, capturing the rapid initial increase followed by a gradual plateau, with errors at 336 h of 44% for Zn²⁺ and 2.8% for pH</w:t>
+      </w:r>
+      <w:r>
+        <w:rPr>
+          <w:rFonts w:cs="Times New Roman"/>
+        </w:rPr>
+        <w:t xml:space="preserve"/>
+      </w:r>
+      <w:r>
+        <w:rPr>
+          <w:rFonts w:cs="Times New Roman"/>
+        </w:rPr>
+        <w:t xml:space="preserve"/>
       </w:r>
       <w:r>
         <w:rPr>

</xml_diff>

<commit_message>
Abstract/Conclusions: stent prediction described as same order of magnitude as in vivo observations
Co-Authored-By: Claude Sonnet 5.5 <noreply@anthropic.com>
Claude-Session: https://claude.ai/code/session_01Y1g9vByMLTE8eGJ9K81zt6
</commit_message>
<xml_diff>
--- a/Manuscript_AS.docx
+++ b/Manuscript_AS.docx
@@ -300,7 +300,7 @@
         <w:jc w:val="both"/>
       </w:pPr>
       <w:r>
-        <w:t xml:space="preserve">Zinc (Zn) is a promising biodegradable metal for temporary implants, yet predictive computational frameworks for its degradation under physiological conditions remain limited. In this study, a three-dimensional (3D) mechanistic reaction-diffusion model is developed by coupling oxygen reduction reaction (ORR) kinetics, mass transport, corrosion-product evolution, and moving-interface tracking. Initial sensitivity analysis demonstrates that dissolved oxygen availability primarily controls Zn biodegradation. Calibrated using three effective kinetic parameters against literature immersion mass-loss data over 14 days, the model predicts the 28-day mass-loss evolution measured in this study, yielding a root-mean-square error (RMSE) of 0.0159%. The simulations reveal a self-limiting mechanism in which corrosion-product accumulation progressively restricts oxygen transport to the metal surface, driving a transition from reaction-controlled to diffusion-controlled degradation. When applied without geometry-specific recalibration to a six-crown Zn stent, the model predicts approximately 6% mass loss after one month, consistent in magnitude with reported </w:t>
+        <w:t xml:space="preserve">Zinc (Zn) is a promising biodegradable metal for temporary implants, yet predictive computational frameworks for its degradation under physiological conditions remain limited. In this study, a three-dimensional (3D) mechanistic reaction-diffusion model is developed by coupling oxygen reduction reaction (ORR) kinetics, mass transport, corrosion-product evolution, and moving-interface tracking. Initial sensitivity analysis demonstrates that dissolved oxygen availability primarily controls Zn biodegradation. Calibrated using three effective kinetic parameters against literature immersion mass-loss data over 14 days, the model predicts the 28-day mass-loss evolution measured in this study, yielding a root-mean-square error (RMSE) of 0.0159%. The simulations reveal a self-limiting mechanism in which corrosion-product accumulation progressively restricts oxygen transport to the metal surface, driving a transition from reaction-controlled to diffusion-controlled degradation. When applied without geometry-specific recalibration to a six-crown Zn stent, the model predicts approximately 6% mass loss after one month, of the same order of magnitude as reported </w:t>
       </w:r>
       <w:r>
         <w:rPr>
@@ -20854,7 +20854,7 @@
       </w:pPr>
       <w:bookmarkStart w:id="24" w:name="_Hlk238630414"/>
       <w:r>
-        <w:t xml:space="preserve">Zn biodegradation under physiological conditions becomes an oxygen-transport-controlled process after an initial reaction-controlled stage in which implant geometry governs the spatial evolution of material loss. The proposed 3D reaction-diffusion model closely reproduced independent 28-day immersion data (RMSE = 0.0159%) and, without further calibration, predicted approximately 6% mass loss for a six-crown stent, consistent with reported </w:t>
+        <w:t xml:space="preserve">Zn biodegradation under physiological conditions becomes an oxygen-transport-controlled process after an initial reaction-controlled stage in which implant geometry governs the spatial evolution of material loss. The proposed 3D reaction-diffusion model closely reproduced independent 28-day immersion data (RMSE = 0.0159%) and, without further calibration, predicted approximately 6% mass loss for a six-crown stent, of the same order of magnitude as reported </w:t>
       </w:r>
       <w:r>
         <w:rPr>

</xml_diff>

<commit_message>
Reconcile 'computationally tractable' vs 'demanding' with costs from Table S4; add C2.1 response
Co-Authored-By: Claude Sonnet 5.5 <noreply@anthropic.com>
Claude-Session: https://claude.ai/code/session_01Y1g9vByMLTE8eGJ9K81zt6
</commit_message>
<xml_diff>
--- a/Manuscript_AS.docx
+++ b/Manuscript_AS.docx
@@ -14289,7 +14289,7 @@
         <w:t>4</w:t>
       </w:r>
       <w:r>
-        <w:t>2% against the calibration dataset. These results show that the proposed three-parameter framework can closely reproduce the calibration measurements. The combination of low calibration error and rapid convergence supports the framework’s potential as a computationally tractable basis for predictive Zn biodegradation modeling, subject to independent validation.</w:t>
+        <w:t>2% against the calibration dataset. These results show that the proposed three-parameter framework can closely reproduce the calibration measurements. The combination of low calibration error and rapid convergence supports the framework’s potential as a basis for predictive Zn biodegradation modeling, subject to independent validation. Calibration remained computationally tractable because only three parameters were calibrated on a coarse mesh, at about 2 h per 3D simulation (Table S4 in the Supplementary Information).</w:t>
       </w:r>
     </w:p>
     <w:p>
@@ -20751,7 +20751,7 @@
         <w:pStyle w:val="BodyText"/>
       </w:pPr>
       <w:r>
-        <w:t>Future developments should incorporate physiologically realistic flow conditions, additional ionic species, multiphase corrosion-product evolution, and spatially heterogeneous electrochemical activity. Extending the framework to Zn alloys will also require accounting for alloying elements, secondary phases, and galvanic interactions. Although the current physics-based simulations remain computationally demanding, the reduced calibrated parameter space</w:t>
+        <w:t>Future developments should incorporate physiologically realistic flow conditions, additional ionic species, multiphase corrosion-product evolution, and spatially heterogeneous electrochemical activity. Extending the framework to Zn alloys will also require accounting for alloying elements, secondary phases, and galvanic interactions. Although the high-fidelity simulations remain computationally demanding (about 69 h on 50–64 cores for a 672 h simulation on a 19–21 million-element mesh; Table S4), the reduced calibrated parameter space</w:t>
       </w:r>
       <w:r>
         <w:t xml:space="preserve"> </w:t>

</xml_diff>

<commit_message>
Fix 'a R2' -> 'an R2' and 'shown in (Figure 4g-i)'; add C2.3 response
Co-Authored-By: Claude Sonnet 5.5 <noreply@anthropic.com>
Claude-Session: https://claude.ai/code/session_01Y1g9vByMLTE8eGJ9K81zt6
</commit_message>
<xml_diff>
--- a/Manuscript_AS.docx
+++ b/Manuscript_AS.docx
@@ -16520,7 +16520,7 @@
         <w:t>These coupled mechanisms are further reflected in the evolution of interfacial oxygen availability shown in</w:t>
       </w:r>
       <w:r>
-        <w:t xml:space="preserve"> (</w:t>
+        <w:t xml:space="preserve"> </w:t>
       </w:r>
       <w:r>
         <w:rPr>
@@ -16597,7 +16597,7 @@
         <w:rPr>
           <w:rFonts w:cs="Times New Roman"/>
         </w:rPr>
-        <w:t xml:space="preserve">). </w:t>
+        <w:t xml:space="preserve">. </w:t>
       </w:r>
       <w:r>
         <w:rPr>
@@ -18286,7 +18286,7 @@
         <w:rPr>
           <w:rFonts w:cs="Times New Roman"/>
         </w:rPr>
-        <w:t xml:space="preserve">), with an RMSE of 0.0159% and a </w:t>
+        <w:t xml:space="preserve">), with an RMSE of 0.0159% and an </w:t>
       </w:r>
       <m:oMath>
         <m:sSup>

</xml_diff>

<commit_message>
Abstract: remove 'three effective kinetic parameters' and 'low-dimensional'; add B2.1 response
Co-Authored-By: Claude Sonnet 5.5 <noreply@anthropic.com>
Claude-Session: https://claude.ai/code/session_01Y1g9vByMLTE8eGJ9K81zt6
</commit_message>
<xml_diff>
--- a/Manuscript_AS.docx
+++ b/Manuscript_AS.docx
@@ -300,7 +300,7 @@
         <w:jc w:val="both"/>
       </w:pPr>
       <w:r>
-        <w:t xml:space="preserve">Zinc (Zn) is a promising biodegradable metal for temporary implants, yet predictive computational frameworks for its degradation under physiological conditions remain limited. In this study, a three-dimensional (3D) mechanistic reaction-diffusion model is developed by coupling oxygen reduction reaction (ORR) kinetics, mass transport, corrosion-product evolution, and moving-interface tracking. Initial sensitivity analysis demonstrates that dissolved oxygen availability primarily controls Zn biodegradation. Calibrated using three effective kinetic parameters against literature immersion mass-loss data over 14 days, the model predicts the 28-day mass-loss evolution measured in this study, yielding a root-mean-square error (RMSE) of 0.0159%. The simulations reveal a self-limiting mechanism in which corrosion-product accumulation progressively restricts oxygen transport to the metal surface, driving a transition from reaction-controlled to diffusion-controlled degradation. When applied without geometry-specific recalibration to a six-crown Zn stent, the model predicts approximately 6% mass loss after one month, of the same order of magnitude as reported </w:t>
+        <w:t xml:space="preserve">Zinc (Zn) is a promising biodegradable metal for temporary implants, yet predictive computational frameworks for its degradation under physiological conditions remain limited. In this study, a three-dimensional (3D) mechanistic reaction-diffusion model is developed by coupling oxygen reduction reaction (ORR) kinetics, mass transport, corrosion-product evolution, and moving-interface tracking. Initial sensitivity analysis demonstrates that dissolved oxygen availability primarily controls Zn biodegradation. Calibrated against literature immersion mass-loss data over 14 days, the model predicts the 28-day mass-loss evolution measured in this study, yielding a root-mean-square error (RMSE) of 0.0159%. The simulations reveal a self-limiting mechanism in which corrosion-product accumulation progressively restricts oxygen transport to the metal surface, driving a transition from reaction-controlled to diffusion-controlled degradation. When applied without geometry-specific recalibration to a six-crown Zn stent, the model predicts approximately 6% mass loss after one month, of the same order of magnitude as reported </w:t>
       </w:r>
       <w:r>
         <w:rPr>
@@ -309,7 +309,7 @@
         <w:t>in vivo</w:t>
       </w:r>
       <w:r>
-        <w:t xml:space="preserve"> observations, and captures crown-localized degradation driven by geometry-dependent oxygen transport. By linking implant geometry to degradation rate and spatial morphology, the framework provides a low-dimensional, mechanistic basis for predicting Zn implant degradation and supports degradation-informed implant design.</w:t>
+        <w:t xml:space="preserve"> observations, and captures crown-localized degradation driven by geometry-dependent oxygen transport. By linking implant geometry to degradation rate and spatial morphology, the framework provides a mechanistic basis for predicting Zn implant degradation and supports degradation-informed implant design.</w:t>
       </w:r>
     </w:p>
     <w:p>

</xml_diff>

<commit_message>
Manuscript_AS: adopt user's accepted version (with their further manual edits)
Co-Authored-By: Claude Sonnet 5.5 <noreply@anthropic.com>
Claude-Session: https://claude.ai/code/session_01Y1g9vByMLTE8eGJ9K81zt6
</commit_message>
<xml_diff>
--- a/Manuscript_AS.docx
+++ b/Manuscript_AS.docx
@@ -1,6 +1,6 @@
 
 <file path=word/document.xml><?xml version="1.0" encoding="utf-8"?>
-<w:document xmlns:wpc="http://schemas.microsoft.com/office/word/2010/wordprocessingCanvas" xmlns:cx="http://schemas.microsoft.com/office/drawing/2014/chartex" xmlns:cx1="http://schemas.microsoft.com/office/drawing/2015/9/8/chartex" xmlns:cx2="http://schemas.microsoft.com/office/drawing/2015/10/21/chartex" xmlns:cx3="http://schemas.microsoft.com/office/drawing/2016/5/9/chartex" xmlns:cx4="http://schemas.microsoft.com/office/drawing/2016/5/10/chartex" xmlns:cx5="http://schemas.microsoft.com/office/drawing/2016/5/11/chartex" xmlns:cx6="http://schemas.microsoft.com/office/drawing/2016/5/12/chartex" xmlns:cx7="http://schemas.microsoft.com/office/drawing/2016/5/13/chartex" xmlns:cx8="http://schemas.microsoft.com/office/drawing/2016/5/14/chartex" xmlns:mc="http://schemas.openxmlformats.org/markup-compatibility/2006" xmlns:aink="http://schemas.microsoft.com/office/drawing/2016/ink" xmlns:am3d="http://schemas.microsoft.com/office/drawing/2017/model3d" xmlns:o="urn:schemas-microsoft-com:office:office" xmlns:r="http://schemas.openxmlformats.org/officeDocument/2006/relationships" xmlns:m="http://schemas.openxmlformats.org/officeDocument/2006/math" xmlns:v="urn:schemas-microsoft-com:vml" xmlns:wp14="http://schemas.microsoft.com/office/word/2010/wordprocessingDrawing" xmlns:wp="http://schemas.openxmlformats.org/drawingml/2006/wordprocessingDrawing" xmlns:w10="urn:schemas-microsoft-com:office:word" xmlns:w="http://schemas.openxmlformats.org/wordprocessingml/2006/main" xmlns:w14="http://schemas.microsoft.com/office/word/2010/wordml" xmlns:w15="http://schemas.microsoft.com/office/word/2012/wordml" xmlns:w16cex="http://schemas.microsoft.com/office/word/2018/wordml/cex" xmlns:w16cid="http://schemas.microsoft.com/office/word/2016/wordml/cid" xmlns:w16="http://schemas.microsoft.com/office/word/2018/wordml" xmlns:w16sdtdh="http://schemas.microsoft.com/office/word/2020/wordml/sdtdatahash" xmlns:w16se="http://schemas.microsoft.com/office/word/2015/wordml/symex" xmlns:wpg="http://schemas.microsoft.com/office/word/2010/wordprocessingGroup" xmlns:wpi="http://schemas.microsoft.com/office/word/2010/wordprocessingInk" xmlns:wne="http://schemas.microsoft.com/office/word/2006/wordml" xmlns:wps="http://schemas.microsoft.com/office/word/2010/wordprocessingShape" mc:Ignorable="w14 w15 w16se w16cid w16 w16cex w16sdtdh wp14">
+<w:document xmlns:wpc="http://schemas.microsoft.com/office/word/2010/wordprocessingCanvas" xmlns:cx="http://schemas.microsoft.com/office/drawing/2014/chartex" xmlns:cx1="http://schemas.microsoft.com/office/drawing/2015/9/8/chartex" xmlns:cx2="http://schemas.microsoft.com/office/drawing/2015/10/21/chartex" xmlns:cx3="http://schemas.microsoft.com/office/drawing/2016/5/9/chartex" xmlns:cx4="http://schemas.microsoft.com/office/drawing/2016/5/10/chartex" xmlns:cx5="http://schemas.microsoft.com/office/drawing/2016/5/11/chartex" xmlns:cx6="http://schemas.microsoft.com/office/drawing/2016/5/12/chartex" xmlns:cx7="http://schemas.microsoft.com/office/drawing/2016/5/13/chartex" xmlns:cx8="http://schemas.microsoft.com/office/drawing/2016/5/14/chartex" xmlns:mc="http://schemas.openxmlformats.org/markup-compatibility/2006" xmlns:aink="http://schemas.microsoft.com/office/drawing/2016/ink" xmlns:am3d="http://schemas.microsoft.com/office/drawing/2017/model3d" xmlns:o="urn:schemas-microsoft-com:office:office" xmlns:oel="http://schemas.microsoft.com/office/2019/extlst" xmlns:r="http://schemas.openxmlformats.org/officeDocument/2006/relationships" xmlns:m="http://schemas.openxmlformats.org/officeDocument/2006/math" xmlns:v="urn:schemas-microsoft-com:vml" xmlns:wp14="http://schemas.microsoft.com/office/word/2010/wordprocessingDrawing" xmlns:wp="http://schemas.openxmlformats.org/drawingml/2006/wordprocessingDrawing" xmlns:w10="urn:schemas-microsoft-com:office:word" xmlns:w="http://schemas.openxmlformats.org/wordprocessingml/2006/main" xmlns:w14="http://schemas.microsoft.com/office/word/2010/wordml" xmlns:w15="http://schemas.microsoft.com/office/word/2012/wordml" xmlns:w16cex="http://schemas.microsoft.com/office/word/2018/wordml/cex" xmlns:w16cid="http://schemas.microsoft.com/office/word/2016/wordml/cid" xmlns:w16="http://schemas.microsoft.com/office/word/2018/wordml" xmlns:w16du="http://schemas.microsoft.com/office/word/2023/wordml/word16du" xmlns:w16sdtdh="http://schemas.microsoft.com/office/word/2020/wordml/sdtdatahash" xmlns:w16sdtfl="http://schemas.microsoft.com/office/word/2024/wordml/sdtformatlock" xmlns:w16se="http://schemas.microsoft.com/office/word/2015/wordml/symex" xmlns:wpg="http://schemas.microsoft.com/office/word/2010/wordprocessingGroup" xmlns:wpi="http://schemas.microsoft.com/office/word/2010/wordprocessingInk" xmlns:wne="http://schemas.microsoft.com/office/word/2006/wordml" xmlns:wps="http://schemas.microsoft.com/office/word/2010/wordprocessingShape" mc:Ignorable="w14 w15 w16se w16cid w16 w16cex w16sdtdh w16sdtfl w16du wp14">
   <w:body>
     <w:p>
       <w:pPr>
@@ -300,7 +300,13 @@
         <w:jc w:val="both"/>
       </w:pPr>
       <w:r>
-        <w:t xml:space="preserve">Zinc (Zn) is a promising biodegradable metal for temporary implants, yet predictive computational frameworks for its degradation under physiological conditions remain limited. In this study, a three-dimensional (3D) mechanistic reaction-diffusion model is developed by coupling oxygen reduction reaction (ORR) kinetics, mass transport, corrosion-product evolution, and moving-interface tracking. Initial sensitivity analysis demonstrates that dissolved oxygen availability primarily controls Zn biodegradation. Calibrated against literature immersion mass-loss data over 14 days, the model predicts the 28-day mass-loss evolution measured in this study, yielding a root-mean-square error (RMSE) of 0.0159%. The simulations reveal a self-limiting mechanism in which corrosion-product accumulation progressively restricts oxygen transport to the metal surface, driving a transition from reaction-controlled to diffusion-controlled degradation. When applied without geometry-specific recalibration to a six-crown Zn stent, the model predicts approximately 6% mass loss after one month, of the same order of magnitude as reported </w:t>
+        <w:t xml:space="preserve">Zinc (Zn) is a promising biodegradable metal for temporary implants, yet predictive computational frameworks for its degradation under physiological conditions remain limited. In this study, a three-dimensional (3D) mechanistic reaction-diffusion model is developed by coupling oxygen reduction reaction (ORR) kinetics, mass transport, corrosion-product evolution, and moving-interface tracking. Initial sensitivity analysis demonstrates that dissolved oxygen availability primarily controls Zn biodegradation. Calibrated against literature immersion mass-loss data over 14 days, the model predicts the 28-day mass-loss evolution measured in this study, yielding a root-mean-square error (RMSE) of 0.0159%. The simulations reveal a self-limiting mechanism in which corrosion-product accumulation progressively restricts oxygen transport to the metal surface, driving a transition from reaction-controlled to diffusion-controlled degradation. When applied without geometry-specific recalibration to a six-crown Zn stent, the model predicts approximately 6% mass loss after one month, </w:t>
+      </w:r>
+      <w:r>
+        <w:t xml:space="preserve">of the same order of magnitude as </w:t>
+      </w:r>
+      <w:r>
+        <w:t xml:space="preserve">reported </w:t>
       </w:r>
       <w:r>
         <w:rPr>
@@ -1233,7 +1239,13 @@
         <w:t>Computational–experimental workflow for developing, calibrating, validating, and applying the mechanistic Zn biodegradation model</w:t>
       </w:r>
       <w:r>
-        <w:t xml:space="preserve">. (a) Reaction–diffusion model coupling species transport and corrosion-product evolution with moving-interface tracking; (b) calibration of the three effective kinetic parameters (</w:t>
+        <w:t>. (a) Reaction–diffusion model coupling species transport and corrosion-</w:t>
+      </w:r>
+      <w:r>
+        <w:t>product</w:t>
+      </w:r>
+      <w:r>
+        <w:t xml:space="preserve"> evolution with moving-interface tracking; (b) calibration of the three effective kinetic parameters (</w:t>
       </w:r>
       <w:proofErr w:type="spellStart"/>
       <w:r>
@@ -1333,21 +1345,7 @@
         <w:rPr>
           <w:rFonts w:cs="Times New Roman"/>
         </w:rPr>
-        <w:t xml:space="preserve"> diamond suspension to produce a reproducible and well-defined surface condition. The po</w:t>
-      </w:r>
-      <w:proofErr w:type="spellStart"/>
-      <w:r>
-        <w:rPr>
-          <w:rFonts w:cs="Times New Roman"/>
-        </w:rPr>
-        <w:t>lished</w:t>
-      </w:r>
-      <w:proofErr w:type="spellEnd"/>
-      <w:r>
-        <w:rPr>
-          <w:rFonts w:cs="Times New Roman"/>
-        </w:rPr>
-        <w:t xml:space="preserve"> specimens were </w:t>
+        <w:t xml:space="preserve"> diamond suspension to produce a reproducible and well-defined surface condition. The polished specimens were </w:t>
       </w:r>
       <w:r>
         <w:rPr>
@@ -2953,7 +2951,19 @@
         <w:rPr>
           <w:rFonts w:cs="Times New Roman"/>
         </w:rPr>
-        <w:t xml:space="preserve">therefore results from a dynamic balance between ORR-driven passivation and chloride-mediated corrosion-product dissolution. </w:t>
+        <w:t xml:space="preserve">therefore results from a dynamic balance between ORR-driven passivation and chloride-mediated </w:t>
+      </w:r>
+      <w:r>
+        <w:rPr>
+          <w:rFonts w:cs="Times New Roman"/>
+        </w:rPr>
+        <w:t xml:space="preserve">corrosion-product </w:t>
+      </w:r>
+      <w:r>
+        <w:rPr>
+          <w:rFonts w:cs="Times New Roman"/>
+        </w:rPr>
+        <w:t xml:space="preserve">dissolution. </w:t>
       </w:r>
       <w:r>
         <w:rPr>
@@ -3024,29 +3034,25 @@
         <w:rPr>
           <w:rFonts w:cs="Times New Roman"/>
         </w:rPr>
-        <w:t xml:space="preserve">, </w:t>
-      </w:r>
-      <w:proofErr w:type="spellStart"/>
-      <w:proofErr w:type="spellEnd"/>
-      <w:r>
-        <w:rPr>
-          <w:rFonts w:cs="Times New Roman"/>
-        </w:rPr>
-        <w:t xml:space="preserve">the corrosion products are modeled as a single ZnO phase</w:t>
-      </w:r>
-      <w:proofErr w:type="spellStart"/>
-      <w:r>
-        <w:rPr>
-          <w:rFonts w:cs="Times New Roman"/>
-        </w:rPr>
-        <w:t xml:space="preserve"/>
-      </w:r>
-      <w:proofErr w:type="spellEnd"/>
-      <w:r>
-        <w:rPr>
-          <w:rFonts w:cs="Times New Roman"/>
-        </w:rPr>
-        <w:t xml:space="preserve">.</w:t>
+        <w:t xml:space="preserve"> </w:t>
+      </w:r>
+      <w:r>
+        <w:rPr>
+          <w:rFonts w:cs="Times New Roman"/>
+        </w:rPr>
+        <w:t xml:space="preserve">the corrosion </w:t>
+      </w:r>
+      <w:r>
+        <w:rPr>
+          <w:rFonts w:cs="Times New Roman"/>
+        </w:rPr>
+        <w:t xml:space="preserve">products are </w:t>
+      </w:r>
+      <w:r>
+        <w:rPr>
+          <w:rFonts w:cs="Times New Roman"/>
+        </w:rPr>
+        <w:t>modeled as a single ZnO phase.</w:t>
       </w:r>
     </w:p>
     <w:p>
@@ -3187,13 +3193,25 @@
         <w:t xml:space="preserve"> </w:t>
       </w:r>
       <w:r>
-        <w:t xml:space="preserve">Schematic of the coupled mechanistic framework for Zn biodegradation in physiological media. (a) Electrochemical reactions governing Zn dissolution, oxygen reduction, corrosion-product formation, and chloride-induced dissolution, (</w:t>
+        <w:t xml:space="preserve">Schematic of the coupled mechanistic framework for Zn biodegradation in physiological media. (a) Electrochemical reactions governing Zn dissolution, oxygen reduction, </w:t>
+      </w:r>
+      <w:r>
+        <w:t>corrosion-product</w:t>
+      </w:r>
+      <w:r>
+        <w:t xml:space="preserve"> formation, and chloride-induced </w:t>
+      </w:r>
+      <w:r>
+        <w:t>dissolution</w:t>
+      </w:r>
+      <w:r>
+        <w:t>, (</w:t>
       </w:r>
       <w:r>
         <w:t>b</w:t>
       </w:r>
       <w:r>
-        <w:t xml:space="preserve">) porous corrosion-product structure showing the influence of porosity and tortuosity on effective species diffusion</w:t>
+        <w:t>) porous corrosion-product structure showing the influence of porosity and tortuosity on effective species diffusion</w:t>
       </w:r>
       <w:r>
         <w:t>, (c) level-set tracking of the moving metal-electrolyte interface and associated species transport.</w:t>
@@ -3283,51 +3301,51 @@
         <w:rPr>
           <w:rFonts w:cs="Times New Roman"/>
         </w:rPr>
-        <w:t xml:space="preserve">This simplification is justified by the assumption of local </w:t>
+        <w:t xml:space="preserve">This simplification is justified by the assumption of local electroneutrality in physiological saline, where ionic transport is primarily diffusion-driven </w:t>
+      </w:r>
+      <w:r>
+        <w:rPr>
+          <w:rFonts w:cs="Times New Roman"/>
+        </w:rPr>
+        <w:fldChar w:fldCharType="begin"/>
+      </w:r>
+      <w:r>
+        <w:rPr>
+          <w:rFonts w:cs="Times New Roman"/>
+        </w:rPr>
+        <w:instrText xml:space="preserve"> ADDIN ZOTERO_ITEM CSL_CITATION {"citationID":"2YDw3E7n","properties":{"unsorted":false,"formattedCitation":"\\super [30]\\nosupersub{}","plainCitation":"[30]","noteIndex":0},"citationItems":[{"id":4562,"uris":["http://zotero.org/users/16939557/items/8FBQWKCF"],"itemData":{"id":4562,"type":"article-journal","citation-key":"katonaValidatingCorrosionModels2026","container-title":"Corrosion Science","DOI":"10.1016/j.corsci.2025.113495","ISSN":"0010938X","journalAbbreviation":"Corrosion Science","language":"en","page":"113495","source":"DOI.org (Crossref)","title":"Validating corrosion models: A comparison of governing equations","title-short":"Validating corrosion models","volume":"259","author":[{"family":"Katona","given":"R.M."},{"family":"Taylor","given":"J."},{"family":"Schaller","given":"R.F."}],"issued":{"date-parts":[["2026",2]]}}}],"schema":"https://github.com/citation-style-language/schema/raw/master/csl-citation.json"} </w:instrText>
+      </w:r>
+      <w:r>
+        <w:rPr>
+          <w:rFonts w:cs="Times New Roman"/>
+        </w:rPr>
+        <w:fldChar w:fldCharType="separate"/>
+      </w:r>
+      <w:r>
+        <w:rPr>
+          <w:rFonts w:cs="Times New Roman"/>
+          <w:vertAlign w:val="superscript"/>
+        </w:rPr>
+        <w:t>[30]</w:t>
+      </w:r>
+      <w:r>
+        <w:rPr>
+          <w:rFonts w:cs="Times New Roman"/>
+        </w:rPr>
+        <w:fldChar w:fldCharType="end"/>
+      </w:r>
+      <w:r>
+        <w:rPr>
+          <w:rFonts w:cs="Times New Roman"/>
+        </w:rPr>
+        <w:t xml:space="preserve">, </w:t>
       </w:r>
       <w:r>
         <w:rPr>
           <w:rFonts w:cs="Times New Roman"/>
         </w:rPr>
         <w:lastRenderedPageBreak/>
-        <w:t xml:space="preserve">electroneutrality in physiological saline, where ionic transport is primarily diffusion-driven </w:t>
-      </w:r>
-      <w:r>
-        <w:rPr>
-          <w:rFonts w:cs="Times New Roman"/>
-        </w:rPr>
-        <w:fldChar w:fldCharType="begin"/>
-      </w:r>
-      <w:r>
-        <w:rPr>
-          <w:rFonts w:cs="Times New Roman"/>
-        </w:rPr>
-        <w:instrText xml:space="preserve"> ADDIN ZOTERO_ITEM CSL_CITATION {"citationID":"2YDw3E7n","properties":{"unsorted":false,"formattedCitation":"\\super [30]\\nosupersub{}","plainCitation":"[30]","noteIndex":0},"citationItems":[{"id":4562,"uris":["http://zotero.org/users/16939557/items/8FBQWKCF"],"itemData":{"id":4562,"type":"article-journal","citation-key":"katonaValidatingCorrosionModels2026","container-title":"Corrosion Science","DOI":"10.1016/j.corsci.2025.113495","ISSN":"0010938X","journalAbbreviation":"Corrosion Science","language":"en","page":"113495","source":"DOI.org (Crossref)","title":"Validating corrosion models: A comparison of governing equations","title-short":"Validating corrosion models","volume":"259","author":[{"family":"Katona","given":"R.M."},{"family":"Taylor","given":"J."},{"family":"Schaller","given":"R.F."}],"issued":{"date-parts":[["2026",2]]}}}],"schema":"https://github.com/citation-style-language/schema/raw/master/csl-citation.json"} </w:instrText>
-      </w:r>
-      <w:r>
-        <w:rPr>
-          <w:rFonts w:cs="Times New Roman"/>
-        </w:rPr>
-        <w:fldChar w:fldCharType="separate"/>
-      </w:r>
-      <w:r>
-        <w:rPr>
-          <w:rFonts w:cs="Times New Roman"/>
-          <w:vertAlign w:val="superscript"/>
-        </w:rPr>
-        <w:t>[30]</w:t>
-      </w:r>
-      <w:r>
-        <w:rPr>
-          <w:rFonts w:cs="Times New Roman"/>
-        </w:rPr>
-        <w:fldChar w:fldCharType="end"/>
-      </w:r>
-      <w:r>
-        <w:rPr>
-          <w:rFonts w:cs="Times New Roman"/>
-        </w:rPr>
-        <w:t>, together with the static immersion conditions considered in this study (</w:t>
+        <w:t>together with the static immersion conditions considered in this study (</w:t>
       </w:r>
       <m:oMath>
         <m:r>
@@ -3881,7 +3899,19 @@
         <w:rPr>
           <w:rFonts w:cs="Times New Roman"/>
         </w:rPr>
-        <w:t xml:space="preserve">the corrosion-product field</w:t>
+        <w:t>the corrosion-</w:t>
+      </w:r>
+      <w:r>
+        <w:rPr>
+          <w:rFonts w:cs="Times New Roman"/>
+        </w:rPr>
+        <w:t>product</w:t>
+      </w:r>
+      <w:r>
+        <w:rPr>
+          <w:rFonts w:cs="Times New Roman"/>
+        </w:rPr>
+        <w:t xml:space="preserve"> field</w:t>
       </w:r>
       <w:r>
         <w:rPr>
@@ -4380,7 +4410,19 @@
         <w:rPr>
           <w:rFonts w:cs="Times New Roman"/>
         </w:rPr>
-        <w:t xml:space="preserve">Chloride acts as a catalytic species, being regenerated during corrosion-product dissolution rather than consumed </w:t>
+        <w:t xml:space="preserve">Chloride acts as a catalytic species, being regenerated during </w:t>
+      </w:r>
+      <w:r>
+        <w:rPr>
+          <w:rFonts w:cs="Times New Roman"/>
+        </w:rPr>
+        <w:t>corrosion-product dissolution rathe</w:t>
+      </w:r>
+      <w:r>
+        <w:rPr>
+          <w:rFonts w:cs="Times New Roman"/>
+        </w:rPr>
+        <w:t xml:space="preserve">r than consumed </w:t>
       </w:r>
       <w:r>
         <w:rPr>
@@ -4809,27 +4851,51 @@
         <w:rPr>
           <w:rFonts w:cs="Times New Roman"/>
         </w:rPr>
-        <w:t xml:space="preserve">generating OH⁻ ions that increase the local alkalinity and promote formation of ZnO-based corrosion products.</w:t>
+        <w:t xml:space="preserve">generating OH⁻ ions that increase the local alkalinity and promote formation of </w:t>
       </w:r>
       <w:proofErr w:type="spellStart"/>
       <w:r>
         <w:rPr>
           <w:rFonts w:cs="Times New Roman"/>
         </w:rPr>
-        <w:t xml:space="preserve"/>
+        <w:t>ZnO</w:t>
       </w:r>
       <w:proofErr w:type="spellEnd"/>
       <w:r>
         <w:rPr>
           <w:rFonts w:cs="Times New Roman"/>
         </w:rPr>
-        <w:t xml:space="preserve"/>
-      </w:r>
-      <w:r>
-        <w:rPr>
-          <w:rFonts w:cs="Times New Roman"/>
-        </w:rPr>
-        <w:t xml:space="preserve"> At the same time, chloride-induced corrosion-product dissolution releases hydroxide back into the electrolyte</w:t>
+        <w:t>-based corrosion</w:t>
+      </w:r>
+      <w:r>
+        <w:rPr>
+          <w:rFonts w:cs="Times New Roman"/>
+        </w:rPr>
+        <w:t xml:space="preserve"> products.</w:t>
+      </w:r>
+      <w:r>
+        <w:rPr>
+          <w:rFonts w:cs="Times New Roman"/>
+        </w:rPr>
+        <w:t xml:space="preserve"> </w:t>
+      </w:r>
+      <w:r>
+        <w:rPr>
+          <w:rFonts w:cs="Times New Roman"/>
+        </w:rPr>
+        <w:t xml:space="preserve">At the same time, chloride-induced </w:t>
+      </w:r>
+      <w:r>
+        <w:rPr>
+          <w:rFonts w:cs="Times New Roman"/>
+        </w:rPr>
+        <w:t>corrosion-product</w:t>
+      </w:r>
+      <w:r>
+        <w:rPr>
+          <w:rFonts w:cs="Times New Roman"/>
+        </w:rPr>
+        <w:t xml:space="preserve"> dissolution releases hydroxide back into the electrolyte</w:t>
       </w:r>
       <w:r>
         <w:rPr>
@@ -5665,16 +5731,10 @@
       </w:pPr>
       <w:r>
         <w:lastRenderedPageBreak/>
-        <w:t xml:space="preserve">Here, the corrosion-product field</w:t>
-      </w:r>
-      <w:r>
-        <w:t xml:space="preserve"/>
-      </w:r>
-      <w:r>
-        <w:t xml:space="preserve"/>
-      </w:r>
-      <w:r>
-        <w:t xml:space="preserve"/>
+        <w:t xml:space="preserve">Here, the corrosion-product </w:t>
+      </w:r>
+      <w:r>
+        <w:t>field</w:t>
       </w:r>
       <w:r>
         <w:t xml:space="preserve"> (</w:t>
@@ -6041,7 +6101,7 @@
         </w:rPr>
       </w:pPr>
       <w:r>
-        <w:t xml:space="preserve">The corrosion-product field is a homogenized, volumetric concentration field: it is not confined to the metal surface, and it reduces the local diffusivity as described below. The kinetic parameters </w:t>
+        <w:t xml:space="preserve">The kinetic parameters </w:t>
       </w:r>
       <m:oMath>
         <m:sSub>
@@ -6203,7 +6263,19 @@
         <w:rPr>
           <w:rFonts w:cs="Times New Roman"/>
         </w:rPr>
-        <w:t xml:space="preserve">, which suppresses further growth as the corrosion-product concentration approaches its maximum density </w:t>
+        <w:t xml:space="preserve">, which suppresses further growth as the </w:t>
+      </w:r>
+      <w:r>
+        <w:rPr>
+          <w:rFonts w:cs="Times New Roman"/>
+        </w:rPr>
+        <w:t>corrosion-product concentration</w:t>
+      </w:r>
+      <w:r>
+        <w:rPr>
+          <w:rFonts w:cs="Times New Roman"/>
+        </w:rPr>
+        <w:t xml:space="preserve"> approaches its maximum density </w:t>
       </w:r>
       <m:oMath>
         <m:sSub>
@@ -6392,7 +6464,25 @@
         <w:t xml:space="preserve">. </w:t>
       </w:r>
       <w:r>
-        <w:t xml:space="preserve">As the corrosion products accumulate, they impede species transport by reducing the effective diffusivity according to </w:t>
+        <w:t xml:space="preserve">As the </w:t>
+      </w:r>
+      <w:r>
+        <w:t>corrosion</w:t>
+      </w:r>
+      <w:r>
+        <w:t xml:space="preserve"> </w:t>
+      </w:r>
+      <w:r>
+        <w:t>products accumulate</w:t>
+      </w:r>
+      <w:r>
+        <w:t xml:space="preserve">, </w:t>
+      </w:r>
+      <w:r>
+        <w:t xml:space="preserve">they impede </w:t>
+      </w:r>
+      <w:r>
+        <w:t xml:space="preserve">species transport by reducing the effective diffusivity according to </w:t>
       </w:r>
       <w:r>
         <w:fldChar w:fldCharType="begin"/>
@@ -6756,7 +6846,13 @@
         </m:sSubSup>
       </m:oMath>
       <w:r>
-        <w:t xml:space="preserve">​ is the free-solution diffusivity, and the transport reduction depends on the corrosion-product region's porosity (</w:t>
+        <w:t xml:space="preserve">​ is the free-solution diffusivity, and the transport reduction depends on the </w:t>
+      </w:r>
+      <w:r>
+        <w:t xml:space="preserve">corrosion-product region's </w:t>
+      </w:r>
+      <w:r>
+        <w:t>porosity (</w:t>
       </w:r>
       <m:oMath>
         <m:r>
@@ -8710,7 +8806,27 @@
         <w:t xml:space="preserve">++ and solved using first-order finite elements with implicit time integration. </w:t>
       </w:r>
       <w:r>
-        <w:t xml:space="preserve">Parametrically generated implant geometries were discretized into tetrahedral meshes and embedded within a 30 × 30 × 30 mm electrolyte domain, identical for the disc and the stent and larger than three times the implant characteristic dimension in each direction, to minimize boundary effects. </w:t>
+        <w:t xml:space="preserve">Parametrically generated implant geometries were discretized into tetrahedral meshes and embedded within </w:t>
+      </w:r>
+      <w:r>
+        <w:t xml:space="preserve">a 30 × 30 × 30 mm </w:t>
+      </w:r>
+      <w:r>
+        <w:t>electrolyte domain</w:t>
+      </w:r>
+      <w:r>
+        <w:t>, identical for the disc and the stent and larger than</w:t>
+      </w:r>
+      <w:r>
+        <w:t xml:space="preserve"> three times the implant characteristic dimension in each direction</w:t>
+      </w:r>
+      <w:ins w:id="11" w:author="Claude" w:date="2026-10-08T04:28:00Z">
+        <w:r>
+          <w:t>,</w:t>
+        </w:r>
+      </w:ins>
+      <w:r>
+        <w:t xml:space="preserve"> to minimize boundary effects. </w:t>
       </w:r>
       <w:r>
         <w:t xml:space="preserve">The level-set signed-distance function </w:t>
@@ -8740,7 +8856,23 @@
         <w:pStyle w:val="BodyText"/>
       </w:pPr>
       <w:r>
-        <w:t xml:space="preserve">Physiological initial and boundary conditions were imposed throughout the electrolyte domain, including continuous oxygen replenishment at the electrolyte-air interface and kinetic flux conditions at the moving metal-electrolyte boundary. The 48 h medium renewal used in the immersion tests was not modeled explicitly; instead, dissolved oxygen was assumed to be continuously replenished at the electrolyte–air interface, no natural convection was considered (static conditions), and Zn²⁺ accumulation was not reset. Simulations were executed in parallel using </w:t>
+        <w:t>Physiological initial and boundary conditions were imposed throughout the electrolyte domain, including continuous oxygen replenishment at the electrolyte-air interface and kinetic flux conditions at the moving metal-electrolyte boundary</w:t>
+      </w:r>
+      <w:r>
+        <w:t xml:space="preserve">. The 48 h medium renewal used in the immersion tests was not modeled explicitly; instead, dissolved oxygen was assumed to be </w:t>
+      </w:r>
+      <w:r>
+        <w:lastRenderedPageBreak/>
+        <w:t>continuously replenished at the electrolyte–air interface</w:t>
+      </w:r>
+      <w:r>
+        <w:t xml:space="preserve"> and </w:t>
+      </w:r>
+      <w:r>
+        <w:t>no natural convection was considered (static conditions)</w:t>
+      </w:r>
+      <w:r>
+        <w:t xml:space="preserve">. Simulations were executed in parallel using </w:t>
       </w:r>
       <w:proofErr w:type="spellStart"/>
       <w:r>
@@ -8748,11 +8880,7 @@
       </w:r>
       <w:proofErr w:type="spellEnd"/>
       <w:r>
-        <w:t xml:space="preserve">++ MPI on a high-performance computing cluster, and degradation metrics </w:t>
-      </w:r>
-      <w:r>
-        <w:lastRenderedPageBreak/>
-        <w:t>together with concentration and interface fields were recorded at regular time intervals.</w:t>
+        <w:t>++ MPI on a high-performance computing cluster, and degradation metrics together with concentration and interface fields were recorded at regular time intervals.</w:t>
       </w:r>
       <w:r>
         <w:t xml:space="preserve"> Predicted mass loss, corrosion rate (</w:t>
@@ -8781,7 +8909,13 @@
         <w:t xml:space="preserve">, </w:t>
       </w:r>
       <w:r>
-        <w:t xml:space="preserve">normalized corrosion-product saturation</w:t>
+        <w:t xml:space="preserve">normalized </w:t>
+      </w:r>
+      <w:r>
+        <w:t>corrosion-product</w:t>
+      </w:r>
+      <w:r>
+        <w:t xml:space="preserve"> saturation</w:t>
       </w:r>
       <w:r>
         <w:t>, and dissolved oxygen concentration</w:t>
@@ -8805,13 +8939,7 @@
         <w:t>Equation S3</w:t>
       </w:r>
       <w:r>
-        <w:t xml:space="preserve">), while spatial distributions of oxygen concentration and corrosion-product fields</w:t>
-      </w:r>
-      <w:r>
-        <w:t xml:space="preserve"/>
-      </w:r>
-      <w:r>
-        <w:t xml:space="preserve"> were used to interpret degradation mechanisms.</w:t>
+        <w:t>), while spatial distributions of oxygen concentration and corrosion-product fields were used to interpret degradation mechanisms.</w:t>
       </w:r>
       <w:r>
         <w:t xml:space="preserve"> </w:t>
@@ -8905,7 +9033,7 @@
           <w:rFonts w:cs="Times New Roman"/>
         </w:rPr>
       </w:pPr>
-      <w:bookmarkStart w:id="11" w:name="_Ref238635735"/>
+      <w:bookmarkStart w:id="12" w:name="_Ref238635735"/>
       <w:r>
         <w:rPr>
           <w:b/>
@@ -8949,7 +9077,7 @@
         </w:rPr>
         <w:fldChar w:fldCharType="end"/>
       </w:r>
-      <w:bookmarkEnd w:id="11"/>
+      <w:bookmarkEnd w:id="12"/>
       <w:r>
         <w:rPr>
           <w:b/>
@@ -12967,13 +13095,11 @@
         </m:r>
       </m:oMath>
       <w:r>
-        <w:t xml:space="preserve">. Each parameter was varied across representative values while the remaining parameters were held constant. The resulting changes in mass loss, corrosion-product saturation (F/Fₘₐₓ)</w:t>
-      </w:r>
-      <w:proofErr w:type="spellStart"/>
-      <w:r>
-        <w:t xml:space="preserve"/>
-      </w:r>
-      <w:proofErr w:type="spellEnd"/>
+        <w:t>. Each parameter was varied across representative values while the remaining parameters were held constant. The resulting changes in mass loss, corrosion-</w:t>
+      </w:r>
+      <w:r>
+        <w:t>product saturation (F/Fₘₐₓ)</w:t>
+      </w:r>
       <w:r>
         <w:t xml:space="preserve">, and interfacial oxygen concentration were analyzed to </w:t>
       </w:r>
@@ -12981,7 +13107,13 @@
         <w:t>investigate</w:t>
       </w:r>
       <w:r>
-        <w:t xml:space="preserve"> the roles of passivation, corrosion-product dissolution, and oxygen-reduction kinetics in governing Zn degradation behavior.</w:t>
+        <w:t xml:space="preserve"> the roles of passivation, </w:t>
+      </w:r>
+      <w:r>
+        <w:t xml:space="preserve">corrosion-product </w:t>
+      </w:r>
+      <w:r>
+        <w:t>dissolution, and oxygen-reduction kinetics in governing Zn degradation behavior.</w:t>
       </w:r>
     </w:p>
     <w:p>
@@ -13254,11 +13386,11 @@
         <w:t>.</w:t>
       </w:r>
       <w:r>
-        <w:t xml:space="preserve"> To quantify geometry-dependent degradation, spatial distributions of oxygen concentration, corrosion-</w:t>
+        <w:t xml:space="preserve"> To quantify </w:t>
       </w:r>
       <w:r>
         <w:lastRenderedPageBreak/>
-        <w:t>product accumulation, and interface recession were analyzed throughout the simulation. Cross-sectional profiles extracted from representative straight-strut and crown regions were used to evaluate local penetration depth and degradation heterogeneity.</w:t>
+        <w:t>geometry-dependent degradation, spatial distributions of oxygen concentration, corrosion-product accumulation, and interface recession were analyzed throughout the simulation. Cross-sectional profiles extracted from representative straight-strut and crown regions were used to evaluate local penetration depth and degradation heterogeneity.</w:t>
       </w:r>
     </w:p>
     <w:p>
@@ -13291,7 +13423,7 @@
           <w:rFonts w:cs="Times New Roman"/>
         </w:rPr>
       </w:pPr>
-      <w:bookmarkStart w:id="12" w:name="fig:gsa"/>
+      <w:bookmarkStart w:id="13" w:name="fig:gsa"/>
       <w:r>
         <w:rPr>
           <w:rFonts w:cs="Times New Roman"/>
@@ -13478,7 +13610,19 @@
         <w:rPr>
           <w:rFonts w:cs="Times New Roman"/>
         </w:rPr>
-        <w:t xml:space="preserve">effective corrosion-product dissolution coefficient</w:t>
+        <w:t xml:space="preserve">effective </w:t>
+      </w:r>
+      <w:r>
+        <w:rPr>
+          <w:rFonts w:cs="Times New Roman"/>
+        </w:rPr>
+        <w:t xml:space="preserve">corrosion-product </w:t>
+      </w:r>
+      <w:r>
+        <w:rPr>
+          <w:rFonts w:cs="Times New Roman"/>
+        </w:rPr>
+        <w:t>dissolution coefficient</w:t>
       </w:r>
       <w:r>
         <w:rPr>
@@ -13593,7 +13737,19 @@
         <w:rPr>
           <w:rFonts w:cs="Times New Roman"/>
         </w:rPr>
-        <w:t xml:space="preserve">effective corrosion-product formation coefficient</w:t>
+        <w:t xml:space="preserve">effective </w:t>
+      </w:r>
+      <w:r>
+        <w:rPr>
+          <w:rFonts w:cs="Times New Roman"/>
+        </w:rPr>
+        <w:t xml:space="preserve">corrosion-product </w:t>
+      </w:r>
+      <w:r>
+        <w:rPr>
+          <w:rFonts w:cs="Times New Roman"/>
+        </w:rPr>
+        <w:t>formation coefficient</w:t>
       </w:r>
       <w:r>
         <w:rPr>
@@ -13754,21 +13910,7 @@
         <w:rPr>
           <w:rFonts w:cs="Times New Roman"/>
         </w:rPr>
-        <w:t xml:space="preserve"> exhibited negligible sensi</w:t>
-      </w:r>
-      <w:proofErr w:type="spellStart"/>
-      <w:r>
-        <w:rPr>
-          <w:rFonts w:cs="Times New Roman"/>
-        </w:rPr>
-        <w:t>tivity</w:t>
-      </w:r>
-      <w:proofErr w:type="spellEnd"/>
-      <w:r>
-        <w:rPr>
-          <w:rFonts w:cs="Times New Roman"/>
-        </w:rPr>
-        <w:t xml:space="preserve"> and were therefore fixed at literature values (</w:t>
+        <w:t xml:space="preserve"> exhibited negligible sensitivity and were therefore fixed at literature values (</w:t>
       </w:r>
       <w:r>
         <w:rPr>
@@ -14289,7 +14431,10 @@
         <w:t>4</w:t>
       </w:r>
       <w:r>
-        <w:t>2% against the calibration dataset. These results show that the proposed three-parameter framework can closely reproduce the calibration measurements. The combination of low calibration error and rapid convergence supports the framework’s potential as a basis for predictive Zn biodegradation modeling, subject to independent validation. Calibration remained computationally tractable because only three parameters were calibrated on a coarse mesh, at about 2 h per 3D simulation (Table S4 in the Supplementary Information).</w:t>
+        <w:t>2% against the calibration dataset. These results show that the proposed three-parameter framework can closely reproduce the calibration measurements. The combination of low calibration error and rapid convergence supports the framework’s potential as a basis for predictive Zn biodegradation modeling, subject to independent validation.</w:t>
+      </w:r>
+      <w:r>
+        <w:t xml:space="preserve"> Calibration remained computationally tractable because only three parameters were calibrated on a coarse mesh, at about 2 h per 3D simulation (Table S4 in the Supplementary Information).</w:t>
       </w:r>
     </w:p>
     <w:p>
@@ -14356,7 +14501,7 @@
       <w:pPr>
         <w:pStyle w:val="Captions"/>
       </w:pPr>
-      <w:bookmarkStart w:id="13" w:name="_Ref239754266"/>
+      <w:bookmarkStart w:id="14" w:name="_Ref239754266"/>
       <w:r>
         <w:rPr>
           <w:b/>
@@ -14414,7 +14559,7 @@
         </w:rPr>
         <w:fldChar w:fldCharType="end"/>
       </w:r>
-      <w:bookmarkEnd w:id="13"/>
+      <w:bookmarkEnd w:id="14"/>
       <w:r>
         <w:rPr>
           <w:b/>
@@ -14451,8 +14596,8 @@
           <w:i/>
         </w:rPr>
       </w:pPr>
-      <w:bookmarkStart w:id="14" w:name="_Ref238636197"/>
-      <w:bookmarkStart w:id="15" w:name="tab:optim_params"/>
+      <w:bookmarkStart w:id="15" w:name="_Ref238636197"/>
+      <w:bookmarkStart w:id="16" w:name="tab:optim_params"/>
       <w:r>
         <w:rPr>
           <w:b/>
@@ -14496,7 +14641,7 @@
         </w:rPr>
         <w:fldChar w:fldCharType="end"/>
       </w:r>
-      <w:bookmarkEnd w:id="14"/>
+      <w:bookmarkEnd w:id="15"/>
       <w:r>
         <w:rPr>
           <w:b/>
@@ -15322,7 +15467,7 @@
           </w:p>
         </w:tc>
       </w:tr>
-      <w:bookmarkEnd w:id="15"/>
+      <w:bookmarkEnd w:id="16"/>
     </w:tbl>
     <w:p>
       <w:pPr>
@@ -15953,7 +16098,13 @@
         <w:pStyle w:val="BodyText"/>
       </w:pPr>
       <w:r>
-        <w:t xml:space="preserve">The associated corrosion-product saturation responses in</w:t>
+        <w:t xml:space="preserve">The associated </w:t>
+      </w:r>
+      <w:r>
+        <w:t xml:space="preserve">corrosion-product saturation </w:t>
+      </w:r>
+      <w:r>
+        <w:t>responses in</w:t>
       </w:r>
       <w:r>
         <w:t xml:space="preserve"> </w:t>
@@ -16070,7 +16221,22 @@
         <w:t>2+</w:t>
       </w:r>
       <w:r>
-        <w:t xml:space="preserve"> into corrosion products through the corrosion-product growth term, resulting in faster corrosion-product accumulation and greater corrosion-product saturation</w:t>
+        <w:t xml:space="preserve"> into corrosion products through the </w:t>
+      </w:r>
+      <w:r>
+        <w:t xml:space="preserve">corrosion-product </w:t>
+      </w:r>
+      <w:r>
+        <w:t xml:space="preserve">growth term, resulting in faster </w:t>
+      </w:r>
+      <w:r>
+        <w:t xml:space="preserve">corrosion-product </w:t>
+      </w:r>
+      <w:r>
+        <w:t xml:space="preserve">accumulation and greater </w:t>
+      </w:r>
+      <w:r>
+        <w:t>corrosion-product saturation</w:t>
       </w:r>
       <w:r>
         <w:t xml:space="preserve"> </w:t>
@@ -16185,13 +16351,32 @@
         <w:t xml:space="preserve"> </w:t>
       </w:r>
       <w:r>
-        <w:t xml:space="preserve">enhanced the corrosion-product dissolution term, reducing corrosion-product retention and leading to lower corrosion-product saturation </w:t>
-      </w:r>
-      <w:r>
-        <w:rPr>
-          <w:b/>
-          <w:bCs/>
-        </w:rPr>
+        <w:t xml:space="preserve">enhanced the </w:t>
+      </w:r>
+      <w:r>
+        <w:t xml:space="preserve">corrosion-product </w:t>
+      </w:r>
+      <w:r>
+        <w:t xml:space="preserve">dissolution term, reducing </w:t>
+      </w:r>
+      <w:r>
+        <w:t xml:space="preserve">corrosion-product </w:t>
+      </w:r>
+      <w:r>
+        <w:t xml:space="preserve">retention and leading to lower </w:t>
+      </w:r>
+      <w:r>
+        <w:t>corrosion-product saturation</w:t>
+      </w:r>
+      <w:r>
+        <w:t xml:space="preserve"> </w:t>
+      </w:r>
+      <w:r>
+        <w:rPr>
+          <w:b/>
+          <w:bCs/>
+        </w:rPr>
+        <w:lastRenderedPageBreak/>
         <w:t>(</w:t>
       </w:r>
       <w:r>
@@ -16304,7 +16489,13 @@
         <w:t xml:space="preserve">, </w:t>
       </w:r>
       <w:r>
-        <w:t xml:space="preserve">however, caused only modest changes in corrosion-product saturation (</w:t>
+        <w:t xml:space="preserve">however, caused only modest changes in </w:t>
+      </w:r>
+      <w:r>
+        <w:t>corrosion-product saturation</w:t>
+      </w:r>
+      <w:r>
+        <w:t xml:space="preserve"> (</w:t>
       </w:r>
       <w:r>
         <w:rPr>
@@ -16373,8 +16564,13 @@
         <w:t xml:space="preserve"> </w:t>
       </w:r>
       <w:r>
-        <w:lastRenderedPageBreak/>
-        <w:t xml:space="preserve">because oxygen reduction influences corrosion-product growth only indirectly through its effect on the</w:t>
+        <w:t xml:space="preserve">because oxygen reduction influences </w:t>
+      </w:r>
+      <w:r>
+        <w:t xml:space="preserve">corrosion-product </w:t>
+      </w:r>
+      <w:r>
+        <w:t>growth only indirectly through its effect on the</w:t>
       </w:r>
       <w:r>
         <w:t xml:space="preserve"> Zn</w:t>
@@ -16467,7 +16663,19 @@
         </m:sSub>
       </m:oMath>
       <w:r>
-        <w:t xml:space="preserve">​ act directly on the competing processes of corrosion-product formation and dissolution, making corrosion-product saturation substantially more sensitive to these parameters than to </w:t>
+        <w:t xml:space="preserve">​ act directly on the competing processes of </w:t>
+      </w:r>
+      <w:r>
+        <w:t xml:space="preserve">corrosion-product </w:t>
+      </w:r>
+      <w:r>
+        <w:t xml:space="preserve">formation and dissolution, making </w:t>
+      </w:r>
+      <w:r>
+        <w:t>corrosion-product saturation</w:t>
+      </w:r>
+      <w:r>
+        <w:t xml:space="preserve"> substantially more sensitive to these parameters than to </w:t>
       </w:r>
       <m:oMath>
         <m:sSub>
@@ -16603,7 +16811,31 @@
         <w:rPr>
           <w:rFonts w:cs="Times New Roman"/>
         </w:rPr>
-        <w:t xml:space="preserve">Conditions that promoted greater corrosion-product saturation, specifically high</w:t>
+        <w:t xml:space="preserve">Conditions that promoted greater </w:t>
+      </w:r>
+      <w:r>
+        <w:rPr>
+          <w:rFonts w:cs="Times New Roman"/>
+        </w:rPr>
+        <w:t>corrosion-product</w:t>
+      </w:r>
+      <w:r>
+        <w:rPr>
+          <w:rFonts w:cs="Times New Roman"/>
+        </w:rPr>
+        <w:t xml:space="preserve"> </w:t>
+      </w:r>
+      <w:r>
+        <w:rPr>
+          <w:rFonts w:cs="Times New Roman"/>
+        </w:rPr>
+        <w:t>saturation</w:t>
+      </w:r>
+      <w:r>
+        <w:rPr>
+          <w:rFonts w:cs="Times New Roman"/>
+        </w:rPr>
+        <w:t>, specifically high</w:t>
       </w:r>
       <w:r>
         <w:rPr>
@@ -16681,7 +16913,19 @@
         <w:rPr>
           <w:rFonts w:cs="Times New Roman"/>
         </w:rPr>
-        <w:t xml:space="preserve">produced lower interfacial oxygen concentrations because the accumulated corrosion products increased resistance to oxygen transport. Nevertheless, the strongest oxygen depletion occurred at high</w:t>
+        <w:t>produced lower interfacial oxygen concentrations because the accumulated corrosion</w:t>
+      </w:r>
+      <w:r>
+        <w:rPr>
+          <w:rFonts w:cs="Times New Roman"/>
+        </w:rPr>
+        <w:t xml:space="preserve"> products </w:t>
+      </w:r>
+      <w:r>
+        <w:rPr>
+          <w:rFonts w:cs="Times New Roman"/>
+        </w:rPr>
+        <w:t>increased resistance to oxygen transport. Nevertheless, the strongest oxygen depletion occurred at high</w:t>
       </w:r>
       <w:r>
         <w:rPr>
@@ -16798,7 +17042,19 @@
         <w:rPr>
           <w:rFonts w:cs="Times New Roman"/>
         </w:rPr>
-        <w:t xml:space="preserve">where accelerated cathodic oxygen consumption reduced interfacial oxygen concentrations despite only modest changes in corrosion-product saturation.</w:t>
+        <w:t xml:space="preserve">where accelerated cathodic oxygen consumption reduced interfacial oxygen concentrations despite only modest changes in </w:t>
+      </w:r>
+      <w:r>
+        <w:rPr>
+          <w:rFonts w:cs="Times New Roman"/>
+        </w:rPr>
+        <w:t>corrosion-product saturation</w:t>
+      </w:r>
+      <w:r>
+        <w:rPr>
+          <w:rFonts w:cs="Times New Roman"/>
+        </w:rPr>
+        <w:t>.</w:t>
       </w:r>
       <w:r>
         <w:rPr>
@@ -16941,10 +17197,10 @@
         </w:rPr>
         <w:lastRenderedPageBreak/>
         <w:drawing>
-          <wp:inline distT="0" distB="0" distL="0" distR="0" wp14:anchorId="699F662B" wp14:editId="0F1366E4">
+          <wp:inline distT="0" distB="0" distL="0" distR="0" wp14:anchorId="36EF7F28" wp14:editId="13A4B40B">
             <wp:extent cx="5760720" cy="4561205"/>
             <wp:effectExtent l="0" t="0" r="0" b="0"/>
-            <wp:docPr id="15" name="Picture 15"/>
+            <wp:docPr id="1639482467" name="Picture 1"/>
             <wp:cNvGraphicFramePr>
               <a:graphicFrameLocks xmlns:a="http://schemas.openxmlformats.org/drawingml/2006/main" noChangeAspect="1"/>
             </wp:cNvGraphicFramePr>
@@ -16952,7 +17208,7 @@
               <a:graphicData uri="http://schemas.openxmlformats.org/drawingml/2006/picture">
                 <pic:pic xmlns:pic="http://schemas.openxmlformats.org/drawingml/2006/picture">
                   <pic:nvPicPr>
-                    <pic:cNvPr id="15" name="Picture 15"/>
+                    <pic:cNvPr id="1639482467" name="Picture 1639482467"/>
                     <pic:cNvPicPr/>
                   </pic:nvPicPr>
                   <pic:blipFill>
@@ -16990,7 +17246,7 @@
           <w:rFonts w:cs="Times New Roman"/>
         </w:rPr>
       </w:pPr>
-      <w:bookmarkStart w:id="16" w:name="_Ref239754180"/>
+      <w:bookmarkStart w:id="17" w:name="_Ref239754180"/>
       <w:r>
         <w:rPr>
           <w:b/>
@@ -17048,7 +17304,7 @@
         </w:rPr>
         <w:fldChar w:fldCharType="end"/>
       </w:r>
-      <w:bookmarkEnd w:id="16"/>
+      <w:bookmarkEnd w:id="17"/>
       <w:r>
         <w:rPr>
           <w:b/>
@@ -17057,15 +17313,26 @@
         <w:t>.</w:t>
       </w:r>
       <w:r>
-        <w:t xml:space="preserve"> Local parameter sweeps of kinetic parameters. Panels (a–c) show cumulative mass loss (%), panels (d–f) show the normalized corrosion-product saturation, F/Fₘₐₓ (%), and panels (g–i)</w:t>
-      </w:r>
-      <w:proofErr w:type="spellStart"/>
-      <w:r>
-        <w:t xml:space="preserve"/>
-      </w:r>
-      <w:proofErr w:type="spellEnd"/>
-      <w:r>
-        <w:t xml:space="preserve"> show interfacial dissolved oxygen concentration (</w:t>
+        <w:t xml:space="preserve"> Local parameter sweeps of kinetic parameters. Panels (a–c) show cumulative mass loss (%), panels (d–f) show </w:t>
+      </w:r>
+      <w:r>
+        <w:t xml:space="preserve">the normalized corrosion-product saturation, F/Fₘₐₓ </w:t>
+      </w:r>
+      <w:r>
+        <w:t>(%), and panels (g</w:t>
+      </w:r>
+      <w:del w:id="18" w:author="Claude" w:date="2026-10-08T04:28:00Z">
+        <w:r>
+          <w:delText>-</w:delText>
+        </w:r>
+      </w:del>
+      <w:ins w:id="19" w:author="Claude" w:date="2026-10-08T04:28:00Z">
+        <w:r>
+          <w:t>–</w:t>
+        </w:r>
+      </w:ins>
+      <w:r>
+        <w:t>i) show interfacial dissolved oxygen concentration (</w:t>
       </w:r>
       <w:r>
         <w:rPr>
@@ -17187,7 +17454,7 @@
         </w:rPr>
       </w:pPr>
     </w:p>
-    <w:bookmarkEnd w:id="12"/>
+    <w:bookmarkEnd w:id="13"/>
     <w:p>
       <w:pPr>
         <w:pStyle w:val="Heading2"/>
@@ -17352,8 +17619,8 @@
           <w:iCs w:val="0"/>
         </w:rPr>
       </w:pPr>
-      <w:bookmarkStart w:id="17" w:name="_Ref238632622"/>
-      <w:bookmarkStart w:id="18" w:name="_Ref240375786"/>
+      <w:bookmarkStart w:id="20" w:name="_Ref238632622"/>
+      <w:bookmarkStart w:id="21" w:name="_Ref240375786"/>
       <w:r>
         <w:rPr>
           <w:b/>
@@ -17398,8 +17665,8 @@
         </w:rPr>
         <w:fldChar w:fldCharType="end"/>
       </w:r>
-      <w:bookmarkEnd w:id="17"/>
-      <w:bookmarkEnd w:id="18"/>
+      <w:bookmarkEnd w:id="20"/>
+      <w:bookmarkEnd w:id="21"/>
       <w:r>
         <w:rPr>
           <w:b/>
@@ -18286,7 +18553,19 @@
         <w:rPr>
           <w:rFonts w:cs="Times New Roman"/>
         </w:rPr>
-        <w:t xml:space="preserve">), with an RMSE of 0.0159% and an </w:t>
+        <w:t xml:space="preserve">), with an RMSE of 0.0159% and </w:t>
+      </w:r>
+      <w:r>
+        <w:rPr>
+          <w:rFonts w:cs="Times New Roman"/>
+        </w:rPr>
+        <w:t>an</w:t>
+      </w:r>
+      <w:r>
+        <w:rPr>
+          <w:rFonts w:cs="Times New Roman"/>
+        </w:rPr>
+        <w:t xml:space="preserve"> </w:t>
       </w:r>
       <m:oMath>
         <m:sSup>
@@ -18507,7 +18786,31 @@
         <w:rPr>
           <w:rFonts w:cs="Times New Roman"/>
         </w:rPr>
-        <w:t xml:space="preserve">Corrosion products progressively accumulated near the Zn surface, forming a diffuse corrosion-product accumulation by 168 h and developing into a homogenized corrosion-product region by 672 h (</w:t>
+        <w:t xml:space="preserve">Corrosion products progressively accumulated near the Zn surface, forming a </w:t>
+      </w:r>
+      <w:r>
+        <w:rPr>
+          <w:rFonts w:cs="Times New Roman"/>
+        </w:rPr>
+        <w:t xml:space="preserve">diffuse corrosion-product accumulation </w:t>
+      </w:r>
+      <w:r>
+        <w:rPr>
+          <w:rFonts w:cs="Times New Roman"/>
+        </w:rPr>
+        <w:t xml:space="preserve">by 168 h and developing into a </w:t>
+      </w:r>
+      <w:r>
+        <w:rPr>
+          <w:rFonts w:cs="Times New Roman"/>
+        </w:rPr>
+        <w:t xml:space="preserve">homogenized corrosion-product </w:t>
+      </w:r>
+      <w:r>
+        <w:rPr>
+          <w:rFonts w:cs="Times New Roman"/>
+        </w:rPr>
+        <w:t>region by 672 h (</w:t>
       </w:r>
       <w:r>
         <w:rPr>
@@ -18574,7 +18877,19 @@
         <w:rPr>
           <w:rFonts w:cs="Times New Roman"/>
         </w:rPr>
-        <w:t xml:space="preserve">). As the near-surface corrosion-product field developed, transport resistance increased, progressively restricting oxygen diffusion toward the interface. </w:t>
+        <w:t xml:space="preserve">). As the </w:t>
+      </w:r>
+      <w:r>
+        <w:rPr>
+          <w:rFonts w:cs="Times New Roman"/>
+        </w:rPr>
+        <w:t>near-surface corrosion-product field developed</w:t>
+      </w:r>
+      <w:r>
+        <w:rPr>
+          <w:rFonts w:cs="Times New Roman"/>
+        </w:rPr>
+        <w:t xml:space="preserve">, transport resistance increased, progressively restricting oxygen diffusion toward the interface. </w:t>
       </w:r>
       <w:r>
         <w:rPr>
@@ -18653,7 +18968,19 @@
         <w:rPr>
           <w:rFonts w:cs="Times New Roman"/>
         </w:rPr>
-        <w:t xml:space="preserve">). The oxygen-deficient boundary layer expanded with immersion time, while radial concentration variations remained small, indicating predominantly one-dimensional transport normal to the surface. The combined effects of corrosion-product-induced transport limitation and oxygen consumption reduced interfacial oxygen availability, thereby suppressing ORR activity and producing the gradual decline in degradation rate. This mechanism is </w:t>
+        <w:t xml:space="preserve">). The oxygen-deficient boundary layer expanded with immersion time, while radial concentration variations remained small, indicating predominantly one-dimensional transport normal to the surface. The combined effects of </w:t>
+      </w:r>
+      <w:r>
+        <w:rPr>
+          <w:rFonts w:cs="Times New Roman"/>
+        </w:rPr>
+        <w:t>corrosion-product</w:t>
+      </w:r>
+      <w:r>
+        <w:rPr>
+          <w:rFonts w:cs="Times New Roman"/>
+        </w:rPr>
+        <w:t xml:space="preserve">-induced transport limitation and oxygen consumption reduced interfacial oxygen availability, thereby suppressing ORR activity and producing the gradual decline in degradation rate. This mechanism is </w:t>
       </w:r>
       <w:r>
         <w:rPr>
@@ -18757,7 +19084,7 @@
       <w:pPr>
         <w:pStyle w:val="Captions"/>
       </w:pPr>
-      <w:bookmarkStart w:id="19" w:name="_Ref239754424"/>
+      <w:bookmarkStart w:id="22" w:name="_Ref239754424"/>
       <w:r>
         <w:rPr>
           <w:b/>
@@ -18815,7 +19142,7 @@
         </w:rPr>
         <w:fldChar w:fldCharType="end"/>
       </w:r>
-      <w:bookmarkEnd w:id="19"/>
+      <w:bookmarkEnd w:id="22"/>
       <w:r>
         <w:rPr>
           <w:b/>
@@ -18977,19 +19304,19 @@
         <w:rPr>
           <w:rFonts w:cs="Times New Roman"/>
         </w:rPr>
-        <w:t xml:space="preserve">In addition to mass-loss validation, the model was evaluated against literature measurements</w:t>
-      </w:r>
-      <w:r>
-        <w:rPr>
-          <w:rFonts w:cs="Times New Roman"/>
-        </w:rPr>
-        <w:t xml:space="preserve"/>
-      </w:r>
-      <w:r>
-        <w:rPr>
-          <w:rFonts w:cs="Times New Roman"/>
-        </w:rPr>
-        <w:t xml:space="preserve"> of </w:t>
+        <w:t xml:space="preserve">In addition to mass-loss validation, the model was evaluated against </w:t>
+      </w:r>
+      <w:r>
+        <w:rPr>
+          <w:rFonts w:cs="Times New Roman"/>
+        </w:rPr>
+        <w:t xml:space="preserve">literature </w:t>
+      </w:r>
+      <w:r>
+        <w:rPr>
+          <w:rFonts w:cs="Times New Roman"/>
+        </w:rPr>
+        <w:t xml:space="preserve">measurements of </w:t>
       </w:r>
       <m:oMath>
         <m:r>
@@ -19037,182 +19364,200 @@
         <w:rPr>
           <w:rFonts w:cs="Times New Roman"/>
         </w:rPr>
-        <w:t xml:space="preserve"> concentration and pH evo</w:t>
+        <w:t xml:space="preserve"> concentration and pH evolution reported by Liu et al. </w:t>
+      </w:r>
+      <w:r>
+        <w:rPr>
+          <w:rFonts w:cs="Times New Roman"/>
+        </w:rPr>
+        <w:fldChar w:fldCharType="begin"/>
+      </w:r>
+      <w:r>
+        <w:rPr>
+          <w:rFonts w:cs="Times New Roman"/>
+        </w:rPr>
+        <w:instrText xml:space="preserve"> ADDIN ZOTERO_ITEM CSL_CITATION {"citationID":"TNsDeudZ","properties":{"unsorted":false,"formattedCitation":"\\super [41]\\nosupersub{}","plainCitation":"[41]","noteIndex":0},"citationItems":[{"id":3943,"uris":["http://zotero.org/users/16939557/items/QAXDRACS"],"itemData":{"id":3943,"type":"article-journal","citation-key":"liuInitialFormationCorrosion2018","container-title":"Journal of Materials Science &amp; Technology","DOI":"10.1016/j.jmst.2018.05.005","ISSN":"10050302","issue":"12","journalAbbreviation":"Journal of Materials Science &amp; Technology","language":"en","page":"2271-2282","source":"DOI.org (Crossref)","title":"Initial formation of corrosion products on pure zinc in simulated body fluid","volume":"34","author":[{"family":"Liu","given":"Lijun"},{"family":"Meng","given":"Yao"},{"family":"Dong","given":"Chaofang"},{"family":"Yan","given":"Yu"},{"family":"Volinsky","given":"Alex A."},{"family":"Wang","given":"Lu-Ning"}],"issued":{"date-parts":[["2018",12]]}}}],"schema":"https://github.com/citation-style-language/schema/raw/master/csl-citation.json"} </w:instrText>
+      </w:r>
+      <w:r>
+        <w:rPr>
+          <w:rFonts w:cs="Times New Roman"/>
+        </w:rPr>
+        <w:fldChar w:fldCharType="separate"/>
+      </w:r>
+      <w:r>
+        <w:rPr>
+          <w:rFonts w:cs="Times New Roman"/>
+          <w:vertAlign w:val="superscript"/>
+        </w:rPr>
+        <w:t>[41]</w:t>
+      </w:r>
+      <w:r>
+        <w:rPr>
+          <w:rFonts w:cs="Times New Roman"/>
+        </w:rPr>
+        <w:fldChar w:fldCharType="end"/>
+      </w:r>
+      <w:r>
+        <w:rPr>
+          <w:rFonts w:cs="Times New Roman"/>
+        </w:rPr>
+        <w:t xml:space="preserve"> (</w:t>
+      </w:r>
+      <w:r>
+        <w:rPr>
+          <w:rFonts w:cs="Times New Roman"/>
+          <w:b/>
+          <w:bCs/>
+        </w:rPr>
+        <w:t>Table S8</w:t>
+      </w:r>
+      <w:r>
+        <w:rPr>
+          <w:rFonts w:cs="Times New Roman"/>
+        </w:rPr>
+        <w:t>)</w:t>
+      </w:r>
+      <w:r>
+        <w:rPr>
+          <w:rFonts w:cs="Times New Roman"/>
+        </w:rPr>
+        <w:t xml:space="preserve">. As shown in </w:t>
+      </w:r>
+      <w:r>
+        <w:rPr>
+          <w:rFonts w:cs="Times New Roman"/>
+          <w:b/>
+          <w:bCs/>
+        </w:rPr>
+        <w:fldChar w:fldCharType="begin"/>
+      </w:r>
+      <w:r>
+        <w:rPr>
+          <w:rFonts w:cs="Times New Roman"/>
+          <w:b/>
+          <w:bCs/>
+        </w:rPr>
+        <w:instrText xml:space="preserve"> REF _Ref239754424 \h  \* MERGEFORMAT </w:instrText>
+      </w:r>
+      <w:r>
+        <w:rPr>
+          <w:rFonts w:cs="Times New Roman"/>
+          <w:b/>
+          <w:bCs/>
+        </w:rPr>
+      </w:r>
+      <w:r>
+        <w:rPr>
+          <w:rFonts w:cs="Times New Roman"/>
+          <w:b/>
+          <w:bCs/>
+        </w:rPr>
+        <w:fldChar w:fldCharType="separate"/>
+      </w:r>
+      <w:r>
+        <w:rPr>
+          <w:b/>
+          <w:bCs/>
+        </w:rPr>
+        <w:t xml:space="preserve">Figure </w:t>
+      </w:r>
+      <w:r>
+        <w:rPr>
+          <w:b/>
+          <w:bCs/>
+        </w:rPr>
+        <w:t>5</w:t>
+      </w:r>
+      <w:r>
+        <w:rPr>
+          <w:rFonts w:cs="Times New Roman"/>
+          <w:b/>
+          <w:bCs/>
+        </w:rPr>
+        <w:fldChar w:fldCharType="end"/>
+      </w:r>
+      <w:r>
+        <w:rPr>
+          <w:rFonts w:cs="Times New Roman"/>
+          <w:b/>
+          <w:bCs/>
+        </w:rPr>
+        <w:t>e,f</w:t>
+      </w:r>
+      <w:r>
+        <w:rPr>
+          <w:rFonts w:cs="Times New Roman"/>
+        </w:rPr>
+        <w:t>, the model reproduced the overall evolution of both quantities, capturing the rapid initial increase followed by a gradual plateau</w:t>
+      </w:r>
+      <w:r>
+        <w:rPr>
+          <w:rFonts w:cs="Times New Roman"/>
+        </w:rPr>
+        <w:t>,</w:t>
+      </w:r>
+      <w:r>
+        <w:rPr>
+          <w:rFonts w:cs="Times New Roman"/>
+        </w:rPr>
+        <w:t xml:space="preserve"> </w:t>
+      </w:r>
+      <w:r>
+        <w:rPr>
+          <w:rFonts w:cs="Times New Roman"/>
+        </w:rPr>
+        <w:t>with errors at 336 h of 44%</w:t>
+      </w:r>
+      <w:r>
+        <w:rPr>
+          <w:rFonts w:cs="Times New Roman"/>
+        </w:rPr>
+        <w:t xml:space="preserve"> for Zn²⁺ and </w:t>
+      </w:r>
+      <w:r>
+        <w:rPr>
+          <w:rFonts w:cs="Times New Roman"/>
+        </w:rPr>
+        <w:t xml:space="preserve">2.8% </w:t>
+      </w:r>
+      <w:r>
+        <w:rPr>
+          <w:rFonts w:cs="Times New Roman"/>
+        </w:rPr>
+        <w:t xml:space="preserve">for </w:t>
       </w:r>
       <w:proofErr w:type="spellStart"/>
       <w:r>
         <w:rPr>
           <w:rFonts w:cs="Times New Roman"/>
         </w:rPr>
-        <w:t>lution</w:t>
+        <w:t>pH.</w:t>
       </w:r>
       <w:proofErr w:type="spellEnd"/>
       <w:r>
         <w:rPr>
           <w:rFonts w:cs="Times New Roman"/>
         </w:rPr>
-        <w:t xml:space="preserve"> reported by Liu et al. </w:t>
-      </w:r>
-      <w:r>
-        <w:rPr>
-          <w:rFonts w:cs="Times New Roman"/>
-        </w:rPr>
-        <w:fldChar w:fldCharType="begin"/>
-      </w:r>
-      <w:r>
-        <w:rPr>
-          <w:rFonts w:cs="Times New Roman"/>
-        </w:rPr>
-        <w:instrText xml:space="preserve"> ADDIN ZOTERO_ITEM CSL_CITATION {"citationID":"TNsDeudZ","properties":{"unsorted":false,"formattedCitation":"\\super [41]\\nosupersub{}","plainCitation":"[41]","noteIndex":0},"citationItems":[{"id":3943,"uris":["http://zotero.org/users/16939557/items/QAXDRACS"],"itemData":{"id":3943,"type":"article-journal","citation-key":"liuInitialFormationCorrosion2018","container-title":"Journal of Materials Science &amp; Technology","DOI":"10.1016/j.jmst.2018.05.005","ISSN":"10050302","issue":"12","journalAbbreviation":"Journal of Materials Science &amp; Technology","language":"en","page":"2271-2282","source":"DOI.org (Crossref)","title":"Initial formation of corrosion products on pure zinc in simulated body fluid","volume":"34","author":[{"family":"Liu","given":"Lijun"},{"family":"Meng","given":"Yao"},{"family":"Dong","given":"Chaofang"},{"family":"Yan","given":"Yu"},{"family":"Volinsky","given":"Alex A."},{"family":"Wang","given":"Lu-Ning"}],"issued":{"date-parts":[["2018",12]]}}}],"schema":"https://github.com/citation-style-language/schema/raw/master/csl-citation.json"} </w:instrText>
-      </w:r>
-      <w:r>
-        <w:rPr>
-          <w:rFonts w:cs="Times New Roman"/>
-        </w:rPr>
-        <w:fldChar w:fldCharType="separate"/>
-      </w:r>
-      <w:r>
-        <w:rPr>
-          <w:rFonts w:cs="Times New Roman"/>
-          <w:vertAlign w:val="superscript"/>
-        </w:rPr>
-        <w:t>[41]</w:t>
-      </w:r>
-      <w:r>
-        <w:rPr>
-          <w:rFonts w:cs="Times New Roman"/>
-        </w:rPr>
-        <w:fldChar w:fldCharType="end"/>
-      </w:r>
-      <w:r>
-        <w:rPr>
-          <w:rFonts w:cs="Times New Roman"/>
-        </w:rPr>
-        <w:t xml:space="preserve"> (</w:t>
-      </w:r>
-      <w:r>
-        <w:rPr>
-          <w:rFonts w:cs="Times New Roman"/>
-          <w:b/>
-          <w:bCs/>
-        </w:rPr>
-        <w:t>Table S8</w:t>
-      </w:r>
-      <w:r>
-        <w:rPr>
-          <w:rFonts w:cs="Times New Roman"/>
-        </w:rPr>
-        <w:t>)</w:t>
-      </w:r>
-      <w:r>
-        <w:rPr>
-          <w:rFonts w:cs="Times New Roman"/>
-        </w:rPr>
-        <w:t xml:space="preserve">. As shown in </w:t>
-      </w:r>
-      <w:r>
-        <w:rPr>
-          <w:rFonts w:cs="Times New Roman"/>
-          <w:b/>
-          <w:bCs/>
-        </w:rPr>
-        <w:fldChar w:fldCharType="begin"/>
-      </w:r>
-      <w:r>
-        <w:rPr>
-          <w:rFonts w:cs="Times New Roman"/>
-          <w:b/>
-          <w:bCs/>
-        </w:rPr>
-        <w:instrText xml:space="preserve"> REF _Ref239754424 \h  \* MERGEFORMAT </w:instrText>
-      </w:r>
-      <w:r>
-        <w:rPr>
-          <w:rFonts w:cs="Times New Roman"/>
-          <w:b/>
-          <w:bCs/>
-        </w:rPr>
-      </w:r>
-      <w:r>
-        <w:rPr>
-          <w:rFonts w:cs="Times New Roman"/>
-          <w:b/>
-          <w:bCs/>
-        </w:rPr>
-        <w:fldChar w:fldCharType="separate"/>
-      </w:r>
-      <w:r>
-        <w:rPr>
-          <w:b/>
-          <w:bCs/>
-        </w:rPr>
-        <w:t xml:space="preserve">Figure </w:t>
-      </w:r>
-      <w:r>
-        <w:rPr>
-          <w:b/>
-          <w:bCs/>
-        </w:rPr>
-        <w:t>5</w:t>
-      </w:r>
-      <w:r>
-        <w:rPr>
-          <w:rFonts w:cs="Times New Roman"/>
-          <w:b/>
-          <w:bCs/>
-        </w:rPr>
-        <w:fldChar w:fldCharType="end"/>
-      </w:r>
-      <w:r>
-        <w:rPr>
-          <w:rFonts w:cs="Times New Roman"/>
-          <w:b/>
-          <w:bCs/>
-        </w:rPr>
-        <w:t>e,f</w:t>
-      </w:r>
-      <w:r>
-        <w:rPr>
-          <w:rFonts w:cs="Times New Roman"/>
-        </w:rPr>
-        <w:t xml:space="preserve">, the model reproduced the overall evolution of both quantities, capturing the rapid initial increase followed by a gradual plateau, with errors at 336 h of 44% for Zn²⁺ and 2.8% for pH</w:t>
-      </w:r>
-      <w:r>
-        <w:rPr>
-          <w:rFonts w:cs="Times New Roman"/>
-        </w:rPr>
-        <w:t xml:space="preserve"/>
-      </w:r>
-      <w:r>
-        <w:rPr>
-          <w:rFonts w:cs="Times New Roman"/>
-        </w:rPr>
-        <w:t xml:space="preserve"/>
-      </w:r>
-      <w:r>
-        <w:rPr>
-          <w:rFonts w:cs="Times New Roman"/>
-        </w:rPr>
-        <w:t xml:space="preserve">. </w:t>
-      </w:r>
-      <w:r>
-        <w:rPr>
-          <w:rFonts w:cs="Times New Roman"/>
-        </w:rPr>
-        <w:t xml:space="preserve">Because Zn²⁺ concentration and pH were excluded from the calibration objective, their comparison provides an out-of-objective evaluation of the coupled reaction terms. </w:t>
-      </w:r>
-      <w:r>
-        <w:rPr>
-          <w:rFonts w:cs="Times New Roman"/>
-        </w:rPr>
-        <w:t xml:space="preserve">The </w:t>
+        <w:t xml:space="preserve"> </w:t>
+      </w:r>
+      <w:r>
+        <w:rPr>
+          <w:rFonts w:cs="Times New Roman"/>
+        </w:rPr>
+        <w:t xml:space="preserve">Because Zn²⁺ concentration and pH were excluded from the calibration objective, their comparison provides an out-of-objective evaluation of the coupled </w:t>
       </w:r>
       <w:r>
         <w:rPr>
           <w:rFonts w:cs="Times New Roman"/>
         </w:rPr>
         <w:lastRenderedPageBreak/>
-        <w:t>overprediction</w:t>
+        <w:t xml:space="preserve">reaction terms. </w:t>
+      </w:r>
+      <w:r>
+        <w:rPr>
+          <w:rFonts w:cs="Times New Roman"/>
+        </w:rPr>
+        <w:t>The overprediction</w:t>
       </w:r>
       <w:r>
         <w:rPr>
@@ -19593,7 +19938,7 @@
       <w:pPr>
         <w:pStyle w:val="Captions"/>
       </w:pPr>
-      <w:bookmarkStart w:id="20" w:name="_Ref239754601"/>
+      <w:bookmarkStart w:id="23" w:name="_Ref239754601"/>
       <w:r>
         <w:rPr>
           <w:b/>
@@ -19651,7 +19996,7 @@
         </w:rPr>
         <w:fldChar w:fldCharType="end"/>
       </w:r>
-      <w:bookmarkEnd w:id="20"/>
+      <w:bookmarkEnd w:id="23"/>
       <w:r>
         <w:rPr>
           <w:b/>
@@ -20148,7 +20493,7 @@
         <w:ind w:firstLine="0"/>
         <w:jc w:val="center"/>
       </w:pPr>
-      <w:bookmarkStart w:id="21" w:name="fig:casestudy2"/>
+      <w:bookmarkStart w:id="24" w:name="fig:casestudy2"/>
       <w:r>
         <w:rPr>
           <w:noProof/>
@@ -20200,7 +20545,7 @@
       <w:pPr>
         <w:pStyle w:val="Captions"/>
       </w:pPr>
-      <w:bookmarkStart w:id="22" w:name="_Ref239754694"/>
+      <w:bookmarkStart w:id="25" w:name="_Ref239754694"/>
       <w:r>
         <w:rPr>
           <w:b/>
@@ -20258,7 +20603,7 @@
         </w:rPr>
         <w:fldChar w:fldCharType="end"/>
       </w:r>
-      <w:bookmarkEnd w:id="22"/>
+      <w:bookmarkEnd w:id="25"/>
       <w:r>
         <w:rPr>
           <w:b/>
@@ -20488,7 +20833,19 @@
         <w:t xml:space="preserve">Although the effects on cumulative mass loss were relatively modest, geometry strongly influenced the spatial distribution of degradation. Mean </w:t>
       </w:r>
       <w:r>
-        <w:t xml:space="preserve">penetration depths varied only slightly, ranging from approximately 2.4 to 2.7 µm across the curved-wire configurations (30°, 90°, and 150° arcs) and from 2.1 to 2.4 µm across the </w:t>
+        <w:t>penetration depths varied only slightly, ranging from approximately 2.</w:t>
+      </w:r>
+      <w:r>
+        <w:t>4</w:t>
+      </w:r>
+      <w:r>
+        <w:t xml:space="preserve"> to 2.7 µm across the curved-wire configurations (30°, 90°, and 150° arcs) and from 2.1 to 2.</w:t>
+      </w:r>
+      <w:r>
+        <w:t xml:space="preserve">4 </w:t>
+      </w:r>
+      <w:r>
+        <w:t xml:space="preserve">µm across the </w:t>
       </w:r>
       <w:proofErr w:type="spellStart"/>
       <w:r>
@@ -20590,7 +20947,7 @@
       <w:pPr>
         <w:pStyle w:val="Captions"/>
       </w:pPr>
-      <w:bookmarkStart w:id="23" w:name="_Ref241074684"/>
+      <w:bookmarkStart w:id="26" w:name="_Ref241074684"/>
       <w:r>
         <w:rPr>
           <w:b/>
@@ -20634,7 +20991,7 @@
         </w:rPr>
         <w:fldChar w:fldCharType="end"/>
       </w:r>
-      <w:bookmarkEnd w:id="23"/>
+      <w:bookmarkEnd w:id="26"/>
       <w:r>
         <w:rPr>
           <w:b/>
@@ -20658,7 +21015,15 @@
         <w:t xml:space="preserve"> spacings of 0.30 and 1.60 mm, (c) </w:t>
       </w:r>
       <w:r>
-        <w:t>mean local penetration depth for the corresponding curvature and spacing configurations (error bars: ±1 SD around the cross-section perimeter)</w:t>
+        <w:t>mean local penetration depth for the corresponding curvature and spacing configurations</w:t>
+      </w:r>
+      <w:ins w:id="27" w:author="Claude" w:date="2026-10-08T04:28:00Z">
+        <w:r>
+          <w:t xml:space="preserve"> </w:t>
+        </w:r>
+      </w:ins>
+      <w:r>
+        <w:t>(error bars: ±1 SD around the cross-section perimeter)</w:t>
       </w:r>
       <w:r>
         <w:t xml:space="preserve">, and (d) </w:t>
@@ -20692,18 +21057,72 @@
         <w:t xml:space="preserve"> </w:t>
       </w:r>
       <w:r>
-        <w:t xml:space="preserve">The corrosion products are treated as a homogenized ZnO-based field rather than a discrete surface film or a heterogeneous, composition-dependent structure. The dissolved oxygen concentration (3.5 mg L⁻¹) was taken from literature values for body fluids and was not measured in the immersion experiments; because it is strongly coupled to the ORR rate coefficient, the calibrated k_ORR should be regarded as an effective parameter that may also absorb uncertainty in the oxygen supply.</w:t>
-      </w:r>
-      <w:r>
-        <w:t xml:space="preserve"/>
+        <w:t>The corrosion</w:t>
+      </w:r>
+      <w:r>
+        <w:t xml:space="preserve"> products are </w:t>
+      </w:r>
+      <w:r>
+        <w:t xml:space="preserve">treated as a homogenized </w:t>
       </w:r>
       <w:proofErr w:type="spellStart"/>
       <w:r>
-        <w:t xml:space="preserve"/>
+        <w:t>ZnO</w:t>
       </w:r>
       <w:proofErr w:type="spellEnd"/>
       <w:r>
-        <w:t xml:space="preserve"/>
+        <w:t xml:space="preserve">-based </w:t>
+      </w:r>
+      <w:r>
+        <w:t xml:space="preserve">field </w:t>
+      </w:r>
+      <w:r>
+        <w:t>rather than</w:t>
+      </w:r>
+      <w:r>
+        <w:t xml:space="preserve"> a discrete surface film or </w:t>
+      </w:r>
+      <w:r>
+        <w:t>a heterogeneous, composition-dependent structure</w:t>
+      </w:r>
+      <w:r>
+        <w:t xml:space="preserve">. </w:t>
+      </w:r>
+      <w:r>
+        <w:t xml:space="preserve">The dissolved oxygen concentration (3.5 mg L⁻¹) was taken from literature values for physiological fluids rather than measured experimentally. As oxygen concentration is closely coupled to the ORR rate coefficient, the calibrated </w:t>
+      </w:r>
+      <m:oMath>
+        <m:sSub>
+          <m:sSubPr>
+            <m:ctrlPr>
+              <w:rPr>
+                <w:rFonts w:ascii="Cambria Math" w:hAnsi="Cambria Math" w:cs="Times New Roman"/>
+              </w:rPr>
+            </m:ctrlPr>
+          </m:sSubPr>
+          <m:e>
+            <m:r>
+              <w:rPr>
+                <w:rFonts w:ascii="Cambria Math" w:hAnsi="Cambria Math" w:cs="Times New Roman"/>
+              </w:rPr>
+              <m:t>k</m:t>
+            </m:r>
+          </m:e>
+          <m:sub>
+            <m:r>
+              <m:rPr>
+                <m:sty m:val="p"/>
+              </m:rPr>
+              <w:rPr>
+                <w:rFonts w:ascii="Cambria Math" w:hAnsi="Cambria Math" w:cs="Times New Roman"/>
+              </w:rPr>
+              <m:t>ORR</m:t>
+            </m:r>
+          </m:sub>
+        </m:sSub>
+      </m:oMath>
+      <w:r>
+        <w:t>​ should be regarded as an effective parameter that partially incorporates uncertainty in oxygen availability.</w:t>
       </w:r>
       <w:r>
         <w:t xml:space="preserve"> </w:t>
@@ -20721,7 +21140,11 @@
         <w:t xml:space="preserve">. Moreover, </w:t>
       </w:r>
       <w:r>
-        <w:t xml:space="preserve">the model assumes homogeneous electrochemical activity, preventing </w:t>
+        <w:t xml:space="preserve">the </w:t>
+      </w:r>
+      <w:r>
+        <w:lastRenderedPageBreak/>
+        <w:t xml:space="preserve">model assumes homogeneous electrochemical activity, preventing </w:t>
       </w:r>
       <w:r>
         <w:t xml:space="preserve">prediction of pitting, micro-galvanic coupling, and stress-assisted degradation. Although </w:t>
@@ -20739,11 +21162,7 @@
         <w:t>in vivo</w:t>
       </w:r>
       <w:r>
-        <w:t xml:space="preserve"> mass loss represents a predictive demonstration rather than formal validation. Further validation against spatially resolved measurements of corrosion-</w:t>
-      </w:r>
-      <w:r>
-        <w:lastRenderedPageBreak/>
-        <w:t>product coverage, oxygen availability, and local penetration is therefore required, particularly for complex implant geometries.</w:t>
+        <w:t xml:space="preserve"> mass loss represents a predictive demonstration rather than formal validation. Further validation against spatially resolved measurements of corrosion-product coverage, oxygen availability, and local penetration is therefore required, particularly for complex implant geometries.</w:t>
       </w:r>
     </w:p>
     <w:p>
@@ -20751,7 +21170,13 @@
         <w:pStyle w:val="BodyText"/>
       </w:pPr>
       <w:r>
-        <w:t>Future developments should incorporate physiologically realistic flow conditions, additional ionic species, multiphase corrosion-product evolution, and spatially heterogeneous electrochemical activity. Extending the framework to Zn alloys will also require accounting for alloying elements, secondary phases, and galvanic interactions. Although the high-fidelity simulations remain computationally demanding (about 69 h on 50–64 cores for a 672 h simulation on a 19–21 million-element mesh; Table S4), the reduced calibrated parameter space</w:t>
+        <w:t xml:space="preserve">Future developments should incorporate physiologically realistic flow conditions, additional ionic species, multiphase corrosion-product evolution, and spatially heterogeneous electrochemical activity. Extending the framework to Zn alloys will also require accounting for alloying elements, secondary phases, and galvanic interactions. Although the </w:t>
+      </w:r>
+      <w:r>
+        <w:t>high-fidelity</w:t>
+      </w:r>
+      <w:r>
+        <w:t xml:space="preserve"> simulations remain computationally demanding, the reduced calibrated parameter space</w:t>
       </w:r>
       <w:r>
         <w:t xml:space="preserve"> </w:t>
@@ -20839,12 +21264,31 @@
         <w:ind w:firstLine="0"/>
       </w:pPr>
     </w:p>
-    <w:bookmarkEnd w:id="21"/>
+    <w:p>
+      <w:pPr>
+        <w:pStyle w:val="BodyText"/>
+        <w:ind w:firstLine="0"/>
+      </w:pPr>
+    </w:p>
+    <w:p>
+      <w:pPr>
+        <w:pStyle w:val="BodyText"/>
+        <w:ind w:firstLine="0"/>
+      </w:pPr>
+    </w:p>
+    <w:p>
+      <w:pPr>
+        <w:pStyle w:val="BodyText"/>
+        <w:ind w:firstLine="0"/>
+      </w:pPr>
+    </w:p>
+    <w:bookmarkEnd w:id="24"/>
     <w:p>
       <w:pPr>
         <w:pStyle w:val="Heading1"/>
       </w:pPr>
       <w:r>
+        <w:lastRenderedPageBreak/>
         <w:t>Conclusions</w:t>
       </w:r>
     </w:p>
@@ -20852,9 +21296,21 @@
       <w:pPr>
         <w:pStyle w:val="BodyText"/>
       </w:pPr>
-      <w:bookmarkStart w:id="24" w:name="_Hlk238630414"/>
-      <w:r>
-        <w:t xml:space="preserve">Zn biodegradation under physiological conditions becomes an oxygen-transport-controlled process after an initial reaction-controlled stage in which implant geometry governs the spatial evolution of material loss. The proposed 3D reaction-diffusion model closely reproduced independent 28-day immersion data (RMSE = 0.0159%) and, without further calibration, predicted approximately 6% mass loss for a six-crown stent, of the same order of magnitude as reported </w:t>
+      <w:bookmarkStart w:id="28" w:name="_Hlk238630414"/>
+      <w:r>
+        <w:t xml:space="preserve">Zn biodegradation under physiological conditions becomes an oxygen-transport-controlled process after an initial reaction-controlled stage in which implant geometry governs the spatial evolution of material loss. The proposed 3D reaction-diffusion model closely reproduced independent 28-day immersion data (RMSE = 0.0159%) and, without further calibration, predicted approximately 6% mass loss </w:t>
+      </w:r>
+      <w:r>
+        <w:t>for a six-crown stent</w:t>
+      </w:r>
+      <w:r>
+        <w:t xml:space="preserve"> </w:t>
+      </w:r>
+      <w:r>
+        <w:t xml:space="preserve">of the same order of magnitude as </w:t>
+      </w:r>
+      <w:r>
+        <w:t xml:space="preserve">reported </w:t>
       </w:r>
       <w:r>
         <w:rPr>
@@ -20864,13 +21320,15 @@
         <w:t>in vivo</w:t>
       </w:r>
       <w:r>
-        <w:t xml:space="preserve"> observations. Mechanistic and sensitivity analyses identified oxygen availability as the primary driver of degradation, with corrosion-product accumulation progressively restricting transport </w:t>
-      </w:r>
-      <w:r>
-        <w:lastRenderedPageBreak/>
-        <w:t>and leading to diffusion-controlled behavior. Importantly, localized degradation emerged naturally from geometry-dependent transport phenomena, without imposing spatially varying corrosion kinetics. While curvature and inter-strut spacing produced only modest changes in cumulative mass loss, they strongly altered the distribution of material recession, demonstrating that global degradation metrics can obscure the localized thinning responsible for structural failure. These findings establish geometry as a critical determinant of biodegradable implant performance and provide a predictive framework for integrating degradation into the design and optimization of Zn stents and other biodegradable metallic implants, enabling structural performance to be considered throughout the implant lifetime rather than only at implantation.</w:t>
-      </w:r>
-      <w:bookmarkEnd w:id="24"/>
+        <w:t xml:space="preserve"> observations. Mechanistic and sensitivity analyses </w:t>
+      </w:r>
+      <w:r>
+        <w:t>identify</w:t>
+      </w:r>
+      <w:r>
+        <w:t xml:space="preserve"> oxygen availability as the primary driver of degradation, with corrosion-product accumulation progressively restricting transport and leading to diffusion-controlled behavior. Importantly, localized degradation emerged naturally from geometry-dependent transport phenomena, without imposing spatially varying corrosion kinetics. While curvature and inter-strut spacing produced only modest changes in cumulative mass loss, they strongly altered the distribution of material recession, demonstrating that global degradation metrics can obscure the localized thinning responsible for structural failure. These findings establish geometry as a critical determinant of biodegradable implant performance and provide a predictive framework for integrating degradation into the design and optimization of Zn stents and other biodegradable metallic implants, enabling structural performance to be considered throughout the implant lifetime rather than only at implantation.</w:t>
+      </w:r>
+      <w:bookmarkEnd w:id="28"/>
     </w:p>
     <w:p>
       <w:pPr>
@@ -21013,7 +21471,11 @@
         <w:t>Yunlong Tang:</w:t>
       </w:r>
       <w:r>
-        <w:t xml:space="preserve"> Conceptualization, Supervision, Resources, Writing – review &amp; editing.</w:t>
+        <w:t xml:space="preserve"> Conceptualization, Supervision, Resources, </w:t>
+      </w:r>
+      <w:r>
+        <w:lastRenderedPageBreak/>
+        <w:t>Writing – review &amp; editing.</w:t>
       </w:r>
       <w:r>
         <w:t xml:space="preserve"> </w:t>
@@ -21093,7 +21555,6 @@
           <w:b/>
           <w:bCs/>
         </w:rPr>
-        <w:lastRenderedPageBreak/>
         <w:t>Data</w:t>
       </w:r>
       <w:r>
@@ -21324,15 +21785,7 @@
         <w:pStyle w:val="Bibliography"/>
       </w:pPr>
       <w:r>
-        <w:t xml:space="preserve">4. P. K. Bowen, E. R. </w:t>
-      </w:r>
-      <w:proofErr w:type="spellStart"/>
-      <w:r>
-        <w:t>Shearier</w:t>
-      </w:r>
-      <w:proofErr w:type="spellEnd"/>
-      <w:r>
-        <w:t xml:space="preserve">, S. Zhao, et al., “Biodegradable Metals for Cardiovascular Stents: From Clinical Concerns to Recent Zn‐Alloys,” </w:t>
+        <w:t xml:space="preserve">4. P. K. Bowen, E. R. Shearier, S. Zhao, et al., “Biodegradable Metals for Cardiovascular Stents: From Clinical Concerns to Recent Zn‐Alloys,” </w:t>
       </w:r>
       <w:r>
         <w:rPr>
@@ -21360,23 +21813,7 @@
         <w:pStyle w:val="Bibliography"/>
       </w:pPr>
       <w:r>
-        <w:t xml:space="preserve">5. A. </w:t>
-      </w:r>
-      <w:proofErr w:type="spellStart"/>
-      <w:r>
-        <w:t>Atrens</w:t>
-      </w:r>
-      <w:proofErr w:type="spellEnd"/>
-      <w:r>
-        <w:t xml:space="preserve">, G. Song, M. Liu, Z. Shi, F. Cao, and M. S. </w:t>
-      </w:r>
-      <w:proofErr w:type="spellStart"/>
-      <w:r>
-        <w:t>Dargusch</w:t>
-      </w:r>
-      <w:proofErr w:type="spellEnd"/>
-      <w:r>
-        <w:t xml:space="preserve">, “Review of Recent Developments in the Field of Magnesium Corrosion,” </w:t>
+        <w:t xml:space="preserve">5. A. Atrens, G. Song, M. Liu, Z. Shi, F. Cao, and M. S. Dargusch, “Review of Recent Developments in the Field of Magnesium Corrosion,” </w:t>
       </w:r>
       <w:r>
         <w:rPr>
@@ -21404,15 +21841,7 @@
         <w:pStyle w:val="Bibliography"/>
       </w:pPr>
       <w:r>
-        <w:t xml:space="preserve">6. G. </w:t>
-      </w:r>
-      <w:proofErr w:type="spellStart"/>
-      <w:r>
-        <w:t>Katarivas</w:t>
-      </w:r>
-      <w:proofErr w:type="spellEnd"/>
-      <w:r>
-        <w:t xml:space="preserve"> Levy, J. Goldman, and E. Aghion, “The Prospects of Zinc as a Structural Material for Biodegradable Implants—A Review Paper,” </w:t>
+        <w:t xml:space="preserve">6. G. Katarivas Levy, J. Goldman, and E. Aghion, “The Prospects of Zinc as a Structural Material for Biodegradable Implants—A Review Paper,” </w:t>
       </w:r>
       <w:r>
         <w:rPr>
@@ -21440,56 +21869,15 @@
         <w:pStyle w:val="Bibliography"/>
       </w:pPr>
       <w:r>
-        <w:t xml:space="preserve">7. D. </w:t>
-      </w:r>
-      <w:proofErr w:type="spellStart"/>
-      <w:r>
-        <w:t>Vojtěch</w:t>
-      </w:r>
-      <w:proofErr w:type="spellEnd"/>
-      <w:r>
-        <w:t xml:space="preserve">, J. </w:t>
-      </w:r>
-      <w:proofErr w:type="spellStart"/>
-      <w:r>
-        <w:t>Kubásek</w:t>
-      </w:r>
-      <w:proofErr w:type="spellEnd"/>
-      <w:r>
-        <w:t xml:space="preserve">, J. </w:t>
-      </w:r>
-      <w:proofErr w:type="spellStart"/>
-      <w:r>
-        <w:t>Šerák</w:t>
-      </w:r>
-      <w:proofErr w:type="spellEnd"/>
-      <w:r>
-        <w:t xml:space="preserve">, and P. </w:t>
-      </w:r>
-      <w:proofErr w:type="spellStart"/>
-      <w:r>
-        <w:t>Novák</w:t>
-      </w:r>
-      <w:proofErr w:type="spellEnd"/>
-      <w:r>
-        <w:t xml:space="preserve">, “Mechanical and Corrosion Properties of Newly Developed Biodegradable Zn-Based Alloys for Bone Fixation,” </w:t>
+        <w:t xml:space="preserve">7. D. Vojtěch, J. Kubásek, J. Šerák, and P. Novák, “Mechanical and Corrosion Properties of Newly Developed Biodegradable Zn-Based Alloys for Bone Fixation,” </w:t>
       </w:r>
       <w:r>
         <w:rPr>
           <w:i/>
           <w:iCs/>
         </w:rPr>
-        <w:t xml:space="preserve">Acta </w:t>
-      </w:r>
-      <w:proofErr w:type="spellStart"/>
-      <w:r>
-        <w:rPr>
-          <w:i/>
-          <w:iCs/>
-        </w:rPr>
-        <w:t>Biomaterialia</w:t>
-      </w:r>
-      <w:proofErr w:type="spellEnd"/>
+        <w:t>Acta Biomaterialia</w:t>
+      </w:r>
       <w:r>
         <w:t xml:space="preserve"> </w:t>
       </w:r>
@@ -21651,21 +22039,12 @@
       <w:r>
         <w:t xml:space="preserve">13. Y. Shi, W. Xu, H. Che, et al., “The Effect of Topological Design on the Degradation Behavior of Additively Manufactured Porous Zinc Alloy,” </w:t>
       </w:r>
-      <w:proofErr w:type="spellStart"/>
       <w:r>
         <w:rPr>
           <w:i/>
           <w:iCs/>
         </w:rPr>
-        <w:t>npj</w:t>
-      </w:r>
-      <w:proofErr w:type="spellEnd"/>
-      <w:r>
-        <w:rPr>
-          <w:i/>
-          <w:iCs/>
-        </w:rPr>
-        <w:t xml:space="preserve"> Materials Degradation</w:t>
+        <w:t>npj Materials Degradation</w:t>
       </w:r>
       <w:r>
         <w:t xml:space="preserve"> </w:t>
@@ -21686,23 +22065,7 @@
         <w:pStyle w:val="Bibliography"/>
       </w:pPr>
       <w:r>
-        <w:t xml:space="preserve">14. T. Albaraghtheh, R. </w:t>
-      </w:r>
-      <w:proofErr w:type="spellStart"/>
-      <w:r>
-        <w:t>Willumeit-Römer</w:t>
-      </w:r>
-      <w:proofErr w:type="spellEnd"/>
-      <w:r>
-        <w:t>, and B. Zeller-</w:t>
-      </w:r>
-      <w:proofErr w:type="spellStart"/>
-      <w:r>
-        <w:t>Plumhoff</w:t>
-      </w:r>
-      <w:proofErr w:type="spellEnd"/>
-      <w:r>
-        <w:t xml:space="preserve">, “In Silico Studies of Magnesium-Based Implants: A Review of the Current Stage and Challenges,” </w:t>
+        <w:t xml:space="preserve">14. T. Albaraghtheh, R. Willumeit-Römer, and B. Zeller-Plumhoff, “In Silico Studies of Magnesium-Based Implants: A Review of the Current Stage and Challenges,” </w:t>
       </w:r>
       <w:r>
         <w:rPr>
@@ -21758,39 +22121,7 @@
         <w:pStyle w:val="Bibliography"/>
       </w:pPr>
       <w:r>
-        <w:t xml:space="preserve">16. D. Gastaldi, V. Sassi, L. </w:t>
-      </w:r>
-      <w:proofErr w:type="spellStart"/>
-      <w:r>
-        <w:t>Petrini</w:t>
-      </w:r>
-      <w:proofErr w:type="spellEnd"/>
-      <w:r>
-        <w:t xml:space="preserve">, M. </w:t>
-      </w:r>
-      <w:proofErr w:type="spellStart"/>
-      <w:r>
-        <w:t>Vedani</w:t>
-      </w:r>
-      <w:proofErr w:type="spellEnd"/>
-      <w:r>
-        <w:t xml:space="preserve">, S. </w:t>
-      </w:r>
-      <w:proofErr w:type="spellStart"/>
-      <w:r>
-        <w:t>Trasatti</w:t>
-      </w:r>
-      <w:proofErr w:type="spellEnd"/>
-      <w:r>
-        <w:t xml:space="preserve">, and F. </w:t>
-      </w:r>
-      <w:proofErr w:type="spellStart"/>
-      <w:r>
-        <w:t>Migliavacca</w:t>
-      </w:r>
-      <w:proofErr w:type="spellEnd"/>
-      <w:r>
-        <w:t xml:space="preserve">, “Continuum Damage Model for Bioresorbable Magnesium Alloy Devices — Application to Coronary </w:t>
+        <w:t xml:space="preserve">16. D. Gastaldi, V. Sassi, L. Petrini, M. Vedani, S. Trasatti, and F. Migliavacca, “Continuum Damage Model for Bioresorbable Magnesium Alloy Devices — Application to Coronary </w:t>
       </w:r>
       <w:r>
         <w:lastRenderedPageBreak/>
@@ -21829,17 +22160,8 @@
           <w:i/>
           <w:iCs/>
         </w:rPr>
-        <w:t xml:space="preserve">Acta </w:t>
-      </w:r>
-      <w:proofErr w:type="spellStart"/>
-      <w:r>
-        <w:rPr>
-          <w:i/>
-          <w:iCs/>
-        </w:rPr>
-        <w:t>Biomaterialia</w:t>
-      </w:r>
-      <w:proofErr w:type="spellEnd"/>
+        <w:t>Acta Biomaterialia</w:t>
+      </w:r>
       <w:r>
         <w:t xml:space="preserve"> </w:t>
       </w:r>
@@ -21859,23 +22181,7 @@
         <w:pStyle w:val="Bibliography"/>
       </w:pPr>
       <w:r>
-        <w:t xml:space="preserve">18. M. </w:t>
-      </w:r>
-      <w:proofErr w:type="spellStart"/>
-      <w:r>
-        <w:t>Barzegari</w:t>
-      </w:r>
-      <w:proofErr w:type="spellEnd"/>
-      <w:r>
-        <w:t xml:space="preserve">, D. Mei, S. V. </w:t>
-      </w:r>
-      <w:proofErr w:type="spellStart"/>
-      <w:r>
-        <w:t>Lamaka</w:t>
-      </w:r>
-      <w:proofErr w:type="spellEnd"/>
-      <w:r>
-        <w:t xml:space="preserve">, and L. Geris, “Computational Modeling of Degradation Process of Biodegradable Magnesium Biomaterials,” </w:t>
+        <w:t xml:space="preserve">18. M. Barzegari, D. Mei, S. V. Lamaka, and L. Geris, “Computational Modeling of Degradation Process of Biodegradable Magnesium Biomaterials,” </w:t>
       </w:r>
       <w:r>
         <w:rPr>
@@ -21903,47 +22209,7 @@
         <w:pStyle w:val="Bibliography"/>
       </w:pPr>
       <w:r>
-        <w:t xml:space="preserve">19. P. </w:t>
-      </w:r>
-      <w:proofErr w:type="spellStart"/>
-      <w:r>
-        <w:t>Bajger</w:t>
-      </w:r>
-      <w:proofErr w:type="spellEnd"/>
-      <w:r>
-        <w:t xml:space="preserve">, J. M. A. </w:t>
-      </w:r>
-      <w:proofErr w:type="spellStart"/>
-      <w:r>
-        <w:t>Ashbourn</w:t>
-      </w:r>
-      <w:proofErr w:type="spellEnd"/>
-      <w:r>
-        <w:t xml:space="preserve">, V. </w:t>
-      </w:r>
-      <w:proofErr w:type="spellStart"/>
-      <w:r>
-        <w:t>Manhas</w:t>
-      </w:r>
-      <w:proofErr w:type="spellEnd"/>
-      <w:r>
-        <w:t xml:space="preserve">, Y. Guyot, K. </w:t>
-      </w:r>
-      <w:proofErr w:type="spellStart"/>
-      <w:r>
-        <w:t>Lietaert</w:t>
-      </w:r>
-      <w:proofErr w:type="spellEnd"/>
-      <w:r>
-        <w:t xml:space="preserve">, and L. Geris, “Mathematical Modelling of the Degradation </w:t>
-      </w:r>
-      <w:proofErr w:type="spellStart"/>
-      <w:r>
-        <w:t>Behaviour</w:t>
-      </w:r>
-      <w:proofErr w:type="spellEnd"/>
-      <w:r>
-        <w:t xml:space="preserve"> of Biodegradable Metals,” </w:t>
+        <w:t xml:space="preserve">19. P. Bajger, J. M. A. Ashbourn, V. Manhas, Y. Guyot, K. Lietaert, and L. Geris, “Mathematical Modelling of the Degradation Behaviour of Biodegradable Metals,” </w:t>
       </w:r>
       <w:r>
         <w:rPr>
@@ -21971,23 +22237,7 @@
         <w:pStyle w:val="Bibliography"/>
       </w:pPr>
       <w:r>
-        <w:t xml:space="preserve">20. S. Thomas, N. V. </w:t>
-      </w:r>
-      <w:proofErr w:type="spellStart"/>
-      <w:r>
-        <w:t>Medhekar</w:t>
-      </w:r>
-      <w:proofErr w:type="spellEnd"/>
-      <w:r>
-        <w:t xml:space="preserve">, G. S. Frankel, and N. </w:t>
-      </w:r>
-      <w:proofErr w:type="spellStart"/>
-      <w:r>
-        <w:t>Birbilis</w:t>
-      </w:r>
-      <w:proofErr w:type="spellEnd"/>
-      <w:r>
-        <w:t xml:space="preserve">, “Corrosion Mechanism and Hydrogen Evolution on Mg,” </w:t>
+        <w:t xml:space="preserve">20. S. Thomas, N. V. Medhekar, G. S. Frankel, and N. Birbilis, “Corrosion Mechanism and Hydrogen Evolution on Mg,” </w:t>
       </w:r>
       <w:r>
         <w:rPr>
@@ -22043,23 +22293,7 @@
         <w:pStyle w:val="Bibliography"/>
       </w:pPr>
       <w:r>
-        <w:t xml:space="preserve">22. A. P. Yadav, A. </w:t>
-      </w:r>
-      <w:proofErr w:type="spellStart"/>
-      <w:r>
-        <w:t>Nishikata</w:t>
-      </w:r>
-      <w:proofErr w:type="spellEnd"/>
-      <w:r>
-        <w:t xml:space="preserve">, and T. </w:t>
-      </w:r>
-      <w:proofErr w:type="spellStart"/>
-      <w:r>
-        <w:t>Tsuru</w:t>
-      </w:r>
-      <w:proofErr w:type="spellEnd"/>
-      <w:r>
-        <w:t xml:space="preserve">, “Oxygen Reduction Mechanism on Corroded Zinc,” </w:t>
+        <w:t xml:space="preserve">22. A. P. Yadav, A. Nishikata, and T. Tsuru, “Oxygen Reduction Mechanism on Corroded Zinc,” </w:t>
       </w:r>
       <w:r>
         <w:rPr>
@@ -22087,31 +22321,14 @@
         <w:pStyle w:val="Bibliography"/>
       </w:pPr>
       <w:r>
-        <w:t xml:space="preserve">23. C. Chen, M. Hofmann, and T. </w:t>
-      </w:r>
-      <w:proofErr w:type="spellStart"/>
-      <w:r>
-        <w:t>Wallmersperger</w:t>
-      </w:r>
-      <w:proofErr w:type="spellEnd"/>
-      <w:r>
-        <w:t xml:space="preserve">, “Modeling the Uniform Corrosion Behavior of Zinc in Salt Spray Testing,” </w:t>
-      </w:r>
-      <w:proofErr w:type="spellStart"/>
+        <w:t xml:space="preserve">23. C. Chen, M. Hofmann, and T. Wallmersperger, “Modeling the Uniform Corrosion Behavior of Zinc in Salt Spray Testing,” </w:t>
+      </w:r>
       <w:r>
         <w:rPr>
           <w:i/>
           <w:iCs/>
         </w:rPr>
-        <w:t>npj</w:t>
-      </w:r>
-      <w:proofErr w:type="spellEnd"/>
-      <w:r>
-        <w:rPr>
-          <w:i/>
-          <w:iCs/>
-        </w:rPr>
-        <w:t xml:space="preserve"> Materials Degradation</w:t>
+        <w:t>npj Materials Degradation</w:t>
       </w:r>
       <w:r>
         <w:t xml:space="preserve"> </w:t>
@@ -22132,31 +22349,7 @@
         <w:pStyle w:val="Bibliography"/>
       </w:pPr>
       <w:r>
-        <w:t xml:space="preserve">24. V. A. Bryzgalov, A. A. </w:t>
-      </w:r>
-      <w:proofErr w:type="spellStart"/>
-      <w:r>
-        <w:t>Kistanov</w:t>
-      </w:r>
-      <w:proofErr w:type="spellEnd"/>
-      <w:r>
-        <w:t xml:space="preserve">, A. A. </w:t>
-      </w:r>
-      <w:proofErr w:type="spellStart"/>
-      <w:r>
-        <w:t>Izosimov</w:t>
-      </w:r>
-      <w:proofErr w:type="spellEnd"/>
-      <w:r>
-        <w:t xml:space="preserve">, and E. A. </w:t>
-      </w:r>
-      <w:proofErr w:type="spellStart"/>
-      <w:r>
-        <w:t>Korznikova</w:t>
-      </w:r>
-      <w:proofErr w:type="spellEnd"/>
-      <w:r>
-        <w:t xml:space="preserve">, “Atomic-Scale Study of Lattice Distortion and Oxygen-Rich Environment Impact on the Surface Degradation Dynamics of Zinc-Based Alloys,” </w:t>
+        <w:t xml:space="preserve">24. V. A. Bryzgalov, A. A. Kistanov, A. A. Izosimov, and E. A. Korznikova, “Atomic-Scale Study of Lattice Distortion and Oxygen-Rich Environment Impact on the Surface Degradation Dynamics of Zinc-Based Alloys,” </w:t>
       </w:r>
       <w:r>
         <w:rPr>
@@ -22184,31 +22377,7 @@
         <w:pStyle w:val="Bibliography"/>
       </w:pPr>
       <w:r>
-        <w:t xml:space="preserve">25. T. </w:t>
-      </w:r>
-      <w:proofErr w:type="spellStart"/>
-      <w:r>
-        <w:t>AlBaraghtheh</w:t>
-      </w:r>
-      <w:proofErr w:type="spellEnd"/>
-      <w:r>
-        <w:t xml:space="preserve">, R. </w:t>
-      </w:r>
-      <w:proofErr w:type="spellStart"/>
-      <w:r>
-        <w:t>Willumeit‐Römer</w:t>
-      </w:r>
-      <w:proofErr w:type="spellEnd"/>
-      <w:r>
-        <w:t>, and B. Zeller‐</w:t>
-      </w:r>
-      <w:proofErr w:type="spellStart"/>
-      <w:r>
-        <w:t>Plumhoff</w:t>
-      </w:r>
-      <w:proofErr w:type="spellEnd"/>
-      <w:r>
-        <w:t xml:space="preserve">, “Best Practices in Developing a Workflow for Uncertainty Quantification for Modeling the Biodegradation of Mg‐Based Implants,” </w:t>
+        <w:t xml:space="preserve">25. T. AlBaraghtheh, R. Willumeit‐Römer, and B. Zeller‐Plumhoff, “Best Practices in Developing a Workflow for Uncertainty Quantification for Modeling the Biodegradation of Mg‐Based Implants,” </w:t>
       </w:r>
       <w:r>
         <w:rPr>
@@ -22236,31 +22405,7 @@
         <w:pStyle w:val="Bibliography"/>
       </w:pPr>
       <w:r>
-        <w:t xml:space="preserve">26. S. Huang, W. Wu, Y. </w:t>
-      </w:r>
-      <w:proofErr w:type="spellStart"/>
-      <w:r>
-        <w:t>Su</w:t>
-      </w:r>
-      <w:proofErr w:type="spellEnd"/>
-      <w:r>
-        <w:t xml:space="preserve">, L. </w:t>
-      </w:r>
-      <w:proofErr w:type="spellStart"/>
-      <w:r>
-        <w:t>Qiao</w:t>
-      </w:r>
-      <w:proofErr w:type="spellEnd"/>
-      <w:r>
-        <w:t xml:space="preserve">, and Y. Yan, “Insight into the Corrosion </w:t>
-      </w:r>
-      <w:proofErr w:type="spellStart"/>
-      <w:r>
-        <w:t>Behaviour</w:t>
-      </w:r>
-      <w:proofErr w:type="spellEnd"/>
-      <w:r>
-        <w:t xml:space="preserve"> and Degradation Mechanism of Pure Zinc in Simulated Body Fluid,” </w:t>
+        <w:t xml:space="preserve">26. S. Huang, W. Wu, Y. Su, L. Qiao, and Y. Yan, “Insight into the Corrosion Behaviour and Degradation Mechanism of Pure Zinc in Simulated Body Fluid,” </w:t>
       </w:r>
       <w:r>
         <w:rPr>
@@ -22344,15 +22489,7 @@
         <w:pStyle w:val="Bibliography"/>
       </w:pPr>
       <w:r>
-        <w:t xml:space="preserve">29. P. K. Bowen, J. </w:t>
-      </w:r>
-      <w:proofErr w:type="spellStart"/>
-      <w:r>
-        <w:t>Drelich</w:t>
-      </w:r>
-      <w:proofErr w:type="spellEnd"/>
-      <w:r>
-        <w:t xml:space="preserve">, and J. Goldman, “Zinc Exhibits Ideal Physiological Corrosion Behavior for Bioabsorbable Stents,” </w:t>
+        <w:t xml:space="preserve">29. P. K. Bowen, J. Drelich, and J. Goldman, “Zinc Exhibits Ideal Physiological Corrosion Behavior for Bioabsorbable Stents,” </w:t>
       </w:r>
       <w:r>
         <w:rPr>
@@ -22434,15 +22571,7 @@
         <w:pStyle w:val="Bibliography"/>
       </w:pPr>
       <w:r>
-        <w:t xml:space="preserve">32. J. W. Wilder, C. Clemons, D. </w:t>
-      </w:r>
-      <w:proofErr w:type="spellStart"/>
-      <w:r>
-        <w:t>Golovaty</w:t>
-      </w:r>
-      <w:proofErr w:type="spellEnd"/>
-      <w:r>
-        <w:t xml:space="preserve">, K. L. Kreider, G. W. Young, and R. S. Lillard, “An Adaptive Level Set Approach for Modeling Damage Due to Galvanic Corrosion,” </w:t>
+        <w:t xml:space="preserve">32. J. W. Wilder, C. Clemons, D. Golovaty, K. L. Kreider, G. W. Young, and R. S. Lillard, “An Adaptive Level Set Approach for Modeling Damage Due to Galvanic Corrosion,” </w:t>
       </w:r>
       <w:r>
         <w:rPr>
@@ -22477,17 +22606,8 @@
           <w:i/>
           <w:iCs/>
         </w:rPr>
-        <w:t xml:space="preserve">Acta </w:t>
-      </w:r>
-      <w:proofErr w:type="spellStart"/>
-      <w:r>
-        <w:rPr>
-          <w:i/>
-          <w:iCs/>
-        </w:rPr>
-        <w:t>Biomaterialia</w:t>
-      </w:r>
-      <w:proofErr w:type="spellEnd"/>
+        <w:t>Acta Biomaterialia</w:t>
+      </w:r>
       <w:r>
         <w:t xml:space="preserve"> </w:t>
       </w:r>
@@ -22599,31 +22719,7 @@
         <w:pStyle w:val="Bibliography"/>
       </w:pPr>
       <w:r>
-        <w:t xml:space="preserve">37. L. Holzer, P. </w:t>
-      </w:r>
-      <w:proofErr w:type="spellStart"/>
-      <w:r>
-        <w:t>Marmet</w:t>
-      </w:r>
-      <w:proofErr w:type="spellEnd"/>
-      <w:r>
-        <w:t xml:space="preserve">, M. </w:t>
-      </w:r>
-      <w:proofErr w:type="spellStart"/>
-      <w:r>
-        <w:t>Fingerle</w:t>
-      </w:r>
-      <w:proofErr w:type="spellEnd"/>
-      <w:r>
-        <w:t xml:space="preserve">, A. </w:t>
-      </w:r>
-      <w:proofErr w:type="spellStart"/>
-      <w:r>
-        <w:t>Wiegmann</w:t>
-      </w:r>
-      <w:proofErr w:type="spellEnd"/>
-      <w:r>
-        <w:t xml:space="preserve">, M. Neumann, and V. Schmidt, “Tortuosity-Porosity Relationships: Review of Empirical Data from Literature,” in </w:t>
+        <w:t xml:space="preserve">37. L. Holzer, P. Marmet, M. Fingerle, A. Wiegmann, M. Neumann, and V. Schmidt, “Tortuosity-Porosity Relationships: Review of Empirical Data from Literature,” in </w:t>
       </w:r>
       <w:r>
         <w:rPr>
@@ -22669,31 +22765,7 @@
         <w:pStyle w:val="Bibliography"/>
       </w:pPr>
       <w:r>
-        <w:t xml:space="preserve">39. J. </w:t>
-      </w:r>
-      <w:proofErr w:type="spellStart"/>
-      <w:r>
-        <w:t>Tkacz</w:t>
-      </w:r>
-      <w:proofErr w:type="spellEnd"/>
-      <w:r>
-        <w:t xml:space="preserve">, K. </w:t>
-      </w:r>
-      <w:proofErr w:type="spellStart"/>
-      <w:r>
-        <w:t>Slouková</w:t>
-      </w:r>
-      <w:proofErr w:type="spellEnd"/>
-      <w:r>
-        <w:t xml:space="preserve">, J. </w:t>
-      </w:r>
-      <w:proofErr w:type="spellStart"/>
-      <w:r>
-        <w:t>Minda</w:t>
-      </w:r>
-      <w:proofErr w:type="spellEnd"/>
-      <w:r>
-        <w:t xml:space="preserve">, et al., “Influence of the Composition of the Hank’s Balanced Salt Solution on the Corrosion Behavior of AZ31 and AZ61 Magnesium Alloys,” </w:t>
+        <w:t xml:space="preserve">39. J. Tkacz, K. Slouková, J. Minda, et al., “Influence of the Composition of the Hank’s Balanced Salt Solution on the Corrosion Behavior of AZ31 and AZ61 Magnesium Alloys,” </w:t>
       </w:r>
       <w:r>
         <w:rPr>
@@ -22721,23 +22793,7 @@
         <w:pStyle w:val="Bibliography"/>
       </w:pPr>
       <w:r>
-        <w:t xml:space="preserve">40. T. </w:t>
-      </w:r>
-      <w:proofErr w:type="spellStart"/>
-      <w:r>
-        <w:t>Kokubo</w:t>
-      </w:r>
-      <w:proofErr w:type="spellEnd"/>
-      <w:r>
-        <w:t xml:space="preserve">, and H. </w:t>
-      </w:r>
-      <w:proofErr w:type="spellStart"/>
-      <w:r>
-        <w:t>Takadama</w:t>
-      </w:r>
-      <w:proofErr w:type="spellEnd"/>
-      <w:r>
-        <w:t xml:space="preserve">, “How Useful Is SBF in Predicting in Vivo Bone Bioactivity?,” </w:t>
+        <w:t xml:space="preserve">40. T. Kokubo, and H. Takadama, “How Useful Is SBF in Predicting in Vivo Bone Bioactivity?,” </w:t>
       </w:r>
       <w:r>
         <w:rPr>
@@ -22765,15 +22821,7 @@
         <w:pStyle w:val="Bibliography"/>
       </w:pPr>
       <w:r>
-        <w:t xml:space="preserve">41. L. Liu, Y. Meng, C. Dong, Y. Yan, A. A. </w:t>
-      </w:r>
-      <w:proofErr w:type="spellStart"/>
-      <w:r>
-        <w:t>Volinsky</w:t>
-      </w:r>
-      <w:proofErr w:type="spellEnd"/>
-      <w:r>
-        <w:t xml:space="preserve">, and L.-N. Wang, “Initial Formation of Corrosion Products on Pure Zinc in Simulated Body Fluid,” </w:t>
+        <w:t xml:space="preserve">41. L. Liu, Y. Meng, C. Dong, Y. Yan, A. A. Volinsky, and L.-N. Wang, “Initial Formation of Corrosion Products on Pure Zinc in Simulated Body Fluid,” </w:t>
       </w:r>
       <w:r>
         <w:rPr>
@@ -22801,56 +22849,15 @@
         <w:pStyle w:val="Bibliography"/>
       </w:pPr>
       <w:r>
-        <w:t xml:space="preserve">42. E. </w:t>
-      </w:r>
-      <w:proofErr w:type="spellStart"/>
-      <w:r>
-        <w:t>Mostaed</w:t>
-      </w:r>
-      <w:proofErr w:type="spellEnd"/>
-      <w:r>
-        <w:t>, M. Sikora-</w:t>
-      </w:r>
-      <w:proofErr w:type="spellStart"/>
-      <w:r>
-        <w:t>Jasinska</w:t>
-      </w:r>
-      <w:proofErr w:type="spellEnd"/>
-      <w:r>
-        <w:t xml:space="preserve">, J. W. </w:t>
-      </w:r>
-      <w:proofErr w:type="spellStart"/>
-      <w:r>
-        <w:t>Drelich</w:t>
-      </w:r>
-      <w:proofErr w:type="spellEnd"/>
-      <w:r>
-        <w:t xml:space="preserve">, and M. </w:t>
-      </w:r>
-      <w:proofErr w:type="spellStart"/>
-      <w:r>
-        <w:t>Vedani</w:t>
-      </w:r>
-      <w:proofErr w:type="spellEnd"/>
-      <w:r>
-        <w:t xml:space="preserve">, “Zinc-Based Alloys for Degradable Vascular Stent Applications,” </w:t>
+        <w:t xml:space="preserve">42. E. Mostaed, M. Sikora-Jasinska, J. W. Drelich, and M. Vedani, “Zinc-Based Alloys for Degradable Vascular Stent Applications,” </w:t>
       </w:r>
       <w:r>
         <w:rPr>
           <w:i/>
           <w:iCs/>
         </w:rPr>
-        <w:t xml:space="preserve">Acta </w:t>
-      </w:r>
-      <w:proofErr w:type="spellStart"/>
-      <w:r>
-        <w:rPr>
-          <w:i/>
-          <w:iCs/>
-        </w:rPr>
-        <w:t>Biomaterialia</w:t>
-      </w:r>
-      <w:proofErr w:type="spellEnd"/>
+        <w:t>Acta Biomaterialia</w:t>
+      </w:r>
       <w:r>
         <w:t xml:space="preserve"> </w:t>
       </w:r>
@@ -23004,7 +23011,7 @@
 </file>
 
 <file path=word/endnotes.xml><?xml version="1.0" encoding="utf-8"?>
-<w:endnotes xmlns:wpc="http://schemas.microsoft.com/office/word/2010/wordprocessingCanvas" xmlns:cx="http://schemas.microsoft.com/office/drawing/2014/chartex" xmlns:cx1="http://schemas.microsoft.com/office/drawing/2015/9/8/chartex" xmlns:cx2="http://schemas.microsoft.com/office/drawing/2015/10/21/chartex" xmlns:cx3="http://schemas.microsoft.com/office/drawing/2016/5/9/chartex" xmlns:cx4="http://schemas.microsoft.com/office/drawing/2016/5/10/chartex" xmlns:cx5="http://schemas.microsoft.com/office/drawing/2016/5/11/chartex" xmlns:cx6="http://schemas.microsoft.com/office/drawing/2016/5/12/chartex" xmlns:cx7="http://schemas.microsoft.com/office/drawing/2016/5/13/chartex" xmlns:cx8="http://schemas.microsoft.com/office/drawing/2016/5/14/chartex" xmlns:mc="http://schemas.openxmlformats.org/markup-compatibility/2006" xmlns:aink="http://schemas.microsoft.com/office/drawing/2016/ink" xmlns:am3d="http://schemas.microsoft.com/office/drawing/2017/model3d" xmlns:o="urn:schemas-microsoft-com:office:office" xmlns:r="http://schemas.openxmlformats.org/officeDocument/2006/relationships" xmlns:m="http://schemas.openxmlformats.org/officeDocument/2006/math" xmlns:v="urn:schemas-microsoft-com:vml" xmlns:wp14="http://schemas.microsoft.com/office/word/2010/wordprocessingDrawing" xmlns:wp="http://schemas.openxmlformats.org/drawingml/2006/wordprocessingDrawing" xmlns:w10="urn:schemas-microsoft-com:office:word" xmlns:w="http://schemas.openxmlformats.org/wordprocessingml/2006/main" xmlns:w14="http://schemas.microsoft.com/office/word/2010/wordml" xmlns:w15="http://schemas.microsoft.com/office/word/2012/wordml" xmlns:w16cex="http://schemas.microsoft.com/office/word/2018/wordml/cex" xmlns:w16cid="http://schemas.microsoft.com/office/word/2016/wordml/cid" xmlns:w16="http://schemas.microsoft.com/office/word/2018/wordml" xmlns:w16sdtdh="http://schemas.microsoft.com/office/word/2020/wordml/sdtdatahash" xmlns:w16se="http://schemas.microsoft.com/office/word/2015/wordml/symex" xmlns:wpg="http://schemas.microsoft.com/office/word/2010/wordprocessingGroup" xmlns:wpi="http://schemas.microsoft.com/office/word/2010/wordprocessingInk" xmlns:wne="http://schemas.microsoft.com/office/word/2006/wordml" xmlns:wps="http://schemas.microsoft.com/office/word/2010/wordprocessingShape" mc:Ignorable="w14 w15 w16se w16cid w16 w16cex w16sdtdh wp14">
+<w:endnotes xmlns:wpc="http://schemas.microsoft.com/office/word/2010/wordprocessingCanvas" xmlns:cx="http://schemas.microsoft.com/office/drawing/2014/chartex" xmlns:cx1="http://schemas.microsoft.com/office/drawing/2015/9/8/chartex" xmlns:cx2="http://schemas.microsoft.com/office/drawing/2015/10/21/chartex" xmlns:cx3="http://schemas.microsoft.com/office/drawing/2016/5/9/chartex" xmlns:cx4="http://schemas.microsoft.com/office/drawing/2016/5/10/chartex" xmlns:cx5="http://schemas.microsoft.com/office/drawing/2016/5/11/chartex" xmlns:cx6="http://schemas.microsoft.com/office/drawing/2016/5/12/chartex" xmlns:cx7="http://schemas.microsoft.com/office/drawing/2016/5/13/chartex" xmlns:cx8="http://schemas.microsoft.com/office/drawing/2016/5/14/chartex" xmlns:mc="http://schemas.openxmlformats.org/markup-compatibility/2006" xmlns:aink="http://schemas.microsoft.com/office/drawing/2016/ink" xmlns:am3d="http://schemas.microsoft.com/office/drawing/2017/model3d" xmlns:o="urn:schemas-microsoft-com:office:office" xmlns:oel="http://schemas.microsoft.com/office/2019/extlst" xmlns:r="http://schemas.openxmlformats.org/officeDocument/2006/relationships" xmlns:m="http://schemas.openxmlformats.org/officeDocument/2006/math" xmlns:v="urn:schemas-microsoft-com:vml" xmlns:wp14="http://schemas.microsoft.com/office/word/2010/wordprocessingDrawing" xmlns:wp="http://schemas.openxmlformats.org/drawingml/2006/wordprocessingDrawing" xmlns:w10="urn:schemas-microsoft-com:office:word" xmlns:w="http://schemas.openxmlformats.org/wordprocessingml/2006/main" xmlns:w14="http://schemas.microsoft.com/office/word/2010/wordml" xmlns:w15="http://schemas.microsoft.com/office/word/2012/wordml" xmlns:w16cex="http://schemas.microsoft.com/office/word/2018/wordml/cex" xmlns:w16cid="http://schemas.microsoft.com/office/word/2016/wordml/cid" xmlns:w16="http://schemas.microsoft.com/office/word/2018/wordml" xmlns:w16du="http://schemas.microsoft.com/office/word/2023/wordml/word16du" xmlns:w16sdtdh="http://schemas.microsoft.com/office/word/2020/wordml/sdtdatahash" xmlns:w16sdtfl="http://schemas.microsoft.com/office/word/2024/wordml/sdtformatlock" xmlns:w16se="http://schemas.microsoft.com/office/word/2015/wordml/symex" xmlns:wpg="http://schemas.microsoft.com/office/word/2010/wordprocessingGroup" xmlns:wpi="http://schemas.microsoft.com/office/word/2010/wordprocessingInk" xmlns:wne="http://schemas.microsoft.com/office/word/2006/wordml" xmlns:wps="http://schemas.microsoft.com/office/word/2010/wordprocessingShape" mc:Ignorable="w14 w15 w16se w16cid w16 w16cex w16sdtdh w16sdtfl w16du wp14">
   <w:endnote w:type="separator" w:id="-1">
     <w:p>
       <w:r>
@@ -23023,7 +23030,7 @@
 </file>
 
 <file path=word/footer1.xml><?xml version="1.0" encoding="utf-8"?>
-<w:ftr xmlns:wpc="http://schemas.microsoft.com/office/word/2010/wordprocessingCanvas" xmlns:cx="http://schemas.microsoft.com/office/drawing/2014/chartex" xmlns:cx1="http://schemas.microsoft.com/office/drawing/2015/9/8/chartex" xmlns:cx2="http://schemas.microsoft.com/office/drawing/2015/10/21/chartex" xmlns:cx3="http://schemas.microsoft.com/office/drawing/2016/5/9/chartex" xmlns:cx4="http://schemas.microsoft.com/office/drawing/2016/5/10/chartex" xmlns:cx5="http://schemas.microsoft.com/office/drawing/2016/5/11/chartex" xmlns:cx6="http://schemas.microsoft.com/office/drawing/2016/5/12/chartex" xmlns:cx7="http://schemas.microsoft.com/office/drawing/2016/5/13/chartex" xmlns:cx8="http://schemas.microsoft.com/office/drawing/2016/5/14/chartex" xmlns:mc="http://schemas.openxmlformats.org/markup-compatibility/2006" xmlns:aink="http://schemas.microsoft.com/office/drawing/2016/ink" xmlns:am3d="http://schemas.microsoft.com/office/drawing/2017/model3d" xmlns:o="urn:schemas-microsoft-com:office:office" xmlns:r="http://schemas.openxmlformats.org/officeDocument/2006/relationships" xmlns:m="http://schemas.openxmlformats.org/officeDocument/2006/math" xmlns:v="urn:schemas-microsoft-com:vml" xmlns:wp14="http://schemas.microsoft.com/office/word/2010/wordprocessingDrawing" xmlns:wp="http://schemas.openxmlformats.org/drawingml/2006/wordprocessingDrawing" xmlns:w10="urn:schemas-microsoft-com:office:word" xmlns:w="http://schemas.openxmlformats.org/wordprocessingml/2006/main" xmlns:w14="http://schemas.microsoft.com/office/word/2010/wordml" xmlns:w15="http://schemas.microsoft.com/office/word/2012/wordml" xmlns:w16cex="http://schemas.microsoft.com/office/word/2018/wordml/cex" xmlns:w16cid="http://schemas.microsoft.com/office/word/2016/wordml/cid" xmlns:w16="http://schemas.microsoft.com/office/word/2018/wordml" xmlns:w16sdtdh="http://schemas.microsoft.com/office/word/2020/wordml/sdtdatahash" xmlns:w16se="http://schemas.microsoft.com/office/word/2015/wordml/symex" xmlns:wpg="http://schemas.microsoft.com/office/word/2010/wordprocessingGroup" xmlns:wpi="http://schemas.microsoft.com/office/word/2010/wordprocessingInk" xmlns:wne="http://schemas.microsoft.com/office/word/2006/wordml" xmlns:wps="http://schemas.microsoft.com/office/word/2010/wordprocessingShape" mc:Ignorable="w14 w15 w16se w16cid w16 w16cex w16sdtdh wp14">
+<w:ftr xmlns:wpc="http://schemas.microsoft.com/office/word/2010/wordprocessingCanvas" xmlns:cx="http://schemas.microsoft.com/office/drawing/2014/chartex" xmlns:cx1="http://schemas.microsoft.com/office/drawing/2015/9/8/chartex" xmlns:cx2="http://schemas.microsoft.com/office/drawing/2015/10/21/chartex" xmlns:cx3="http://schemas.microsoft.com/office/drawing/2016/5/9/chartex" xmlns:cx4="http://schemas.microsoft.com/office/drawing/2016/5/10/chartex" xmlns:cx5="http://schemas.microsoft.com/office/drawing/2016/5/11/chartex" xmlns:cx6="http://schemas.microsoft.com/office/drawing/2016/5/12/chartex" xmlns:cx7="http://schemas.microsoft.com/office/drawing/2016/5/13/chartex" xmlns:cx8="http://schemas.microsoft.com/office/drawing/2016/5/14/chartex" xmlns:mc="http://schemas.openxmlformats.org/markup-compatibility/2006" xmlns:aink="http://schemas.microsoft.com/office/drawing/2016/ink" xmlns:am3d="http://schemas.microsoft.com/office/drawing/2017/model3d" xmlns:o="urn:schemas-microsoft-com:office:office" xmlns:oel="http://schemas.microsoft.com/office/2019/extlst" xmlns:r="http://schemas.openxmlformats.org/officeDocument/2006/relationships" xmlns:m="http://schemas.openxmlformats.org/officeDocument/2006/math" xmlns:v="urn:schemas-microsoft-com:vml" xmlns:wp14="http://schemas.microsoft.com/office/word/2010/wordprocessingDrawing" xmlns:wp="http://schemas.openxmlformats.org/drawingml/2006/wordprocessingDrawing" xmlns:w10="urn:schemas-microsoft-com:office:word" xmlns:w="http://schemas.openxmlformats.org/wordprocessingml/2006/main" xmlns:w14="http://schemas.microsoft.com/office/word/2010/wordml" xmlns:w15="http://schemas.microsoft.com/office/word/2012/wordml" xmlns:w16cex="http://schemas.microsoft.com/office/word/2018/wordml/cex" xmlns:w16cid="http://schemas.microsoft.com/office/word/2016/wordml/cid" xmlns:w16="http://schemas.microsoft.com/office/word/2018/wordml" xmlns:w16du="http://schemas.microsoft.com/office/word/2023/wordml/word16du" xmlns:w16sdtdh="http://schemas.microsoft.com/office/word/2020/wordml/sdtdatahash" xmlns:w16sdtfl="http://schemas.microsoft.com/office/word/2024/wordml/sdtformatlock" xmlns:w16se="http://schemas.microsoft.com/office/word/2015/wordml/symex" xmlns:wpg="http://schemas.microsoft.com/office/word/2010/wordprocessingGroup" xmlns:wpi="http://schemas.microsoft.com/office/word/2010/wordprocessingInk" xmlns:wne="http://schemas.microsoft.com/office/word/2006/wordml" xmlns:wps="http://schemas.microsoft.com/office/word/2010/wordprocessingShape" mc:Ignorable="w14 w15 w16se w16cid w16 w16cex w16sdtdh w16sdtfl w16du wp14">
   <w:p>
     <w:pPr>
       <w:pStyle w:val="Footer"/>
@@ -23058,7 +23065,7 @@
 </file>
 
 <file path=word/footnotes.xml><?xml version="1.0" encoding="utf-8"?>
-<w:footnotes xmlns:wpc="http://schemas.microsoft.com/office/word/2010/wordprocessingCanvas" xmlns:cx="http://schemas.microsoft.com/office/drawing/2014/chartex" xmlns:cx1="http://schemas.microsoft.com/office/drawing/2015/9/8/chartex" xmlns:cx2="http://schemas.microsoft.com/office/drawing/2015/10/21/chartex" xmlns:cx3="http://schemas.microsoft.com/office/drawing/2016/5/9/chartex" xmlns:cx4="http://schemas.microsoft.com/office/drawing/2016/5/10/chartex" xmlns:cx5="http://schemas.microsoft.com/office/drawing/2016/5/11/chartex" xmlns:cx6="http://schemas.microsoft.com/office/drawing/2016/5/12/chartex" xmlns:cx7="http://schemas.microsoft.com/office/drawing/2016/5/13/chartex" xmlns:cx8="http://schemas.microsoft.com/office/drawing/2016/5/14/chartex" xmlns:mc="http://schemas.openxmlformats.org/markup-compatibility/2006" xmlns:aink="http://schemas.microsoft.com/office/drawing/2016/ink" xmlns:am3d="http://schemas.microsoft.com/office/drawing/2017/model3d" xmlns:o="urn:schemas-microsoft-com:office:office" xmlns:r="http://schemas.openxmlformats.org/officeDocument/2006/relationships" xmlns:m="http://schemas.openxmlformats.org/officeDocument/2006/math" xmlns:v="urn:schemas-microsoft-com:vml" xmlns:wp14="http://schemas.microsoft.com/office/word/2010/wordprocessingDrawing" xmlns:wp="http://schemas.openxmlformats.org/drawingml/2006/wordprocessingDrawing" xmlns:w10="urn:schemas-microsoft-com:office:word" xmlns:w="http://schemas.openxmlformats.org/wordprocessingml/2006/main" xmlns:w14="http://schemas.microsoft.com/office/word/2010/wordml" xmlns:w15="http://schemas.microsoft.com/office/word/2012/wordml" xmlns:w16cex="http://schemas.microsoft.com/office/word/2018/wordml/cex" xmlns:w16cid="http://schemas.microsoft.com/office/word/2016/wordml/cid" xmlns:w16="http://schemas.microsoft.com/office/word/2018/wordml" xmlns:w16sdtdh="http://schemas.microsoft.com/office/word/2020/wordml/sdtdatahash" xmlns:w16se="http://schemas.microsoft.com/office/word/2015/wordml/symex" xmlns:wpg="http://schemas.microsoft.com/office/word/2010/wordprocessingGroup" xmlns:wpi="http://schemas.microsoft.com/office/word/2010/wordprocessingInk" xmlns:wne="http://schemas.microsoft.com/office/word/2006/wordml" xmlns:wps="http://schemas.microsoft.com/office/word/2010/wordprocessingShape" mc:Ignorable="w14 w15 w16se w16cid w16 w16cex w16sdtdh wp14">
+<w:footnotes xmlns:wpc="http://schemas.microsoft.com/office/word/2010/wordprocessingCanvas" xmlns:cx="http://schemas.microsoft.com/office/drawing/2014/chartex" xmlns:cx1="http://schemas.microsoft.com/office/drawing/2015/9/8/chartex" xmlns:cx2="http://schemas.microsoft.com/office/drawing/2015/10/21/chartex" xmlns:cx3="http://schemas.microsoft.com/office/drawing/2016/5/9/chartex" xmlns:cx4="http://schemas.microsoft.com/office/drawing/2016/5/10/chartex" xmlns:cx5="http://schemas.microsoft.com/office/drawing/2016/5/11/chartex" xmlns:cx6="http://schemas.microsoft.com/office/drawing/2016/5/12/chartex" xmlns:cx7="http://schemas.microsoft.com/office/drawing/2016/5/13/chartex" xmlns:cx8="http://schemas.microsoft.com/office/drawing/2016/5/14/chartex" xmlns:mc="http://schemas.openxmlformats.org/markup-compatibility/2006" xmlns:aink="http://schemas.microsoft.com/office/drawing/2016/ink" xmlns:am3d="http://schemas.microsoft.com/office/drawing/2017/model3d" xmlns:o="urn:schemas-microsoft-com:office:office" xmlns:oel="http://schemas.microsoft.com/office/2019/extlst" xmlns:r="http://schemas.openxmlformats.org/officeDocument/2006/relationships" xmlns:m="http://schemas.openxmlformats.org/officeDocument/2006/math" xmlns:v="urn:schemas-microsoft-com:vml" xmlns:wp14="http://schemas.microsoft.com/office/word/2010/wordprocessingDrawing" xmlns:wp="http://schemas.openxmlformats.org/drawingml/2006/wordprocessingDrawing" xmlns:w10="urn:schemas-microsoft-com:office:word" xmlns:w="http://schemas.openxmlformats.org/wordprocessingml/2006/main" xmlns:w14="http://schemas.microsoft.com/office/word/2010/wordml" xmlns:w15="http://schemas.microsoft.com/office/word/2012/wordml" xmlns:w16cex="http://schemas.microsoft.com/office/word/2018/wordml/cex" xmlns:w16cid="http://schemas.microsoft.com/office/word/2016/wordml/cid" xmlns:w16="http://schemas.microsoft.com/office/word/2018/wordml" xmlns:w16du="http://schemas.microsoft.com/office/word/2023/wordml/word16du" xmlns:w16sdtdh="http://schemas.microsoft.com/office/word/2020/wordml/sdtdatahash" xmlns:w16sdtfl="http://schemas.microsoft.com/office/word/2024/wordml/sdtformatlock" xmlns:w16se="http://schemas.microsoft.com/office/word/2015/wordml/symex" xmlns:wpg="http://schemas.microsoft.com/office/word/2010/wordprocessingGroup" xmlns:wpi="http://schemas.microsoft.com/office/word/2010/wordprocessingInk" xmlns:wne="http://schemas.microsoft.com/office/word/2006/wordml" xmlns:wps="http://schemas.microsoft.com/office/word/2010/wordprocessingShape" mc:Ignorable="w14 w15 w16se w16cid w16 w16cex w16sdtdh w16sdtfl w16du wp14">
   <w:footnote w:type="separator" w:id="-1">
     <w:p>
       <w:r>
@@ -23077,7 +23084,7 @@
 </file>
 
 <file path=word/header1.xml><?xml version="1.0" encoding="utf-8"?>
-<w:hdr xmlns:wpc="http://schemas.microsoft.com/office/word/2010/wordprocessingCanvas" xmlns:cx="http://schemas.microsoft.com/office/drawing/2014/chartex" xmlns:cx1="http://schemas.microsoft.com/office/drawing/2015/9/8/chartex" xmlns:cx2="http://schemas.microsoft.com/office/drawing/2015/10/21/chartex" xmlns:cx3="http://schemas.microsoft.com/office/drawing/2016/5/9/chartex" xmlns:cx4="http://schemas.microsoft.com/office/drawing/2016/5/10/chartex" xmlns:cx5="http://schemas.microsoft.com/office/drawing/2016/5/11/chartex" xmlns:cx6="http://schemas.microsoft.com/office/drawing/2016/5/12/chartex" xmlns:cx7="http://schemas.microsoft.com/office/drawing/2016/5/13/chartex" xmlns:cx8="http://schemas.microsoft.com/office/drawing/2016/5/14/chartex" xmlns:mc="http://schemas.openxmlformats.org/markup-compatibility/2006" xmlns:aink="http://schemas.microsoft.com/office/drawing/2016/ink" xmlns:am3d="http://schemas.microsoft.com/office/drawing/2017/model3d" xmlns:o="urn:schemas-microsoft-com:office:office" xmlns:r="http://schemas.openxmlformats.org/officeDocument/2006/relationships" xmlns:m="http://schemas.openxmlformats.org/officeDocument/2006/math" xmlns:v="urn:schemas-microsoft-com:vml" xmlns:wp14="http://schemas.microsoft.com/office/word/2010/wordprocessingDrawing" xmlns:wp="http://schemas.openxmlformats.org/drawingml/2006/wordprocessingDrawing" xmlns:w10="urn:schemas-microsoft-com:office:word" xmlns:w="http://schemas.openxmlformats.org/wordprocessingml/2006/main" xmlns:w14="http://schemas.microsoft.com/office/word/2010/wordml" xmlns:w15="http://schemas.microsoft.com/office/word/2012/wordml" xmlns:w16cex="http://schemas.microsoft.com/office/word/2018/wordml/cex" xmlns:w16cid="http://schemas.microsoft.com/office/word/2016/wordml/cid" xmlns:w16="http://schemas.microsoft.com/office/word/2018/wordml" xmlns:w16sdtdh="http://schemas.microsoft.com/office/word/2020/wordml/sdtdatahash" xmlns:w16se="http://schemas.microsoft.com/office/word/2015/wordml/symex" xmlns:wpg="http://schemas.microsoft.com/office/word/2010/wordprocessingGroup" xmlns:wpi="http://schemas.microsoft.com/office/word/2010/wordprocessingInk" xmlns:wne="http://schemas.microsoft.com/office/word/2006/wordml" xmlns:wps="http://schemas.microsoft.com/office/word/2010/wordprocessingShape" mc:Ignorable="w14 w15 w16se w16cid w16 w16cex w16sdtdh wp14">
+<w:hdr xmlns:wpc="http://schemas.microsoft.com/office/word/2010/wordprocessingCanvas" xmlns:cx="http://schemas.microsoft.com/office/drawing/2014/chartex" xmlns:cx1="http://schemas.microsoft.com/office/drawing/2015/9/8/chartex" xmlns:cx2="http://schemas.microsoft.com/office/drawing/2015/10/21/chartex" xmlns:cx3="http://schemas.microsoft.com/office/drawing/2016/5/9/chartex" xmlns:cx4="http://schemas.microsoft.com/office/drawing/2016/5/10/chartex" xmlns:cx5="http://schemas.microsoft.com/office/drawing/2016/5/11/chartex" xmlns:cx6="http://schemas.microsoft.com/office/drawing/2016/5/12/chartex" xmlns:cx7="http://schemas.microsoft.com/office/drawing/2016/5/13/chartex" xmlns:cx8="http://schemas.microsoft.com/office/drawing/2016/5/14/chartex" xmlns:mc="http://schemas.openxmlformats.org/markup-compatibility/2006" xmlns:aink="http://schemas.microsoft.com/office/drawing/2016/ink" xmlns:am3d="http://schemas.microsoft.com/office/drawing/2017/model3d" xmlns:o="urn:schemas-microsoft-com:office:office" xmlns:oel="http://schemas.microsoft.com/office/2019/extlst" xmlns:r="http://schemas.openxmlformats.org/officeDocument/2006/relationships" xmlns:m="http://schemas.openxmlformats.org/officeDocument/2006/math" xmlns:v="urn:schemas-microsoft-com:vml" xmlns:wp14="http://schemas.microsoft.com/office/word/2010/wordprocessingDrawing" xmlns:wp="http://schemas.openxmlformats.org/drawingml/2006/wordprocessingDrawing" xmlns:w10="urn:schemas-microsoft-com:office:word" xmlns:w="http://schemas.openxmlformats.org/wordprocessingml/2006/main" xmlns:w14="http://schemas.microsoft.com/office/word/2010/wordml" xmlns:w15="http://schemas.microsoft.com/office/word/2012/wordml" xmlns:w16cex="http://schemas.microsoft.com/office/word/2018/wordml/cex" xmlns:w16cid="http://schemas.microsoft.com/office/word/2016/wordml/cid" xmlns:w16="http://schemas.microsoft.com/office/word/2018/wordml" xmlns:w16du="http://schemas.microsoft.com/office/word/2023/wordml/word16du" xmlns:w16sdtdh="http://schemas.microsoft.com/office/word/2020/wordml/sdtdatahash" xmlns:w16sdtfl="http://schemas.microsoft.com/office/word/2024/wordml/sdtformatlock" xmlns:w16se="http://schemas.microsoft.com/office/word/2015/wordml/symex" xmlns:wpg="http://schemas.microsoft.com/office/word/2010/wordprocessingGroup" xmlns:wpi="http://schemas.microsoft.com/office/word/2010/wordprocessingInk" xmlns:wne="http://schemas.microsoft.com/office/word/2006/wordml" xmlns:wps="http://schemas.microsoft.com/office/word/2010/wordprocessingShape" mc:Ignorable="w14 w15 w16se w16cid w16 w16cex w16sdtdh w16sdtfl w16du wp14">
   <w:p>
     <w:pPr>
       <w:pStyle w:val="Header"/>
@@ -23151,7 +23158,7 @@
 </file>
 
 <file path=word/numbering.xml><?xml version="1.0" encoding="utf-8"?>
-<w:numbering xmlns:wpc="http://schemas.microsoft.com/office/word/2010/wordprocessingCanvas" xmlns:cx="http://schemas.microsoft.com/office/drawing/2014/chartex" xmlns:cx1="http://schemas.microsoft.com/office/drawing/2015/9/8/chartex" xmlns:cx2="http://schemas.microsoft.com/office/drawing/2015/10/21/chartex" xmlns:cx3="http://schemas.microsoft.com/office/drawing/2016/5/9/chartex" xmlns:cx4="http://schemas.microsoft.com/office/drawing/2016/5/10/chartex" xmlns:cx5="http://schemas.microsoft.com/office/drawing/2016/5/11/chartex" xmlns:cx6="http://schemas.microsoft.com/office/drawing/2016/5/12/chartex" xmlns:cx7="http://schemas.microsoft.com/office/drawing/2016/5/13/chartex" xmlns:cx8="http://schemas.microsoft.com/office/drawing/2016/5/14/chartex" xmlns:mc="http://schemas.openxmlformats.org/markup-compatibility/2006" xmlns:aink="http://schemas.microsoft.com/office/drawing/2016/ink" xmlns:am3d="http://schemas.microsoft.com/office/drawing/2017/model3d" xmlns:o="urn:schemas-microsoft-com:office:office" xmlns:r="http://schemas.openxmlformats.org/officeDocument/2006/relationships" xmlns:m="http://schemas.openxmlformats.org/officeDocument/2006/math" xmlns:v="urn:schemas-microsoft-com:vml" xmlns:wp14="http://schemas.microsoft.com/office/word/2010/wordprocessingDrawing" xmlns:wp="http://schemas.openxmlformats.org/drawingml/2006/wordprocessingDrawing" xmlns:w10="urn:schemas-microsoft-com:office:word" xmlns:w="http://schemas.openxmlformats.org/wordprocessingml/2006/main" xmlns:w14="http://schemas.microsoft.com/office/word/2010/wordml" xmlns:w15="http://schemas.microsoft.com/office/word/2012/wordml" xmlns:w16cex="http://schemas.microsoft.com/office/word/2018/wordml/cex" xmlns:w16cid="http://schemas.microsoft.com/office/word/2016/wordml/cid" xmlns:w16="http://schemas.microsoft.com/office/word/2018/wordml" xmlns:w16sdtdh="http://schemas.microsoft.com/office/word/2020/wordml/sdtdatahash" xmlns:w16se="http://schemas.microsoft.com/office/word/2015/wordml/symex" xmlns:wpg="http://schemas.microsoft.com/office/word/2010/wordprocessingGroup" xmlns:wpi="http://schemas.microsoft.com/office/word/2010/wordprocessingInk" xmlns:wne="http://schemas.microsoft.com/office/word/2006/wordml" xmlns:wps="http://schemas.microsoft.com/office/word/2010/wordprocessingShape" mc:Ignorable="w14 w15 w16se w16cid w16 w16cex w16sdtdh wp14">
+<w:numbering xmlns:wpc="http://schemas.microsoft.com/office/word/2010/wordprocessingCanvas" xmlns:cx="http://schemas.microsoft.com/office/drawing/2014/chartex" xmlns:cx1="http://schemas.microsoft.com/office/drawing/2015/9/8/chartex" xmlns:cx2="http://schemas.microsoft.com/office/drawing/2015/10/21/chartex" xmlns:cx3="http://schemas.microsoft.com/office/drawing/2016/5/9/chartex" xmlns:cx4="http://schemas.microsoft.com/office/drawing/2016/5/10/chartex" xmlns:cx5="http://schemas.microsoft.com/office/drawing/2016/5/11/chartex" xmlns:cx6="http://schemas.microsoft.com/office/drawing/2016/5/12/chartex" xmlns:cx7="http://schemas.microsoft.com/office/drawing/2016/5/13/chartex" xmlns:cx8="http://schemas.microsoft.com/office/drawing/2016/5/14/chartex" xmlns:mc="http://schemas.openxmlformats.org/markup-compatibility/2006" xmlns:aink="http://schemas.microsoft.com/office/drawing/2016/ink" xmlns:am3d="http://schemas.microsoft.com/office/drawing/2017/model3d" xmlns:o="urn:schemas-microsoft-com:office:office" xmlns:oel="http://schemas.microsoft.com/office/2019/extlst" xmlns:r="http://schemas.openxmlformats.org/officeDocument/2006/relationships" xmlns:m="http://schemas.openxmlformats.org/officeDocument/2006/math" xmlns:v="urn:schemas-microsoft-com:vml" xmlns:wp14="http://schemas.microsoft.com/office/word/2010/wordprocessingDrawing" xmlns:wp="http://schemas.openxmlformats.org/drawingml/2006/wordprocessingDrawing" xmlns:w10="urn:schemas-microsoft-com:office:word" xmlns:w="http://schemas.openxmlformats.org/wordprocessingml/2006/main" xmlns:w14="http://schemas.microsoft.com/office/word/2010/wordml" xmlns:w15="http://schemas.microsoft.com/office/word/2012/wordml" xmlns:w16cex="http://schemas.microsoft.com/office/word/2018/wordml/cex" xmlns:w16cid="http://schemas.microsoft.com/office/word/2016/wordml/cid" xmlns:w16="http://schemas.microsoft.com/office/word/2018/wordml" xmlns:w16du="http://schemas.microsoft.com/office/word/2023/wordml/word16du" xmlns:w16sdtdh="http://schemas.microsoft.com/office/word/2020/wordml/sdtdatahash" xmlns:w16sdtfl="http://schemas.microsoft.com/office/word/2024/wordml/sdtformatlock" xmlns:w16se="http://schemas.microsoft.com/office/word/2015/wordml/symex" xmlns:wpg="http://schemas.microsoft.com/office/word/2010/wordprocessingGroup" xmlns:wpi="http://schemas.microsoft.com/office/word/2010/wordprocessingInk" xmlns:wne="http://schemas.microsoft.com/office/word/2006/wordml" xmlns:wps="http://schemas.microsoft.com/office/word/2010/wordprocessingShape" mc:Ignorable="w14 w15 w16se w16cid w16 w16cex w16sdtdh w16sdtfl w16du wp14">
   <w:abstractNum w:abstractNumId="0" w15:restartNumberingAfterBreak="0">
     <w:nsid w:val="090830BF"/>
     <w:multiLevelType w:val="multilevel"/>
@@ -23399,23 +23406,23 @@
       </w:pPr>
     </w:lvl>
   </w:abstractNum>
-  <w:num w:numId="1">
+  <w:num w:numId="1" w16cid:durableId="574631635">
     <w:abstractNumId w:val="2"/>
   </w:num>
-  <w:num w:numId="2">
+  <w:num w:numId="2" w16cid:durableId="829520197">
     <w:abstractNumId w:val="0"/>
   </w:num>
-  <w:num w:numId="3">
+  <w:num w:numId="3" w16cid:durableId="2029675556">
     <w:abstractNumId w:val="1"/>
   </w:num>
-  <w:num w:numId="4">
+  <w:num w:numId="4" w16cid:durableId="1511599704">
     <w:abstractNumId w:val="1"/>
   </w:num>
 </w:numbering>
 </file>
 
 <file path=word/styles.xml><?xml version="1.0" encoding="utf-8"?>
-<w:styles xmlns:mc="http://schemas.openxmlformats.org/markup-compatibility/2006" xmlns:r="http://schemas.openxmlformats.org/officeDocument/2006/relationships" xmlns:w="http://schemas.openxmlformats.org/wordprocessingml/2006/main" xmlns:w14="http://schemas.microsoft.com/office/word/2010/wordml" xmlns:w15="http://schemas.microsoft.com/office/word/2012/wordml" xmlns:w16cex="http://schemas.microsoft.com/office/word/2018/wordml/cex" xmlns:w16cid="http://schemas.microsoft.com/office/word/2016/wordml/cid" xmlns:w16="http://schemas.microsoft.com/office/word/2018/wordml" xmlns:w16sdtdh="http://schemas.microsoft.com/office/word/2020/wordml/sdtdatahash" xmlns:w16se="http://schemas.microsoft.com/office/word/2015/wordml/symex" mc:Ignorable="w14 w15 w16se w16cid w16 w16cex w16sdtdh">
+<w:styles xmlns:mc="http://schemas.openxmlformats.org/markup-compatibility/2006" xmlns:r="http://schemas.openxmlformats.org/officeDocument/2006/relationships" xmlns:w="http://schemas.openxmlformats.org/wordprocessingml/2006/main" xmlns:w14="http://schemas.microsoft.com/office/word/2010/wordml" xmlns:w15="http://schemas.microsoft.com/office/word/2012/wordml" xmlns:w16cex="http://schemas.microsoft.com/office/word/2018/wordml/cex" xmlns:w16cid="http://schemas.microsoft.com/office/word/2016/wordml/cid" xmlns:w16="http://schemas.microsoft.com/office/word/2018/wordml" xmlns:w16du="http://schemas.microsoft.com/office/word/2023/wordml/word16du" xmlns:w16sdtdh="http://schemas.microsoft.com/office/word/2020/wordml/sdtdatahash" xmlns:w16sdtfl="http://schemas.microsoft.com/office/word/2024/wordml/sdtformatlock" xmlns:w16se="http://schemas.microsoft.com/office/word/2015/wordml/symex" mc:Ignorable="w14 w15 w16se w16cid w16 w16cex w16sdtdh w16sdtfl w16du">
   <w:docDefaults>
     <w:rPrDefault>
       <w:rPr>
@@ -24040,6 +24047,7 @@
   <w:style w:type="character" w:default="1" w:styleId="DefaultParagraphFont">
     <w:name w:val="Default Paragraph Font"/>
     <w:uiPriority w:val="1"/>
+    <w:semiHidden/>
     <w:unhideWhenUsed/>
   </w:style>
   <w:style w:type="table" w:default="1" w:styleId="TableNormal">
@@ -25312,9 +25320,9 @@
 </file>
 
 <file path=customXml/item1.xml><?xml version="1.0" encoding="utf-8"?>
-<p:properties xmlns:p="http://schemas.microsoft.com/office/2006/metadata/properties" xmlns:xsi="http://www.w3.org/2001/XMLSchema-instance" xmlns:pc="http://schemas.microsoft.com/office/infopath/2007/PartnerControls">
-  <documentManagement/>
-</p:properties>
+<ControlsStorage xmlns="urn:schemas-microsoft-com.VSTO2008Demos.ControlsStorage">
+  <Controls>AAEAAAD/////AQAAAAAAAAAMAgAAAEVDaGVtNFdvcmQuQ29yZSwgVmVyc2lvbj0xLjAuMC4wLCBDdWx0dXJlPW5ldXRyYWwsIFB1YmxpY0tleVRva2VuPW51bGwHAQAAAAABAAAAAAAAAAQgQ2hlbTRXb3JkLkNvcmUuQ29udHJvbFByb3BlcnRpZXMCAAAACw==</Controls>
+</ControlsStorage>
 </file>
 
 <file path=customXml/item2.xml><?xml version="1.0" encoding="utf-8"?>
@@ -25535,12 +25543,16 @@
 </file>
 
 <file path=customXml/item3.xml><?xml version="1.0" encoding="utf-8"?>
-<ControlsStorage xmlns="urn:schemas-microsoft-com.VSTO2008Demos.ControlsStorage">
-  <Controls>AAEAAAD/////AQAAAAAAAAAMAgAAAEVDaGVtNFdvcmQuQ29yZSwgVmVyc2lvbj0xLjAuMC4wLCBDdWx0dXJlPW5ldXRyYWwsIFB1YmxpY0tleVRva2VuPW51bGwHAQAAAAABAAAAAAAAAAQgQ2hlbTRXb3JkLkNvcmUuQ29udHJvbFByb3BlcnRpZXMCAAAACw==</Controls>
-</ControlsStorage>
+<p:properties xmlns:p="http://schemas.microsoft.com/office/2006/metadata/properties" xmlns:xsi="http://www.w3.org/2001/XMLSchema-instance" xmlns:pc="http://schemas.microsoft.com/office/infopath/2007/PartnerControls">
+  <documentManagement/>
+</p:properties>
 </file>
 
 <file path=customXml/item4.xml><?xml version="1.0" encoding="utf-8"?>
+<b:Sources xmlns:b="http://schemas.openxmlformats.org/officeDocument/2006/bibliography" xmlns="http://schemas.openxmlformats.org/officeDocument/2006/bibliography" SelectedStyle="\APASixthEditionOfficeOnline.xsl" StyleName="APA" Version="6"/>
+</file>
+
+<file path=customXml/item5.xml><?xml version="1.0" encoding="utf-8"?>
 <?mso-contentType ?>
 <FormTemplates xmlns="http://schemas.microsoft.com/sharepoint/v3/contenttype/forms">
   <Display>DocumentLibraryForm</Display>
@@ -25549,15 +25561,10 @@
 </FormTemplates>
 </file>
 
-<file path=customXml/item5.xml><?xml version="1.0" encoding="utf-8"?>
-<b:Sources xmlns:b="http://schemas.openxmlformats.org/officeDocument/2006/bibliography" xmlns="http://schemas.openxmlformats.org/officeDocument/2006/bibliography" SelectedStyle="\APASixthEditionOfficeOnline.xsl" StyleName="APA" Version="6"/>
-</file>
-
 <file path=customXml/itemProps1.xml><?xml version="1.0" encoding="utf-8"?>
-<ds:datastoreItem xmlns:ds="http://schemas.openxmlformats.org/officeDocument/2006/customXml" ds:itemID="{96D19C85-73BE-4F5D-979F-58BFDE5BBE12}">
+<ds:datastoreItem xmlns:ds="http://schemas.openxmlformats.org/officeDocument/2006/customXml" ds:itemID="{E3F19EBF-8207-4BE7-AD18-240ED1895C11}">
   <ds:schemaRefs>
-    <ds:schemaRef ds:uri="http://schemas.microsoft.com/office/2006/metadata/properties"/>
-    <ds:schemaRef ds:uri="http://schemas.microsoft.com/office/infopath/2007/PartnerControls"/>
+    <ds:schemaRef ds:uri="urn:schemas-microsoft-com.VSTO2008Demos.ControlsStorage"/>
   </ds:schemaRefs>
 </ds:datastoreItem>
 </file>
@@ -25582,25 +25589,26 @@
 </file>
 
 <file path=customXml/itemProps3.xml><?xml version="1.0" encoding="utf-8"?>
-<ds:datastoreItem xmlns:ds="http://schemas.openxmlformats.org/officeDocument/2006/customXml" ds:itemID="{E3F19EBF-8207-4BE7-AD18-240ED1895C11}">
+<ds:datastoreItem xmlns:ds="http://schemas.openxmlformats.org/officeDocument/2006/customXml" ds:itemID="{96D19C85-73BE-4F5D-979F-58BFDE5BBE12}">
   <ds:schemaRefs>
-    <ds:schemaRef ds:uri="urn:schemas-microsoft-com.VSTO2008Demos.ControlsStorage"/>
+    <ds:schemaRef ds:uri="http://schemas.microsoft.com/office/2006/metadata/properties"/>
+    <ds:schemaRef ds:uri="http://schemas.microsoft.com/office/infopath/2007/PartnerControls"/>
   </ds:schemaRefs>
 </ds:datastoreItem>
 </file>
 
 <file path=customXml/itemProps4.xml><?xml version="1.0" encoding="utf-8"?>
+<ds:datastoreItem xmlns:ds="http://schemas.openxmlformats.org/officeDocument/2006/customXml" ds:itemID="{DE724972-9DFC-40BC-BA35-EDB291A5A412}">
+  <ds:schemaRefs>
+    <ds:schemaRef ds:uri="http://schemas.openxmlformats.org/officeDocument/2006/bibliography"/>
+  </ds:schemaRefs>
+</ds:datastoreItem>
+</file>
+
+<file path=customXml/itemProps5.xml><?xml version="1.0" encoding="utf-8"?>
 <ds:datastoreItem xmlns:ds="http://schemas.openxmlformats.org/officeDocument/2006/customXml" ds:itemID="{75886F76-A765-4714-B899-7AC2DC4334A1}">
   <ds:schemaRefs>
     <ds:schemaRef ds:uri="http://schemas.microsoft.com/sharepoint/v3/contenttype/forms"/>
   </ds:schemaRefs>
 </ds:datastoreItem>
-</file>
-
-<file path=customXml/itemProps5.xml><?xml version="1.0" encoding="utf-8"?>
-<ds:datastoreItem xmlns:ds="http://schemas.openxmlformats.org/officeDocument/2006/customXml" ds:itemID="{DE724972-9DFC-40BC-BA35-EDB291A5A412}">
-  <ds:schemaRefs>
-    <ds:schemaRef ds:uri="http://schemas.openxmlformats.org/officeDocument/2006/bibliography"/>
-  </ds:schemaRefs>
-</ds:datastoreItem>
 </file>
</xml_diff>

<commit_message>
Manuscript: state mass-basis k_ORR, O2 mass balance, sweep wording, limitation (tracked copy added); SI: add S8/Table S13; response A1.1-A1.5
Co-Authored-By: Claude Sonnet 5.5 <noreply@anthropic.com>
Claude-Session: https://claude.ai/code/session_01Y1g9vByMLTE8eGJ9K81zt6
</commit_message>
<xml_diff>
--- a/Manuscript_AS.docx
+++ b/Manuscript_AS.docx
@@ -8776,7 +8776,7 @@
         <w:rPr>
           <w:rFonts w:cs="Times New Roman"/>
         </w:rPr>
-        <w:t>).</w:t>
+        <w:t>). In the implementation, C_O₂ is stored as a mass concentration (g mm⁻³) while [Zn]sol is molar, and Eqs. 15 and 16 are evaluated without the 1/M_O₂ factor (M_O₂ = 32 g mol⁻¹). The calibrated k_ORR is therefore an effective, mass-basis coefficient (0.51 mm h⁻¹ here, equivalent to 16.3 mm h⁻¹ in the mole-consistent form). With this form, the reaction-limited ceiling at k_ORR = 0.51 mm h⁻¹ is 0.29 mm yr⁻¹, above the simulated rates (Section S8).</w:t>
       </w:r>
     </w:p>
     <w:p>
@@ -9013,7 +9013,7 @@
         <w:t xml:space="preserve"> </w:t>
       </w:r>
       <w:r>
-        <w:t>used in the simulations.</w:t>
+        <w:t>used in the simulations. A global mass balance shows that the O₂ consumed at the interface is about 1/32 of the stoichiometric requirement for the Zn lost at 24 h and about 1/24 at 168 h (Section S8), so Zn recession is not stoichiometrically coupled to O₂ consumption in the present formulation.</w:t>
       </w:r>
       <w:r>
         <w:t xml:space="preserve"> </w:t>
@@ -13095,7 +13095,7 @@
         </m:r>
       </m:oMath>
       <w:r>
-        <w:t>. Each parameter was varied across representative values while the remaining parameters were held constant. The resulting changes in mass loss, corrosion-</w:t>
+        <w:t>. Each parameter was varied by factors of 0.2 and 5 around the baseline values while the remaining parameters were held constant. The resulting changes in mass loss, corrosion-</w:t>
       </w:r>
       <w:r>
         <w:t>product saturation (F/Fₘₐₓ)</w:t>
@@ -21162,7 +21162,7 @@
         <w:t>in vivo</w:t>
       </w:r>
       <w:r>
-        <w:t xml:space="preserve"> mass loss represents a predictive demonstration rather than formal validation. Further validation against spatially resolved measurements of corrosion-product coverage, oxygen availability, and local penetration is therefore required, particularly for complex implant geometries.</w:t>
+        <w:t xml:space="preserve"> mass loss represents a predictive demonstration rather than formal validation. Further validation against spatially resolved measurements of corrosion-product coverage, oxygen availability, and local penetration is therefore required, particularly for complex implant geometries. Because O₂ consumption at the interface is not stoichiometrically coupled to Zn loss, the absolute interfacial O₂ depletion in Figures 4g–i and 5d is underestimated relative to a stoichiometric model, and these panels should be read as relative patterns.</w:t>
       </w:r>
     </w:p>
     <w:p>

</xml_diff>

<commit_message>
Eqs. 15-16: add dimensionless factor phi=32 (tracked copy), Table 2 phi row, SI S8 wording, A1 responses
Co-Authored-By: Claude Sonnet 5.5 <noreply@anthropic.com>
Claude-Session: https://claude.ai/code/session_01Y1g9vByMLTE8eGJ9K81zt6
</commit_message>
<xml_diff>
--- a/Manuscript_AS.docx
+++ b/Manuscript_AS.docx
@@ -7968,6 +7968,12 @@
               </w:rPr>
               <m:t>2 </m:t>
             </m:r>
+            <m:r>
+              <w:rPr>
+                <w:rFonts w:ascii="Cambria Math" w:hAnsi="Cambria Math" w:cs="Times New Roman"/>
+              </w:rPr>
+              <m:t>φ </m:t>
+            </m:r>
             <m:sSub>
               <m:sSubPr>
                 <m:ctrlPr>
@@ -8250,6 +8256,12 @@
               </w:rPr>
               <m:t>2 </m:t>
             </m:r>
+            <m:r>
+              <w:rPr>
+                <w:rFonts w:ascii="Cambria Math" w:hAnsi="Cambria Math" w:cs="Times New Roman"/>
+              </w:rPr>
+              <m:t>φ </m:t>
+            </m:r>
             <m:sSubSup>
               <m:sSubSupPr>
                 <m:ctrlPr>
@@ -8776,7 +8788,7 @@
         <w:rPr>
           <w:rFonts w:cs="Times New Roman"/>
         </w:rPr>
-        <w:t>). In the implementation, C_O₂ is stored as a mass concentration (g mm⁻³) while [Zn]sol is molar, and Eqs. 15 and 16 are evaluated without the 1/M_O₂ factor (M_O₂ = 32 g mol⁻¹). The calibrated k_ORR is therefore an effective, mass-basis coefficient (0.51 mm h⁻¹ here, equivalent to 16.3 mm h⁻¹ in the mole-consistent form). With this form, the reaction-limited ceiling at k_ORR = 0.51 mm h⁻¹ is 0.29 mm yr⁻¹, above the simulated rates (Section S8).</w:t>
+        <w:t>). In Eqs. 15 and 16, C_O₂ is a molar concentration and φ is a dimensionless empirical factor, φ = 32, that reproduces the solver. The solver evaluates the ORR velocity with O₂ stored as a mass concentration and without a molar-mass conversion, so φ equals M_O₂ = 32 g mol⁻¹ numerically; a stoichiometrically consistent formulation has φ = 1. The O₂ sink in Eq. 7 uses k_ORR directly. With k_ORR = 0.51 mm h⁻¹, the reaction-limited ceiling is 0.29 mm yr⁻¹, above the simulated rates (Section S8).</w:t>
       </w:r>
     </w:p>
     <w:p>
@@ -15463,6 +15475,91 @@
                 <w:szCs w:val="22"/>
               </w:rPr>
               <w:t>0.51</w:t>
+            </w:r>
+          </w:p>
+        </w:tc>
+      </w:tr>
+      <w:tr>
+        <w:trPr>
+          <w:cantSplit/>
+        </w:trPr>
+        <w:tc>
+          <w:tcPr>
+            <w:tcW w:w="896" w:type="pct"/>
+          </w:tcPr>
+          <w:p>
+            <w:pPr>
+              <w:pStyle w:val="Compact"/>
+              <w:spacing w:line="240" w:lineRule="auto"/>
+              <w:jc w:val="left"/>
+              <w:rPr>
+                <w:rFonts w:cs="Times New Roman"/>
+                <w:sz w:val="22"/>
+                <w:szCs w:val="22"/>
+              </w:rPr>
+            </w:pPr>
+            <w:r>
+              <w:t>φ</w:t>
+            </w:r>
+          </w:p>
+        </w:tc>
+        <w:tc>
+          <w:tcPr>
+            <w:tcW w:w="1227" w:type="pct"/>
+          </w:tcPr>
+          <w:p>
+            <w:pPr>
+              <w:pStyle w:val="Compact"/>
+              <w:spacing w:line="240" w:lineRule="auto"/>
+              <w:jc w:val="left"/>
+              <w:rPr>
+                <w:rFonts w:cs="Times New Roman"/>
+                <w:sz w:val="22"/>
+                <w:szCs w:val="22"/>
+              </w:rPr>
+            </w:pPr>
+            <w:r>
+              <w:t>–</w:t>
+            </w:r>
+          </w:p>
+        </w:tc>
+        <w:tc>
+          <w:tcPr>
+            <w:tcW w:w="1474" w:type="pct"/>
+          </w:tcPr>
+          <w:p>
+            <w:pPr>
+              <w:pStyle w:val="Compact"/>
+              <w:spacing w:line="240" w:lineRule="auto"/>
+              <w:jc w:val="left"/>
+              <w:rPr>
+                <w:rFonts w:cs="Times New Roman"/>
+                <w:sz w:val="22"/>
+                <w:szCs w:val="22"/>
+              </w:rPr>
+            </w:pPr>
+            <w:r>
+              <w:t>fixed</w:t>
+            </w:r>
+          </w:p>
+        </w:tc>
+        <w:tc>
+          <w:tcPr>
+            <w:tcW w:w="1403" w:type="pct"/>
+          </w:tcPr>
+          <w:p>
+            <w:pPr>
+              <w:pStyle w:val="Compact"/>
+              <w:spacing w:line="240" w:lineRule="auto"/>
+              <w:jc w:val="left"/>
+              <w:rPr>
+                <w:rFonts w:cs="Times New Roman"/>
+                <w:sz w:val="22"/>
+                <w:szCs w:val="22"/>
+              </w:rPr>
+            </w:pPr>
+            <w:r>
+              <w:t>32</w:t>
             </w:r>
           </w:p>
         </w:tc>

</xml_diff>

<commit_message>
Eqs. 15-16: explicit M_O2 factor instead of phi; update Table 2, SI S8, A1 responses
</commit_message>
<xml_diff>
--- a/Manuscript_AS.docx
+++ b/Manuscript_AS.docx
@@ -7968,11 +7968,61 @@
               </w:rPr>
               <m:t>2 </m:t>
             </m:r>
-            <m:r>
-              <w:rPr>
-                <w:rFonts w:ascii="Cambria Math" w:hAnsi="Cambria Math" w:cs="Times New Roman"/>
-              </w:rPr>
-              <m:t>φ </m:t>
+            <m:sSub>
+              <m:sSubPr>
+                <m:ctrlPr>
+                  <w:rPr>
+                    <w:rFonts w:ascii="Cambria Math" w:hAnsi="Cambria Math" w:cs="Times New Roman"/>
+                  </w:rPr>
+                </m:ctrlPr>
+              </m:sSubPr>
+              <m:e>
+                <m:r>
+                  <w:rPr>
+                    <w:rFonts w:ascii="Cambria Math" w:hAnsi="Cambria Math" w:cs="Times New Roman"/>
+                  </w:rPr>
+                  <m:t>M</m:t>
+                </m:r>
+              </m:e>
+              <m:sub>
+                <m:sSub>
+                  <m:sSubPr>
+                    <m:ctrlPr>
+                      <w:rPr>
+                        <w:rFonts w:ascii="Cambria Math" w:hAnsi="Cambria Math" w:cs="Times New Roman"/>
+                      </w:rPr>
+                    </m:ctrlPr>
+                  </m:sSubPr>
+                  <m:e>
+                    <m:r>
+                      <m:rPr>
+                        <m:sty m:val="p"/>
+                      </m:rPr>
+                      <w:rPr>
+                        <w:rFonts w:ascii="Cambria Math" w:hAnsi="Cambria Math" w:cs="Times New Roman"/>
+                      </w:rPr>
+                      <m:t>O</m:t>
+                    </m:r>
+                  </m:e>
+                  <m:sub>
+                    <m:r>
+                      <m:rPr>
+                        <m:sty m:val="p"/>
+                      </m:rPr>
+                      <w:rPr>
+                        <w:rFonts w:ascii="Cambria Math" w:hAnsi="Cambria Math" w:cs="Times New Roman"/>
+                      </w:rPr>
+                      <m:t>2</m:t>
+                    </m:r>
+                  </m:sub>
+                </m:sSub>
+              </m:sub>
+            </m:sSub>
+            <m:r>
+              <w:rPr>
+                <w:rFonts w:ascii="Cambria Math" w:hAnsi="Cambria Math" w:cs="Times New Roman"/>
+              </w:rPr>
+              <m:t> </m:t>
             </m:r>
             <m:sSub>
               <m:sSubPr>
@@ -8256,11 +8306,61 @@
               </w:rPr>
               <m:t>2 </m:t>
             </m:r>
-            <m:r>
-              <w:rPr>
-                <w:rFonts w:ascii="Cambria Math" w:hAnsi="Cambria Math" w:cs="Times New Roman"/>
-              </w:rPr>
-              <m:t>φ </m:t>
+            <m:sSub>
+              <m:sSubPr>
+                <m:ctrlPr>
+                  <w:rPr>
+                    <w:rFonts w:ascii="Cambria Math" w:hAnsi="Cambria Math" w:cs="Times New Roman"/>
+                  </w:rPr>
+                </m:ctrlPr>
+              </m:sSubPr>
+              <m:e>
+                <m:r>
+                  <w:rPr>
+                    <w:rFonts w:ascii="Cambria Math" w:hAnsi="Cambria Math" w:cs="Times New Roman"/>
+                  </w:rPr>
+                  <m:t>M</m:t>
+                </m:r>
+              </m:e>
+              <m:sub>
+                <m:sSub>
+                  <m:sSubPr>
+                    <m:ctrlPr>
+                      <w:rPr>
+                        <w:rFonts w:ascii="Cambria Math" w:hAnsi="Cambria Math" w:cs="Times New Roman"/>
+                      </w:rPr>
+                    </m:ctrlPr>
+                  </m:sSubPr>
+                  <m:e>
+                    <m:r>
+                      <m:rPr>
+                        <m:sty m:val="p"/>
+                      </m:rPr>
+                      <w:rPr>
+                        <w:rFonts w:ascii="Cambria Math" w:hAnsi="Cambria Math" w:cs="Times New Roman"/>
+                      </w:rPr>
+                      <m:t>O</m:t>
+                    </m:r>
+                  </m:e>
+                  <m:sub>
+                    <m:r>
+                      <m:rPr>
+                        <m:sty m:val="p"/>
+                      </m:rPr>
+                      <w:rPr>
+                        <w:rFonts w:ascii="Cambria Math" w:hAnsi="Cambria Math" w:cs="Times New Roman"/>
+                      </w:rPr>
+                      <m:t>2</m:t>
+                    </m:r>
+                  </m:sub>
+                </m:sSub>
+              </m:sub>
+            </m:sSub>
+            <m:r>
+              <w:rPr>
+                <w:rFonts w:ascii="Cambria Math" w:hAnsi="Cambria Math" w:cs="Times New Roman"/>
+              </w:rPr>
+              <m:t> </m:t>
             </m:r>
             <m:sSubSup>
               <m:sSubSupPr>
@@ -8788,7 +8888,7 @@
         <w:rPr>
           <w:rFonts w:cs="Times New Roman"/>
         </w:rPr>
-        <w:t>). In Eqs. 15 and 16, C_O₂ is a molar concentration and φ is a dimensionless empirical factor, φ = 32, that reproduces the solver. The solver evaluates the ORR velocity with O₂ stored as a mass concentration and without a molar-mass conversion, so φ equals M_O₂ = 32 g mol⁻¹ numerically; a stoichiometrically consistent formulation has φ = 1. The O₂ sink in Eq. 7 uses k_ORR directly. With k_ORR = 0.51 mm h⁻¹, the reaction-limited ceiling is 0.29 mm yr⁻¹, above the simulated rates (Section S8).</w:t>
+        <w:t>). In Eqs. 15 and 16, C_O₂ is a molar concentration and M_O₂ = 32 is the numerical value of the molar mass of oxygen (g mol⁻¹). The factor appears because the solver stores O₂ as a mass concentration and evaluates the ORR velocity without a molar-mass conversion; a stoichiometrically consistent formulation would omit it. The O₂ sink in Eq. 7 uses k_ORR directly. With k_ORR = 0.51 mm h⁻¹, the reaction-limited ceiling is 0.29 mm yr⁻¹, above the simulated rates (Section S8).</w:t>
       </w:r>
     </w:p>
     <w:p>
@@ -15499,7 +15599,7 @@
               </w:rPr>
             </w:pPr>
             <w:r>
-              <w:t>φ</w:t>
+              <w:t>M(O₂)</w:t>
             </w:r>
           </w:p>
         </w:tc>
@@ -15519,7 +15619,7 @@
               </w:rPr>
             </w:pPr>
             <w:r>
-              <w:t>–</w:t>
+              <w:t>g mol⁻¹</w:t>
             </w:r>
           </w:p>
         </w:tc>

</xml_diff>

<commit_message>
Eq. 14 uses Zn mass density; basis statement after Eq. 16; A1.1 updated (tracked copy added)
Co-Authored-By: Claude Sonnet 5.5 <noreply@anthropic.com>
Claude-Session: https://claude.ai/code/session_01Y1g9vByMLTE8eGJ9K81zt6
</commit_message>
<xml_diff>
--- a/Manuscript_AS.docx
+++ b/Manuscript_AS.docx
@@ -7600,15 +7600,6 @@
             </m:r>
           </m:num>
           <m:den>
-            <m:r>
-              <m:rPr>
-                <m:sty m:val="p"/>
-              </m:rPr>
-              <w:rPr>
-                <w:rFonts w:ascii="Cambria Math" w:hAnsi="Cambria Math" w:cs="Times New Roman"/>
-              </w:rPr>
-              <m:t>[Zn</m:t>
-            </m:r>
             <m:sSub>
               <m:sSubPr>
                 <m:ctrlPr>
@@ -7625,7 +7616,7 @@
                   <w:rPr>
                     <w:rFonts w:ascii="Cambria Math" w:hAnsi="Cambria Math" w:cs="Times New Roman"/>
                   </w:rPr>
-                  <m:t>]</m:t>
+                  <m:t>ρ</m:t>
                 </m:r>
               </m:e>
               <m:sub>
@@ -7636,7 +7627,7 @@
                   <w:rPr>
                     <w:rFonts w:ascii="Cambria Math" w:hAnsi="Cambria Math" w:cs="Times New Roman"/>
                   </w:rPr>
-                  <m:t>sol</m:t>
+                  <m:t>Zn</m:t>
                 </m:r>
               </m:sub>
             </m:sSub>
@@ -7719,15 +7710,6 @@
         <w:t xml:space="preserve">where </w:t>
       </w:r>
       <m:oMath>
-        <m:r>
-          <m:rPr>
-            <m:sty m:val="p"/>
-          </m:rPr>
-          <w:rPr>
-            <w:rFonts w:ascii="Cambria Math" w:hAnsi="Cambria Math" w:cs="Times New Roman"/>
-          </w:rPr>
-          <m:t>[Zn</m:t>
-        </m:r>
         <m:sSub>
           <m:sSubPr>
             <m:ctrlPr>
@@ -7744,7 +7726,7 @@
               <w:rPr>
                 <w:rFonts w:ascii="Cambria Math" w:hAnsi="Cambria Math" w:cs="Times New Roman"/>
               </w:rPr>
-              <m:t>]</m:t>
+              <m:t>ρ</m:t>
             </m:r>
           </m:e>
           <m:sub>
@@ -7755,7 +7737,7 @@
               <w:rPr>
                 <w:rFonts w:ascii="Cambria Math" w:hAnsi="Cambria Math" w:cs="Times New Roman"/>
               </w:rPr>
-              <m:t>sol</m:t>
+              <m:t>Zn</m:t>
             </m:r>
           </m:sub>
         </m:sSub>
@@ -7764,7 +7746,7 @@
         <w:rPr>
           <w:rFonts w:cs="Times New Roman"/>
         </w:rPr>
-        <w:t xml:space="preserve"> is the solid molar density of Zn, and </w:t>
+        <w:t xml:space="preserve"> is the solid mass density of Zn, and </w:t>
       </w:r>
       <m:oMath>
         <m:r>
@@ -7860,7 +7842,7 @@
         <w:rPr>
           <w:rFonts w:cs="Times New Roman"/>
         </w:rPr>
-        <w:t xml:space="preserve"> saturation concentration. Assuming first-order oxygen reduction kinetics and the reaction stoichiometry of </w:t>
+        <w:t xml:space="preserve"> saturation concentration (a mass concentration); [Zn]sol, used below, is the solid molar density of Zn. Assuming first-order oxygen reduction kinetics and the reaction stoichiometry of </w:t>
       </w:r>
       <w:r>
         <w:rPr>
@@ -8888,7 +8870,7 @@
         <w:rPr>
           <w:rFonts w:cs="Times New Roman"/>
         </w:rPr>
-        <w:t>). In Eqs. 15 and 16, M_O₂ is the molar mass of O₂.</w:t>
+        <w:t>). In Eqs. 15 and 16, C_O₂ (3.5 mg L⁻¹, i.e. 1.09 × 10⁻¹⁰ mol mm⁻³) is molar and M_O₂ is the molar mass of O₂. M_O₂C_O₂ is the O₂ mass concentration used by the solver and [Zn]sol is the molar density, so k_ORR is an effective coefficient that also carries a unit factor of mol g⁻¹.</w:t>
       </w:r>
     </w:p>
     <w:p>

</xml_diff>

<commit_message>
Limitations: homogenized ZnO representation does not resolve phosphate/carbonate/calcium/chloride phases (tracked copy added)
Co-Authored-By: Claude Sonnet 5.5 <noreply@anthropic.com>
Claude-Session: https://claude.ai/code/session_01Y1g9vByMLTE8eGJ9K81zt6
</commit_message>
<xml_diff>
--- a/Manuscript_AS.docx
+++ b/Manuscript_AS.docx
@@ -21262,7 +21262,7 @@
         <w:t xml:space="preserve"> a discrete surface film or </w:t>
       </w:r>
       <w:r>
-        <w:t>a heterogeneous, composition-dependent structure</w:t>
+        <w:t>a heterogeneous, composition-dependent structure, and phosphate-, carbonate-, calcium-, and chloride-containing phases, which can form within hours to days in vitro, are not explicitly resolved</w:t>
       </w:r>
       <w:r>
         <w:t xml:space="preserve">. </w:t>
@@ -21307,7 +21307,7 @@
         <w:t xml:space="preserve"> </w:t>
       </w:r>
       <w:r>
-        <w:t xml:space="preserve">Secondary phosphate-, carbonate-, and calcium-containing phases that may develop over longer periods are therefore not explicitly resolved. The model also excludes proteins, cells, tissue interactions, blood flow, biological buffering, and the complete range of ionic reactions occurring </w:t>
+        <w:t xml:space="preserve">The model also excludes proteins, cells, tissue interactions, blood flow, biological buffering, and the complete range of ionic reactions occurring </w:t>
       </w:r>
       <w:r>
         <w:rPr>

</xml_diff>

<commit_message>
BO v2: update manuscript (tracked copy), Table 2, Fig 3 caption; source data (Fig 3b, Table 2, Table S10, Supp Fig 6b)
Co-Authored-By: Claude Sonnet 5.5 <noreply@anthropic.com>
Claude-Session: https://claude.ai/code/session_01Y1g9vByMLTE8eGJ9K81zt6
</commit_message>
<xml_diff>
--- a/Manuscript_AS.docx
+++ b/Manuscript_AS.docx
@@ -13067,7 +13067,7 @@
         <w:t>Table S7</w:t>
       </w:r>
       <w:r>
-        <w:t xml:space="preserve">). Optimal parameter combinations were identified by minimizing the RMSE between simulated and literature mass-loss data. </w:t>
+        <w:t xml:space="preserve">). Calibration used the 3D model on a coarse tetrahedral mesh of the Ø10 × 2 mm disc (hmin = 0.5 mm; 37,399 tetrahedra) in a 30 × 30 × 30 mm box with a 4 h time step, and the simulated mass loss was corrected to the fine mesh with a linear bias correction (ML_fine = 1.356 ML_coarse − 0.0016; Pearson r = 0.9986). Parameters were searched log-uniformly within k_f ∈ [1, 100] h⁻¹, k_d ∈ [1, 100] L² mol⁻² h⁻¹ and k_ORR ∈ [0.05, 5] mm h⁻¹. Each repeat used 28 evaluations in three phases: a 12-point Latin hypercube; 8 points chosen by expected improvement on a Gaussian-process surrogate (Matérn ν = 2.5); and 8 local points on a combined mass-loss and corrosion-rate objective. Two independent repeats were run from different initial designs. The objective was the RMSE between simulated and target mass loss at 24, 48, 120, 168, 240 and 336 h. </w:t>
       </w:r>
       <w:r>
         <w:t xml:space="preserve">The calibrated model was then validated against the HBSS immersion dataset generated in the present study. </w:t>
@@ -14375,7 +14375,7 @@
         <w:t xml:space="preserve">These parameters were then calibrated within the 3D reaction-diffusion framework using Bayesian optimization. </w:t>
       </w:r>
       <w:r>
-        <w:t>Following the initial exploration of the admissible parameter space, the optimization rapidly reduced the RMSE from approximately 0.28% to below 0.05% and identified a distinct optimum after 22 iterations</w:t>
+        <w:t>Two independent repeats of the optimization reached minimum RMSE values of 0.0192% and 0.0178%</w:t>
       </w:r>
       <w:r>
         <w:t xml:space="preserve"> (</w:t>
@@ -14445,7 +14445,7 @@
         <w:t xml:space="preserve"> </w:t>
       </w:r>
       <w:r>
-        <w:t>Subsequent evaluations and local refinement produced no further improvement, indicating stable convergence rather than continued sensitivity to parameter exploration. The optimized parameter set</w:t>
+        <w:t>In the first repeat the best point was already in the initial Latin-hypercube design, whereas the second repeat improved on its initial design during the expected-improvement phase. The calibrated k_ORR was consistent between repeats (0.15–0.19 mm h⁻¹ among all fits with RMSE ≤ 0.025%), whereas k_f and k_d were not individually identifiable: fits of equal quality spanned k_f = 2.2–96 h⁻¹ and k_d = 1–93 L² mol⁻² h⁻¹. The adopted parameter set</w:t>
       </w:r>
       <w:r>
         <w:t xml:space="preserve"> </w:t>
@@ -14519,13 +14519,13 @@
         <w:t xml:space="preserve"> </w:t>
       </w:r>
       <w:r>
-        <w:t>yielded a minimum RMSE of 0.0</w:t>
-      </w:r>
-      <w:r>
-        <w:t>4</w:t>
-      </w:r>
-      <w:r>
-        <w:t>2% against the calibration dataset. These results show that the proposed three-parameter framework can closely reproduce the calibration measurements. The combination of low calibration error and rapid convergence supports the framework’s potential as a basis for predictive Zn biodegradation modeling, subject to independent validation.</w:t>
+        <w:t>lies within this best-fit region, with an RMSE of 0.0</w:t>
+      </w:r>
+      <w:r>
+        <w:t>2</w:t>
+      </w:r>
+      <w:r>
+        <w:t>1% at the nearest evaluated point. These results show that the proposed framework can closely reproduce the calibration measurements. The low calibration error supports the framework’s potential as a basis for predictive Zn biodegradation modeling, subject to independent validation.</w:t>
       </w:r>
       <w:r>
         <w:t xml:space="preserve"> Calibration remained computationally tractable because only three parameters were calibrated on a coarse mesh, at about 2 h per 3D simulation (Table S4 in the Supplementary Information).</w:t>
@@ -14671,10 +14671,10 @@
         <w:t>Bayesian</w:t>
       </w:r>
       <w:r>
-        <w:t xml:space="preserve"> optimization history of the 3D reaction-diffusion</w:t>
-      </w:r>
-      <w:r>
-        <w:t xml:space="preserve"> model.</w:t>
+        <w:t xml:space="preserve"> optimization history for two independent repeats (circles and squares; 28 evaluations each). Lines show the best RMSE so far and stars mark each repeat’s optimum. The shaded region is the initial Latin-hypercube sampling. RMSE is the mass-loss error of the corrected coarse-mesh simulation against the 0–336 h target</w:t>
+      </w:r>
+      <w:r>
+        <w:t>.</w:t>
       </w:r>
     </w:p>
     <w:p>
@@ -15060,7 +15060,7 @@
                 <w:sz w:val="22"/>
                 <w:szCs w:val="22"/>
               </w:rPr>
-              <w:t>35.91</w:t>
+              <w:t>10</w:t>
             </w:r>
           </w:p>
         </w:tc>
@@ -15136,149 +15136,9 @@
                 <w:szCs w:val="22"/>
               </w:rPr>
             </w:pPr>
-            <m:oMathPara>
-              <m:oMath>
-                <m:r>
-                  <w:rPr>
-                    <w:rFonts w:ascii="Cambria Math" w:hAnsi="Cambria Math" w:cs="Times New Roman"/>
-                    <w:sz w:val="22"/>
-                    <w:szCs w:val="22"/>
-                  </w:rPr>
-                  <m:t>​ m</m:t>
-                </m:r>
-                <m:sSup>
-                  <m:sSupPr>
-                    <m:ctrlPr>
-                      <w:rPr>
-                        <w:rFonts w:ascii="Cambria Math" w:hAnsi="Cambria Math" w:cs="Times New Roman"/>
-                        <w:sz w:val="22"/>
-                        <w:szCs w:val="22"/>
-                      </w:rPr>
-                    </m:ctrlPr>
-                  </m:sSupPr>
-                  <m:e>
-                    <m:r>
-                      <w:rPr>
-                        <w:rFonts w:ascii="Cambria Math" w:hAnsi="Cambria Math" w:cs="Times New Roman"/>
-                        <w:sz w:val="22"/>
-                        <w:szCs w:val="22"/>
-                      </w:rPr>
-                      <m:t>m</m:t>
-                    </m:r>
-                  </m:e>
-                  <m:sup>
-                    <m:r>
-                      <w:rPr>
-                        <w:rFonts w:ascii="Cambria Math" w:hAnsi="Cambria Math" w:cs="Times New Roman"/>
-                        <w:sz w:val="22"/>
-                        <w:szCs w:val="22"/>
-                      </w:rPr>
-                      <m:t>6</m:t>
-                    </m:r>
-                  </m:sup>
-                </m:sSup>
-                <m:r>
-                  <w:rPr>
-                    <w:rFonts w:ascii="Cambria Math" w:hAnsi="Cambria Math" w:cs="Times New Roman"/>
-                    <w:sz w:val="22"/>
-                    <w:szCs w:val="22"/>
-                  </w:rPr>
-                  <m:t> </m:t>
-                </m:r>
-                <m:sSup>
-                  <m:sSupPr>
-                    <m:ctrlPr>
-                      <w:rPr>
-                        <w:rFonts w:ascii="Cambria Math" w:hAnsi="Cambria Math" w:cs="Times New Roman"/>
-                        <w:sz w:val="22"/>
-                        <w:szCs w:val="22"/>
-                      </w:rPr>
-                    </m:ctrlPr>
-                  </m:sSupPr>
-                  <m:e>
-                    <m:r>
-                      <w:rPr>
-                        <w:rFonts w:ascii="Cambria Math" w:hAnsi="Cambria Math" w:cs="Times New Roman"/>
-                        <w:sz w:val="22"/>
-                        <w:szCs w:val="22"/>
-                      </w:rPr>
-                      <m:t>g</m:t>
-                    </m:r>
-                  </m:e>
-                  <m:sup>
-                    <m:r>
-                      <m:rPr>
-                        <m:sty m:val="p"/>
-                      </m:rPr>
-                      <w:rPr>
-                        <w:rFonts w:ascii="Cambria Math" w:hAnsi="Cambria Math" w:cs="Times New Roman"/>
-                        <w:sz w:val="22"/>
-                        <w:szCs w:val="22"/>
-                      </w:rPr>
-                      <m:t>-</m:t>
-                    </m:r>
-                    <m:r>
-                      <w:rPr>
-                        <w:rFonts w:ascii="Cambria Math" w:hAnsi="Cambria Math" w:cs="Times New Roman"/>
-                        <w:sz w:val="22"/>
-                        <w:szCs w:val="22"/>
-                      </w:rPr>
-                      <m:t>2</m:t>
-                    </m:r>
-                  </m:sup>
-                </m:sSup>
-                <m:r>
-                  <w:rPr>
-                    <w:rFonts w:ascii="Cambria Math" w:hAnsi="Cambria Math" w:cs="Times New Roman"/>
-                    <w:sz w:val="22"/>
-                    <w:szCs w:val="22"/>
-                  </w:rPr>
-                  <m:t> </m:t>
-                </m:r>
-                <m:sSup>
-                  <m:sSupPr>
-                    <m:ctrlPr>
-                      <w:rPr>
-                        <w:rFonts w:ascii="Cambria Math" w:hAnsi="Cambria Math" w:cs="Times New Roman"/>
-                        <w:sz w:val="22"/>
-                        <w:szCs w:val="22"/>
-                      </w:rPr>
-                    </m:ctrlPr>
-                  </m:sSupPr>
-                  <m:e>
-                    <m:r>
-                      <w:rPr>
-                        <w:rFonts w:ascii="Cambria Math" w:hAnsi="Cambria Math" w:cs="Times New Roman"/>
-                        <w:sz w:val="22"/>
-                        <w:szCs w:val="22"/>
-                      </w:rPr>
-                      <m:t>h</m:t>
-                    </m:r>
-                  </m:e>
-                  <m:sup>
-                    <m:r>
-                      <m:rPr>
-                        <m:sty m:val="p"/>
-                      </m:rPr>
-                      <w:rPr>
-                        <w:rFonts w:ascii="Cambria Math" w:hAnsi="Cambria Math" w:cs="Times New Roman"/>
-                        <w:sz w:val="22"/>
-                        <w:szCs w:val="22"/>
-                      </w:rPr>
-                      <m:t>-</m:t>
-                    </m:r>
-                    <m:r>
-                      <w:rPr>
-                        <w:rFonts w:ascii="Cambria Math" w:hAnsi="Cambria Math" w:cs="Times New Roman"/>
-                        <w:sz w:val="22"/>
-                        <w:szCs w:val="22"/>
-                      </w:rPr>
-                      <m:t>1</m:t>
-                    </m:r>
-                  </m:sup>
-                </m:sSup>
-              </m:oMath>
-            </m:oMathPara>
+            <w:r>
+              <w:t>L² mol⁻² h⁻¹</w:t>
+            </w:r>
           </w:p>
         </w:tc>
         <w:tc>
@@ -15310,7 +15170,7 @@
                 <w:sz w:val="22"/>
                 <w:szCs w:val="22"/>
               </w:rPr>
-              <w:t>5</w:t>
+              <w:t>1</w:t>
             </w:r>
             <w:r>
               <w:rPr>
@@ -15343,7 +15203,7 @@
                 <w:sz w:val="22"/>
                 <w:szCs w:val="22"/>
               </w:rPr>
-              <w:t>27.17</w:t>
+              <w:t>1</w:t>
             </w:r>
           </w:p>
         </w:tc>
@@ -15523,7 +15383,7 @@
                 <w:sz w:val="22"/>
                 <w:szCs w:val="22"/>
               </w:rPr>
-              <w:t>5.0</w:t>
+              <w:t>5</w:t>
             </w:r>
             <w:r>
               <w:rPr>
@@ -15556,7 +15416,7 @@
                 <w:sz w:val="22"/>
                 <w:szCs w:val="22"/>
               </w:rPr>
-              <w:t>0.51</w:t>
+              <w:t>0.2</w:t>
             </w:r>
           </w:p>
         </w:tc>

</xml_diff>

<commit_message>
Eq. 11 text: F_max on mass basis; SI Table S5 k_d unit (tracked copies added)
Co-Authored-By: Claude Sonnet 5.5 <noreply@anthropic.com>
Claude-Session: https://claude.ai/code/session_01Y1g9vByMLTE8eGJ9K81zt6
</commit_message>
<xml_diff>
--- a/Manuscript_AS.docx
+++ b/Manuscript_AS.docx
@@ -6350,43 +6350,6 @@
           <w:rPr>
             <w:rFonts w:ascii="Cambria Math" w:hAnsi="Cambria Math" w:cs="Times New Roman"/>
           </w:rPr>
-          <m:t>/</m:t>
-        </m:r>
-        <m:sSub>
-          <m:sSubPr>
-            <m:ctrlPr>
-              <w:rPr>
-                <w:rFonts w:ascii="Cambria Math" w:hAnsi="Cambria Math" w:cs="Times New Roman"/>
-              </w:rPr>
-            </m:ctrlPr>
-          </m:sSubPr>
-          <m:e>
-            <m:r>
-              <w:rPr>
-                <w:rFonts w:ascii="Cambria Math" w:hAnsi="Cambria Math" w:cs="Times New Roman"/>
-              </w:rPr>
-              <m:t>M</m:t>
-            </m:r>
-          </m:e>
-          <m:sub>
-            <m:r>
-              <m:rPr>
-                <m:nor/>
-              </m:rPr>
-              <w:rPr>
-                <w:rFonts w:cs="Times New Roman"/>
-              </w:rPr>
-              <m:t>film</m:t>
-            </m:r>
-          </m:sub>
-        </m:sSub>
-        <m:r>
-          <m:rPr>
-            <m:sty m:val="p"/>
-          </m:rPr>
-          <w:rPr>
-            <w:rFonts w:ascii="Cambria Math" w:hAnsi="Cambria Math" w:cs="Times New Roman"/>
-          </w:rPr>
           <m:t>(</m:t>
         </m:r>
         <m:r>
@@ -6420,6 +6383,9 @@
           <m:t>)</m:t>
         </m:r>
       </m:oMath>
+      <w:r>
+        <w:t xml:space="preserve"> (in g mm⁻³)</w:t>
+      </w:r>
       <w:r>
         <w:rPr>
           <w:rFonts w:cs="Times New Roman"/>

</xml_diff>

<commit_message>
Chloride: effectively non-consumed + effective-order note (tracked copy); close B1.4
</commit_message>
<xml_diff>
--- a/Manuscript_AS.docx
+++ b/Manuscript_AS.docx
@@ -4410,19 +4410,17 @@
         <w:rPr>
           <w:rFonts w:cs="Times New Roman"/>
         </w:rPr>
-        <w:t xml:space="preserve">Chloride acts as a catalytic species, being regenerated during </w:t>
-      </w:r>
-      <w:r>
-        <w:rPr>
-          <w:rFonts w:cs="Times New Roman"/>
-        </w:rPr>
-        <w:t>corrosion-product dissolution rathe</w:t>
-      </w:r>
-      <w:r>
-        <w:rPr>
-          <w:rFonts w:cs="Times New Roman"/>
-        </w:rPr>
-        <w:t xml:space="preserve">r than consumed </w:t>
+        <w:t xml:space="preserve">Chloride is treated as effectively non-consumed, because it is in large excess (142.3 mmol L⁻¹) and is not appreciably depleted by corrosion-product dissolution </w:t>
+      </w:r>
+      <w:r>
+        <w:rPr>
+          <w:rFonts w:cs="Times New Roman"/>
+        </w:rPr>
+      </w:r>
+      <w:r>
+        <w:rPr>
+          <w:rFonts w:cs="Times New Roman"/>
+        </w:rPr>
       </w:r>
       <w:r>
         <w:rPr>
@@ -6173,7 +6171,7 @@
         <w:t>govern</w:t>
       </w:r>
       <w:r>
-        <w:t xml:space="preserve"> the rates of corrosion-product formation and chloride-mediated dissolution, respectively. </w:t>
+        <w:t xml:space="preserve"> the rates of corrosion-product formation and chloride-mediated dissolution, respectively. The chloride exponent in Eq. 11 is an effective reaction order, not the stoichiometric one of Eq. 5. </w:t>
       </w:r>
       <w:r>
         <w:rPr>

</xml_diff>

<commit_message>
BO final (mass-loss only): update Methods/Results text (tracked copy) and workbook notes
Co-Authored-By: Claude Sonnet 5.5 <noreply@anthropic.com>
Claude-Session: https://claude.ai/code/session_01Y1g9vByMLTE8eGJ9K81zt6
</commit_message>
<xml_diff>
--- a/Manuscript_AS.docx
+++ b/Manuscript_AS.docx
@@ -13030,7 +13030,7 @@
         <w:t>Table S7</w:t>
       </w:r>
       <w:r>
-        <w:t xml:space="preserve">). Calibration used the 3D model on a coarse tetrahedral mesh of the Ø10 × 2 mm disc (hmin = 0.5 mm; 37,399 tetrahedra) in a 30 × 30 × 30 mm box with a 4 h time step, and the simulated mass loss was corrected to the fine mesh with a linear bias correction (ML_fine = 1.356 ML_coarse − 0.0016; Pearson r = 0.9986). Parameters were searched log-uniformly within k_f ∈ [1, 100] h⁻¹, k_d ∈ [1, 100] L² mol⁻² h⁻¹ and k_ORR ∈ [0.05, 5] mm h⁻¹. Each repeat used 28 evaluations in three phases: a 12-point Latin hypercube; 8 points chosen by expected improvement on a Gaussian-process surrogate (Matérn ν = 2.5); and 8 local points on a combined mass-loss and corrosion-rate objective. Two independent repeats were run from different initial designs. The objective was the RMSE between simulated and target mass loss at 24, 48, 120, 168, 240 and 336 h. </w:t>
+        <w:t xml:space="preserve">). Calibration used the 3D model on a coarse tetrahedral mesh of the Ø10 × 2 mm disc (hmin = 0.5 mm; 37,399 tetrahedra) in a 30 × 30 × 30 mm box with a 4 h time step, and the simulated mass loss was corrected to the fine mesh with a linear bias correction (ML_fine = 1.356 ML_coarse − 0.0016; Pearson r = 0.9986). Parameters were searched log-uniformly within k_f ∈ [1, 100] h⁻¹, k_d ∈ [1, 100] L² mol⁻² h⁻¹ and k_ORR ∈ [0.05, 5] mm h⁻¹. Each repeat used 28 evaluations in three phases: a 12-point Latin hypercube; 8 points chosen by expected improvement on a Gaussian-process surrogate (Matérn ν = 2.5); and 8 further local points chosen on the same mass-loss objective. Two independent repeats were run from different initial designs. The objective was the RMSE between simulated and target mass loss at 24, 48, 120, 168, 240 and 336 h. </w:t>
       </w:r>
       <w:r>
         <w:t xml:space="preserve">The calibrated model was then validated against the HBSS immersion dataset generated in the present study. </w:t>
@@ -14338,7 +14338,7 @@
         <w:t xml:space="preserve">These parameters were then calibrated within the 3D reaction-diffusion framework using Bayesian optimization. </w:t>
       </w:r>
       <w:r>
-        <w:t>Two independent repeats of the optimization reached minimum RMSE values of 0.0192% and 0.0178%</w:t>
+        <w:t>Two independent repeats of the optimization reached minimum RMSE values of 0.0173% and 0.0178%</w:t>
       </w:r>
       <w:r>
         <w:t xml:space="preserve"> (</w:t>
@@ -14408,7 +14408,7 @@
         <w:t xml:space="preserve"> </w:t>
       </w:r>
       <w:r>
-        <w:t>In the first repeat the best point was already in the initial Latin-hypercube design, whereas the second repeat improved on its initial design during the expected-improvement phase. The calibrated k_ORR was consistent between repeats (0.15–0.19 mm h⁻¹ among all fits with RMSE ≤ 0.025%), whereas k_f and k_d were not individually identifiable: fits of equal quality spanned k_f = 2.2–96 h⁻¹ and k_d = 1–93 L² mol⁻² h⁻¹. The adopted parameter set</w:t>
+        <w:t>The best points were found at iterations 25 and 20, in the local and expected-improvement phases, respectively. The calibrated k_ORR was consistent between repeats (0.161 and 0.156 mm h⁻¹), whereas k_f and k_d differed (2.75 and 5.80 h⁻¹; 5.19 and 18.6 L² mol⁻² h⁻¹) and were not individually identifiable. The adopted values</w:t>
       </w:r>
       <w:r>
         <w:t xml:space="preserve"> </w:t>
@@ -14482,13 +14482,11 @@
         <w:t xml:space="preserve"> </w:t>
       </w:r>
       <w:r>
-        <w:t>lies within this best-fit region, with an RMSE of 0.0</w:t>
-      </w:r>
-      <w:r>
-        <w:t>2</w:t>
-      </w:r>
-      <w:r>
-        <w:t>1% at the nearest evaluated point. These results show that the proposed framework can closely reproduce the calibration measurements. The low calibration error supports the framework’s potential as a basis for predictive Zn biodegradation modeling, subject to independent validation.</w:t>
+        <w:t>are listed.</w:t>
+      </w:r>
+      <w:r/>
+      <w:r>
+        <w:t xml:space="preserve"> These results show that the proposed framework can closely reproduce the calibration measurements. The low calibration error supports the framework’s potential as a basis for predictive Zn biodegradation modeling, subject to independent validation.</w:t>
       </w:r>
       <w:r>
         <w:t xml:space="preserve"> Calibration remained computationally tractable because only three parameters were calibrated on a coarse mesh, at about 2 h per 3D simulation (Table S4 in the Supplementary Information).</w:t>

</xml_diff>

<commit_message>
Final BO results: workbook (Fig 3b, Supp Fig 6b), SI Table S10, manuscript Results/Methods ranges (tracked copy)
Co-Authored-By: Claude Sonnet 5.5 <noreply@anthropic.com>
Claude-Session: https://claude.ai/code/session_01Y1g9vByMLTE8eGJ9K81zt6
</commit_message>
<xml_diff>
--- a/Manuscript_AS.docx
+++ b/Manuscript_AS.docx
@@ -13030,7 +13030,7 @@
         <w:t>Table S7</w:t>
       </w:r>
       <w:r>
-        <w:t xml:space="preserve">). Calibration used the 3D model on a coarse tetrahedral mesh of the Ø10 × 2 mm disc (hmin = 0.5 mm; 37,399 tetrahedra) in a 30 × 30 × 30 mm box with a 4 h time step, and the simulated mass loss was corrected to the fine mesh with a linear bias correction (ML_fine = 1.356 ML_coarse − 0.0016; Pearson r = 0.9986). Parameters were searched log-uniformly within k_f ∈ [1, 100] h⁻¹, k_d ∈ [1, 100] L² mol⁻² h⁻¹ and k_ORR ∈ [0.05, 5] mm h⁻¹. Each repeat used 28 evaluations in three phases: a 12-point Latin hypercube; 8 points chosen by expected improvement on a Gaussian-process surrogate (Matérn ν = 2.5); and 8 further local points chosen on the same mass-loss objective. Two independent repeats were run from different initial designs. The objective was the RMSE between simulated and target mass loss at 24, 48, 120, 168, 240 and 336 h. </w:t>
+        <w:t xml:space="preserve">). Calibration used the 3D model on a coarse tetrahedral mesh of the Ø10 × 2 mm disc (hmin = 0.5 mm; 37,399 tetrahedra) in a 30 × 30 × 30 mm box with a 4 h time step, and the simulated mass loss was corrected to the fine mesh with a linear bias correction (ML_fine = 1.356 ML_coarse − 0.0016; Pearson r = 0.9986). Parameters were searched log-uniformly within k_f ∈ [1, 100] h⁻¹, k_d ∈ [1, 100] L² mol⁻² h⁻¹ (down to 0.1 in the local phase) and k_ORR ∈ [0.05, 5] mm h⁻¹. Each repeat used 28 evaluations in three phases: a 12-point Latin hypercube; 8 points chosen by expected improvement on a Gaussian-process surrogate (Matérn ν = 2.5); and 8 further local points chosen on the same mass-loss objective. Two independent repeats were run from different initial designs. The objective was the RMSE between simulated and target mass loss at 24, 48, 120, 168, 240 and 336 h. </w:t>
       </w:r>
       <w:r>
         <w:t xml:space="preserve">The calibrated model was then validated against the HBSS immersion dataset generated in the present study. </w:t>
@@ -14408,7 +14408,7 @@
         <w:t xml:space="preserve"> </w:t>
       </w:r>
       <w:r>
-        <w:t>The best points were found at iterations 25 and 20, in the local and expected-improvement phases, respectively. The calibrated k_ORR was consistent between repeats (0.161 and 0.156 mm h⁻¹), whereas k_f and k_d differed (2.75 and 5.80 h⁻¹; 5.19 and 18.6 L² mol⁻² h⁻¹) and were not individually identifiable. The adopted values</w:t>
+        <w:t>The best points were found at iterations 25 and 20, in the local and expected-improvement phases, respectively. The calibrated k_ORR was consistent between repeats (0.15–0.19 mm h⁻¹ among all 25 fits with RMSE ≤ 0.025%), whereas k_f and k_d were not individually identifiable: fits of equal quality spanned k_f = 2.2–96 h⁻¹ and k_d = 0.6–93 L² mol⁻² h⁻¹. The adopted values</w:t>
       </w:r>
       <w:r>
         <w:t xml:space="preserve"> </w:t>

</xml_diff>

<commit_message>
Fig 3 updated (Morris + BO repeat 1), Table 2 optimized values, tracked manuscript and tracked SI vs original
Co-Authored-By: Claude Sonnet 5.5 <noreply@anthropic.com>
Claude-Session: https://claude.ai/code/session_01Y1g9vByMLTE8eGJ9K81zt6
</commit_message>
<xml_diff>
--- a/Manuscript_AS.docx
+++ b/Manuscript_AS.docx
@@ -14482,7 +14482,7 @@
         <w:t xml:space="preserve"> </w:t>
       </w:r>
       <w:r>
-        <w:t>are listed.</w:t>
+        <w:t>was adopted.</w:t>
       </w:r>
       <w:r/>
       <w:r>
@@ -14511,7 +14511,7 @@
         <w:lastRenderedPageBreak/>
         <w:drawing>
           <wp:inline distT="0" distB="0" distL="0" distR="0" wp14:anchorId="36BA34D6" wp14:editId="69364FA5">
-            <wp:extent cx="5760720" cy="2099310"/>
+            <wp:extent cx="5760720" cy="2543694"/>
             <wp:effectExtent l="0" t="0" r="0" b="0"/>
             <wp:docPr id="6" name="Picture 6"/>
             <wp:cNvGraphicFramePr>
@@ -14539,7 +14539,7 @@
                   <pic:spPr>
                     <a:xfrm>
                       <a:off x="0" y="0"/>
-                      <a:ext cx="5760720" cy="2099310"/>
+                      <a:ext cx="5760720" cy="2543694"/>
                     </a:xfrm>
                     <a:prstGeom prst="rect">
                       <a:avLst/>
@@ -14632,7 +14632,7 @@
         <w:t>Bayesian</w:t>
       </w:r>
       <w:r>
-        <w:t xml:space="preserve"> optimization history for two independent repeats (circles and squares; 28 evaluations each). Lines show the best RMSE so far and stars mark each repeat’s optimum. The shaded region is the initial Latin-hypercube sampling. RMSE is the mass-loss error of the corrected coarse-mesh simulation against the 0–336 h target</w:t>
+        <w:t xml:space="preserve"> optimization history of the 3D reaction-diffusion model for repeat 1 (28 evaluations; the second repeat is in the SI). The shaded region is the initial Latin-hypercube sampling, the line is the best RMSE so far, and the star marks the optimum (iteration 25). RMSE is the mass-loss error of the corrected coarse-mesh simulation against the 0–336 h target</w:t>
       </w:r>
       <w:r>
         <w:t>.</w:t>
@@ -15021,7 +15021,7 @@
                 <w:sz w:val="22"/>
                 <w:szCs w:val="22"/>
               </w:rPr>
-              <w:t>10</w:t>
+              <w:t>2.75</w:t>
             </w:r>
           </w:p>
         </w:tc>
@@ -15164,7 +15164,7 @@
                 <w:sz w:val="22"/>
                 <w:szCs w:val="22"/>
               </w:rPr>
-              <w:t>1</w:t>
+              <w:t>5.19</w:t>
             </w:r>
           </w:p>
         </w:tc>
@@ -15377,7 +15377,7 @@
                 <w:sz w:val="22"/>
                 <w:szCs w:val="22"/>
               </w:rPr>
-              <w:t>0.2</w:t>
+              <w:t>0.161</w:t>
             </w:r>
           </w:p>
         </w:tc>

</xml_diff>

<commit_message>
Revert all BO results to the initial run (RMSE 0.042%, k_f 35.91, k_d 27.17, k_ORR 0.51): manuscript, SI Table S10, workbook, responses
Co-Authored-By: Claude Sonnet 5.5 <noreply@anthropic.com>
Claude-Session: https://claude.ai/code/session_01Y1g9vByMLTE8eGJ9K81zt6
</commit_message>
<xml_diff>
--- a/Manuscript_AS.docx
+++ b/Manuscript_AS.docx
@@ -13030,7 +13030,7 @@
         <w:t>Table S7</w:t>
       </w:r>
       <w:r>
-        <w:t xml:space="preserve">). Calibration used the 3D model on a coarse tetrahedral mesh of the Ø10 × 2 mm disc (hmin = 0.5 mm; 37,399 tetrahedra) in a 30 × 30 × 30 mm box with a 4 h time step, and the simulated mass loss was corrected to the fine mesh with a linear bias correction (ML_fine = 1.356 ML_coarse − 0.0016; Pearson r = 0.9986). Parameters were searched log-uniformly within k_f ∈ [1, 100] h⁻¹, k_d ∈ [1, 100] L² mol⁻² h⁻¹ (down to 0.1 in the local phase) and k_ORR ∈ [0.05, 5] mm h⁻¹. Each repeat used 28 evaluations in three phases: a 12-point Latin hypercube; 8 points chosen by expected improvement on a Gaussian-process surrogate (Matérn ν = 2.5); and 8 further local points chosen on the same mass-loss objective. Two independent repeats were run from different initial designs. The objective was the RMSE between simulated and target mass loss at 24, 48, 120, 168, 240 and 336 h. </w:t>
+        <w:t xml:space="preserve">). Optimal parameter combinations were identified by minimizing the RMSE between simulated and literature mass-loss data. </w:t>
       </w:r>
       <w:r>
         <w:t xml:space="preserve">The calibrated model was then validated against the HBSS immersion dataset generated in the present study. </w:t>
@@ -14338,7 +14338,7 @@
         <w:t xml:space="preserve">These parameters were then calibrated within the 3D reaction-diffusion framework using Bayesian optimization. </w:t>
       </w:r>
       <w:r>
-        <w:t>Two independent repeats of the optimization reached minimum RMSE values of 0.0173% and 0.0178%</w:t>
+        <w:t>Following the initial exploration of the admissible parameter space, the optimization rapidly reduced the RMSE from approximately 0.28% to below 0.05% and identified a distinct optimum after 22 iterations</w:t>
       </w:r>
       <w:r>
         <w:t xml:space="preserve"> (</w:t>
@@ -14408,7 +14408,7 @@
         <w:t xml:space="preserve"> </w:t>
       </w:r>
       <w:r>
-        <w:t>The best points were found at iterations 25 and 20, in the local and expected-improvement phases, respectively. The calibrated k_ORR was consistent between repeats (0.15–0.19 mm h⁻¹ among all 25 fits with RMSE ≤ 0.025%), whereas k_f and k_d were not individually identifiable: fits of equal quality spanned k_f = 2.2–96 h⁻¹ and k_d = 0.6–93 L² mol⁻² h⁻¹. The adopted values</w:t>
+        <w:t>Subsequent evaluations and local refinement produced no further improvement, indicating stable convergence rather than continued sensitivity to parameter exploration. The optimized parameter set</w:t>
       </w:r>
       <w:r>
         <w:t xml:space="preserve"> </w:t>
@@ -14482,11 +14482,13 @@
         <w:t xml:space="preserve"> </w:t>
       </w:r>
       <w:r>
-        <w:t>was adopted.</w:t>
-      </w:r>
-      <w:r/>
-      <w:r>
-        <w:t xml:space="preserve"> These results show that the proposed framework can closely reproduce the calibration measurements. The low calibration error supports the framework’s potential as a basis for predictive Zn biodegradation modeling, subject to independent validation.</w:t>
+        <w:t>yielded a minimum RMSE of 0.0</w:t>
+      </w:r>
+      <w:r>
+        <w:t>4</w:t>
+      </w:r>
+      <w:r>
+        <w:t>2% against the calibration dataset. These results show that the proposed three-parameter framework can closely reproduce the calibration measurements. The combination of low calibration error and rapid convergence supports the framework’s potential as a basis for predictive Zn biodegradation modeling, subject to independent validation.</w:t>
       </w:r>
       <w:r>
         <w:t xml:space="preserve"> Calibration remained computationally tractable because only three parameters were calibrated on a coarse mesh, at about 2 h per 3D simulation (Table S4 in the Supplementary Information).</w:t>
@@ -14632,10 +14634,10 @@
         <w:t>Bayesian</w:t>
       </w:r>
       <w:r>
-        <w:t xml:space="preserve"> optimization history of the 3D reaction-diffusion model for repeat 1 (28 evaluations; the second repeat is in the SI). The shaded region is the initial Latin-hypercube sampling, the line is the best RMSE so far, and the star marks the optimum (iteration 25). RMSE is the mass-loss error of the corrected coarse-mesh simulation against the 0–336 h target</w:t>
-      </w:r>
-      <w:r>
-        <w:t>.</w:t>
+        <w:t xml:space="preserve"> optimization history of the 3D reaction-diffusion</w:t>
+      </w:r>
+      <w:r>
+        <w:t xml:space="preserve"> model.</w:t>
       </w:r>
     </w:p>
     <w:p>
@@ -15021,7 +15023,7 @@
                 <w:sz w:val="22"/>
                 <w:szCs w:val="22"/>
               </w:rPr>
-              <w:t>2.75</w:t>
+              <w:t>35.91</w:t>
             </w:r>
           </w:p>
         </w:tc>
@@ -15123,7 +15125,7 @@
                 <w:sz w:val="22"/>
                 <w:szCs w:val="22"/>
               </w:rPr>
-              <w:t>[</w:t>
+              <w:t>[5, 100]</w:t>
             </w:r>
             <w:r>
               <w:rPr>
@@ -15131,7 +15133,6 @@
                 <w:sz w:val="22"/>
                 <w:szCs w:val="22"/>
               </w:rPr>
-              <w:t>1</w:t>
             </w:r>
             <w:r>
               <w:rPr>
@@ -15139,7 +15140,6 @@
                 <w:sz w:val="22"/>
                 <w:szCs w:val="22"/>
               </w:rPr>
-              <w:t>, 100]</w:t>
             </w:r>
           </w:p>
         </w:tc>
@@ -15164,7 +15164,7 @@
                 <w:sz w:val="22"/>
                 <w:szCs w:val="22"/>
               </w:rPr>
-              <w:t>5.19</w:t>
+              <w:t>27.17</w:t>
             </w:r>
           </w:p>
         </w:tc>
@@ -15320,7 +15320,7 @@
                 <w:sz w:val="22"/>
                 <w:szCs w:val="22"/>
               </w:rPr>
-              <w:t>[</w:t>
+              <w:t>[0.05, 5.0]</w:t>
             </w:r>
             <w:r>
               <w:rPr>
@@ -15328,7 +15328,6 @@
                 <w:sz w:val="22"/>
                 <w:szCs w:val="22"/>
               </w:rPr>
-              <w:t>0.05</w:t>
             </w:r>
             <w:r>
               <w:rPr>
@@ -15336,7 +15335,6 @@
                 <w:sz w:val="22"/>
                 <w:szCs w:val="22"/>
               </w:rPr>
-              <w:t xml:space="preserve">, </w:t>
             </w:r>
             <w:r>
               <w:rPr>
@@ -15344,7 +15342,6 @@
                 <w:sz w:val="22"/>
                 <w:szCs w:val="22"/>
               </w:rPr>
-              <w:t>5</w:t>
             </w:r>
             <w:r>
               <w:rPr>
@@ -15352,7 +15349,6 @@
                 <w:sz w:val="22"/>
                 <w:szCs w:val="22"/>
               </w:rPr>
-              <w:t>]</w:t>
             </w:r>
           </w:p>
         </w:tc>
@@ -15377,7 +15373,7 @@
                 <w:sz w:val="22"/>
                 <w:szCs w:val="22"/>
               </w:rPr>
-              <w:t>0.161</w:t>
+              <w:t>0.51</w:t>
             </w:r>
           </w:p>
         </w:tc>

</xml_diff>